<commit_message>
Removed rack and pinion drive from the project it was on and reconfigured safety on a new solution.  Camming and Indexing lab is ready to go.
</commit_message>
<xml_diff>
--- a/Instructions.docx
+++ b/Instructions.docx
@@ -3,6 +3,12 @@
 <w:document xmlns:wpc="http://schemas.microsoft.com/office/word/2010/wordprocessingCanvas" xmlns:cx="http://schemas.microsoft.com/office/drawing/2014/chartex" xmlns:cx1="http://schemas.microsoft.com/office/drawing/2015/9/8/chartex" xmlns:cx2="http://schemas.microsoft.com/office/drawing/2015/10/21/chartex" xmlns:cx3="http://schemas.microsoft.com/office/drawing/2016/5/9/chartex" xmlns:cx4="http://schemas.microsoft.com/office/drawing/2016/5/10/chartex" xmlns:cx5="http://schemas.microsoft.com/office/drawing/2016/5/11/chartex" xmlns:cx6="http://schemas.microsoft.com/office/drawing/2016/5/12/chartex" xmlns:cx7="http://schemas.microsoft.com/office/drawing/2016/5/13/chartex" xmlns:cx8="http://schemas.microsoft.com/office/drawing/2016/5/14/chartex" xmlns:mc="http://schemas.openxmlformats.org/markup-compatibility/2006" xmlns:aink="http://schemas.microsoft.com/office/drawing/2016/ink" xmlns:am3d="http://schemas.microsoft.com/office/drawing/2017/model3d" xmlns:o="urn:schemas-microsoft-com:office:office" xmlns:oel="http://schemas.microsoft.com/office/2019/extlst" xmlns:r="http://schemas.openxmlformats.org/officeDocument/2006/relationships" xmlns:m="http://schemas.openxmlformats.org/officeDocument/2006/math" xmlns:v="urn:schemas-microsoft-com:vml" xmlns:wp14="http://schemas.microsoft.com/office/word/2010/wordprocessingDrawing" xmlns:wp="http://schemas.openxmlformats.org/drawingml/2006/wordprocessingDrawing" xmlns:w10="urn:schemas-microsoft-com:office:word" xmlns:w="http://schemas.openxmlformats.org/wordprocessingml/2006/main" xmlns:w14="http://schemas.microsoft.com/office/word/2010/wordml" xmlns:w15="http://schemas.microsoft.com/office/word/2012/wordml" xmlns:w16cex="http://schemas.microsoft.com/office/word/2018/wordml/cex" xmlns:w16cid="http://schemas.microsoft.com/office/word/2016/wordml/cid" xmlns:w16="http://schemas.microsoft.com/office/word/2018/wordml" xmlns:w16du="http://schemas.microsoft.com/office/word/2023/wordml/word16du" xmlns:w16sdtdh="http://schemas.microsoft.com/office/word/2020/wordml/sdtdatahash" xmlns:w16sdtfl="http://schemas.microsoft.com/office/word/2024/wordml/sdtformatlock" xmlns:w16se="http://schemas.microsoft.com/office/word/2015/wordml/symex" xmlns:wpg="http://schemas.microsoft.com/office/word/2010/wordprocessingGroup" xmlns:wpi="http://schemas.microsoft.com/office/word/2010/wordprocessingInk" xmlns:wne="http://schemas.microsoft.com/office/word/2006/wordml" xmlns:wps="http://schemas.microsoft.com/office/word/2010/wordprocessingShape" mc:Ignorable="w14 w15 w16se w16cid w16 w16cex w16sdtdh w16sdtfl w16du wp14">
   <w:body>
     <w:p>
+      <w:pPr>
+        <w:rPr>
+          <w:b/>
+          <w:bCs/>
+        </w:rPr>
+      </w:pPr>
       <w:r>
         <w:rPr>
           <w:b/>
@@ -12,26 +18,43 @@
       </w:r>
     </w:p>
     <w:p>
-      <w:r>
-        <w:t> </w:t>
-      </w:r>
-    </w:p>
-    <w:p>
-      <w:r>
-        <w:t xml:space="preserve">A sample project is provided that includes a generic SPT framework structure with a machine module implemented and </w:t>
-      </w:r>
-      <w:proofErr w:type="spellStart"/>
-      <w:r>
-        <w:t>visu</w:t>
-      </w:r>
-      <w:proofErr w:type="spellEnd"/>
-      <w:r>
-        <w:t xml:space="preserve"> interface.  The goal is to create an equipment module that includes necessary components and performs your project's tasks, operating as a child component to the machine module:</w:t>
-      </w:r>
-    </w:p>
-    <w:p>
-      <w:r>
-        <w:t> </w:t>
+      <w:pPr>
+        <w:rPr>
+          <w:b/>
+          <w:bCs/>
+        </w:rPr>
+      </w:pPr>
+    </w:p>
+    <w:p>
+      <w:r>
+        <w:rPr>
+          <w:b/>
+          <w:bCs/>
+        </w:rPr>
+        <w:t>Requirements : new TC 4026, PTP and advanced motion pack, drive manager 2, scope, vision</w:t>
+      </w:r>
+    </w:p>
+    <w:p>
+      <w:r>
+        <w:t xml:space="preserve">A sample project is provided that includes a generic SPT framework structure with a machine module implemented and visu interface.  </w:t>
+      </w:r>
+      <w:r>
+        <w:t xml:space="preserve">Hardare is scanned in, and twinsafe is set up but you will need to use drive manager to configure the axes to do your project.  </w:t>
+      </w:r>
+      <w:r>
+        <w:t xml:space="preserve">The goal is to </w:t>
+      </w:r>
+      <w:r>
+        <w:t xml:space="preserve">take the existing </w:t>
+      </w:r>
+      <w:r>
+        <w:t xml:space="preserve">equipment module </w:t>
+      </w:r>
+      <w:r>
+        <w:t>in your start project and add functionality to accomplish your project goals.  Each project already has a machine module with visu interface connected, and an equipment module</w:t>
+      </w:r>
+      <w:r>
+        <w:t xml:space="preserve"> </w:t>
       </w:r>
     </w:p>
     <w:p>
@@ -39,39 +62,34 @@
         <w:t>Do not move axes until you have set the axis scaling correctly AND set the default jogging velocities as specified below!!!</w:t>
       </w:r>
     </w:p>
+    <w:p>
+      <w:r>
+        <w:t>Keep speeds low while developing the project and keep your fingers and other extremities out of the mechanisms.</w:t>
+      </w:r>
+    </w:p>
+    <w:p>
+      <w:r>
+        <w:t xml:space="preserve">At the end of the session, each team will lead a short discussion (not presentation) on the </w:t>
+      </w:r>
+      <w:r>
+        <w:rPr>
+          <w:b/>
+          <w:bCs/>
+        </w:rPr>
+        <w:t>SECOND</w:t>
+      </w:r>
+      <w:r>
+        <w:t xml:space="preserve"> lab they did.  Explain the project, the steps you did to make it work, and try to elicit a conversation about the topic for everyone to discuss (as a group) more intricate details of the topics.  i.e. inner workings of the advanced homing library (for rack and pinion project), or the time base of the XFC output for the vision lab.</w:t>
+      </w:r>
+    </w:p>
+    <w:p>
+      <w:r>
+        <w:br w:type="page"/>
+      </w:r>
+    </w:p>
     <w:p/>
     <w:p>
       <w:r>
-        <w:t>Keep speeds low while developing the project and keep your fingers and other extremities out of the mechanisms.</w:t>
-      </w:r>
-    </w:p>
-    <w:p/>
-    <w:p>
-      <w:pPr>
-        <w:ind w:left="720" w:hanging="720"/>
-      </w:pPr>
-      <w:r>
-        <w:t xml:space="preserve">All starter projects already have a </w:t>
-      </w:r>
-      <w:proofErr w:type="spellStart"/>
-      <w:r>
-        <w:t>visu</w:t>
-      </w:r>
-      <w:proofErr w:type="spellEnd"/>
-      <w:r>
-        <w:t xml:space="preserve"> tied to the machine module so use that for control.</w:t>
-      </w:r>
-    </w:p>
-    <w:p/>
-    <w:p/>
-    <w:p>
-      <w:r>
-        <w:br w:type="page"/>
-      </w:r>
-    </w:p>
-    <w:p/>
-    <w:p>
-      <w:r>
         <w:rPr>
           <w:b/>
           <w:bCs/>
@@ -131,7 +149,13 @@
     </w:p>
     <w:p>
       <w:r>
-        <w:t>This project has two servos traveling on a rack together.  The servos have the same gears which have 36 teeth.  The rack has 4.7124mm tooth pitch.  Consider the rail to be 500mm long and each motor carriage is 58mm wide.  Set the default gap to give 10 extra mm.  Set the default motion settings in the CA group to the following:</w:t>
+        <w:t>This project has two servos traveling on a rack together.  The servos have the same gears which have 36 teeth.  The rack has 4.7124mm tooth pitch.  Consider the rail to be 500mm long and each motor carriage is 58mm wide.  Set the default gap to give 10 extra mm</w:t>
+      </w:r>
+      <w:r>
+        <w:t xml:space="preserve"> between motor carriages</w:t>
+      </w:r>
+      <w:r>
+        <w:t>.  Set the default motion settings in the CA group to the following:</w:t>
       </w:r>
       <w:r>
         <w:br/>
@@ -139,15 +163,7 @@
       </w:r>
       <w:r>
         <w:br/>
-        <w:t>Accel/</w:t>
-      </w:r>
-      <w:proofErr w:type="spellStart"/>
-      <w:r>
-        <w:t>Decel</w:t>
-      </w:r>
-      <w:proofErr w:type="spellEnd"/>
-      <w:r>
-        <w:t xml:space="preserve"> 1,000 mm/s</w:t>
+        <w:t>Accel/Decel 1,000 mm/s</w:t>
       </w:r>
       <w:r>
         <w:br/>
@@ -156,15 +172,7 @@
     </w:p>
     <w:p>
       <w:r>
-        <w:t xml:space="preserve">Write homing routines that implement </w:t>
-      </w:r>
-      <w:proofErr w:type="spellStart"/>
-      <w:r>
-        <w:t>I_MotionSequence</w:t>
-      </w:r>
-      <w:proofErr w:type="spellEnd"/>
-      <w:r>
-        <w:t xml:space="preserve"> according to the SPT documentation to home each axis.  The left servo homes to a home switch at position </w:t>
+        <w:t xml:space="preserve">Write homing routines that implement I_MotionSequence according to the SPT documentation to home each axis.  The left servo homes to a home switch at position </w:t>
       </w:r>
       <w:r>
         <w:rPr>
@@ -194,43 +202,36 @@
         <w:t>50%</w:t>
       </w:r>
       <w:r>
-        <w:t>.  Use 50mm/s for the homing velocity for both methods, accel/</w:t>
-      </w:r>
-      <w:proofErr w:type="spellStart"/>
-      <w:r>
-        <w:t>decel</w:t>
-      </w:r>
-      <w:proofErr w:type="spellEnd"/>
-      <w:r>
-        <w:t xml:space="preserve"> of 1k, and jerk of 10k. Follow the SPT motion documentation to create a homing routine that implements </w:t>
-      </w:r>
-      <w:proofErr w:type="spellStart"/>
-      <w:r>
-        <w:t>I_MotionSequence</w:t>
-      </w:r>
-      <w:proofErr w:type="spellEnd"/>
-      <w:r>
-        <w:t xml:space="preserve"> to complete the homing process and then trigger the homing in resetting state 20.</w:t>
+        <w:t xml:space="preserve">.  Use 50mm/s for the homing velocity for both methods, accel/decel of 1k, and jerk of 10k. Follow the SPT motion documentation to create a homing routine that implements I_MotionSequence to complete the homing process and then trigger the homing in </w:t>
+      </w:r>
+      <w:r>
+        <w:t>starting</w:t>
+      </w:r>
+      <w:r>
+        <w:t xml:space="preserve"> state </w:t>
+      </w:r>
+      <w:r>
+        <w:t>3</w:t>
+      </w:r>
+      <w:r>
+        <w:t>0.</w:t>
       </w:r>
     </w:p>
     <w:p>
       <w:r>
         <w:t>In the Execute routine both motors are moved left and right to the positions 50 and 450 showing collision avoidance taking priority over the move commands.  The starter code has them set to a gap with an extra 10mm of space.  Add logic to change the collision avoidance mode the axes use depending on if they're moving left or right.  The difference should be visible.</w:t>
       </w:r>
-      <w:r>
-        <w:br/>
-      </w:r>
-      <w:r>
-        <w:br/>
-        <w:t xml:space="preserve">For your presentation, show the axis configuration for homing settings, when to use </w:t>
-      </w:r>
-      <w:proofErr w:type="spellStart"/>
-      <w:r>
-        <w:t>MC_Home</w:t>
-      </w:r>
-      <w:proofErr w:type="spellEnd"/>
-      <w:r>
-        <w:t xml:space="preserve"> vs the advanced homing library, and the difference between collision avoidance modes.</w:t>
+    </w:p>
+    <w:p>
+      <w:r>
+        <w:t>After this project swap to the ballscrew project.</w:t>
+      </w:r>
+      <w:r>
+        <w:br/>
+      </w:r>
+      <w:r>
+        <w:br/>
+        <w:t>For your presentation, show the axis configuration for homing settings, when to use MC_Home vs the advanced homing library, and the difference between collision avoidance modes.</w:t>
       </w:r>
     </w:p>
     <w:p>
@@ -301,20 +302,7 @@
     </w:p>
     <w:p>
       <w:r>
-        <w:t> </w:t>
-      </w:r>
-    </w:p>
-    <w:p>
-      <w:r>
-        <w:t>Download the SPT camming example and copy the "</w:t>
-      </w:r>
-      <w:proofErr w:type="spellStart"/>
-      <w:r>
-        <w:t>CamModule_UpdateTable</w:t>
-      </w:r>
-      <w:proofErr w:type="spellEnd"/>
-      <w:r>
-        <w:t>" folder into our project.</w:t>
+        <w:t>Download the SPT camming example and copy the "CamModule_UpdateTable" folder into our project.</w:t>
       </w:r>
       <w:r>
         <w:br/>
@@ -323,71 +311,29 @@
         <w:br/>
         <w:t>Determine functional NC offsets and write them to the drive or encoder.  At zero position for the two axes, the long line on the bottom (slave) axis should be vertical and colinear with one of the longer lines on the master axis.</w:t>
       </w:r>
-    </w:p>
-    <w:p>
-      <w:r>
-        <w:t>Either create a cam table or edit the "</w:t>
-      </w:r>
-      <w:proofErr w:type="spellStart"/>
-      <w:r>
-        <w:t>WriteCamParameters</w:t>
-      </w:r>
-      <w:proofErr w:type="spellEnd"/>
-      <w:r>
-        <w:t xml:space="preserve">" methods to create a cam that advances the cam slave axis one "pocket" every 180 degree rotation.  The top gear has 20 pockets and both axes are the same diameter - use this to calculate the angular length of the synchronous zone.  I wasn't able to figure out how to get the </w:t>
-      </w:r>
-      <w:proofErr w:type="spellStart"/>
-      <w:r>
-        <w:t>CamSlave</w:t>
-      </w:r>
-      <w:proofErr w:type="spellEnd"/>
-      <w:r>
-        <w:t xml:space="preserve"> FB to use a cam table from the NC, so not sure if it's possible</w:t>
-      </w:r>
-    </w:p>
-    <w:p>
-      <w:r>
-        <w:t xml:space="preserve">Hints for editing </w:t>
-      </w:r>
-      <w:proofErr w:type="spellStart"/>
-      <w:r>
-        <w:t>WriteCamParameters</w:t>
-      </w:r>
-      <w:proofErr w:type="spellEnd"/>
+      <w:r>
+        <w:t xml:space="preserve">  It’s easiest to do this with axes not linked to PLC and driving them with the NC online window.</w:t>
+      </w:r>
+    </w:p>
+    <w:p>
+      <w:r>
+        <w:t>Either create a cam table or edit the "WriteCamParameters" methods to create a cam that advances the cam slave axis one "pocket" every 180 degree rotation.  The top gear has 20 pockets and both axes are the same diameter - use this to calculate the angular length of the synchronous zone.  I wasn't able to figure out how to get the CamSlave FB to use a cam table from the NC, so not sure if it's possible</w:t>
+      </w:r>
+    </w:p>
+    <w:p>
+      <w:r>
+        <w:t>Hints for editing WriteCamParameters</w:t>
+      </w:r>
       <w:r>
         <w:t xml:space="preserve"> - </w:t>
       </w:r>
       <w:r>
-        <w:t xml:space="preserve">See </w:t>
-      </w:r>
-      <w:proofErr w:type="spellStart"/>
-      <w:r>
-        <w:t>infosys</w:t>
-      </w:r>
-      <w:proofErr w:type="spellEnd"/>
-      <w:r>
-        <w:t xml:space="preserve"> "</w:t>
-      </w:r>
-      <w:proofErr w:type="spellStart"/>
-      <w:r>
-        <w:t>MC_MotionFunctionType</w:t>
-      </w:r>
-      <w:proofErr w:type="spellEnd"/>
-      <w:r>
-        <w:t xml:space="preserve">" </w:t>
-      </w:r>
-    </w:p>
-    <w:p>
-      <w:r>
-        <w:t xml:space="preserve">"Upload Cam" into cam table to see position, velocity, accel </w:t>
-      </w:r>
-      <w:proofErr w:type="spellStart"/>
-      <w:r>
-        <w:t>etc</w:t>
-      </w:r>
-      <w:proofErr w:type="spellEnd"/>
-      <w:r>
-        <w:t xml:space="preserve"> comparisons to see if you made the table you think you did.</w:t>
+        <w:t xml:space="preserve">See infosys "MC_MotionFunctionType" </w:t>
+      </w:r>
+    </w:p>
+    <w:p>
+      <w:r>
+        <w:t>"Upload Cam" into cam table to see position, velocity, accel etc comparisons to see if you made the table you think you did.</w:t>
       </w:r>
     </w:p>
     <w:p>
@@ -397,28 +343,17 @@
     </w:p>
     <w:p>
       <w:r>
-        <w:t xml:space="preserve">If you have extra time, edit the </w:t>
-      </w:r>
-      <w:proofErr w:type="spellStart"/>
-      <w:r>
-        <w:t>CamModule</w:t>
-      </w:r>
-      <w:proofErr w:type="spellEnd"/>
-      <w:r>
-        <w:t xml:space="preserve"> to change functionality depending on machine mode.  If in maintenance mode, have it gear in instead of running a cam.  </w:t>
-      </w:r>
-    </w:p>
-    <w:p>
-      <w:r>
-        <w:t>For your presentation, discuss where to save the NC offset (drive or encoder?) and the cam table you created or the edits you  made to the "</w:t>
-      </w:r>
-      <w:proofErr w:type="spellStart"/>
-      <w:r>
-        <w:t>WriteCamParameters</w:t>
-      </w:r>
-      <w:proofErr w:type="spellEnd"/>
-      <w:r>
-        <w:t>" methods and show it running with the middle inserts in place if you got that far</w:t>
+        <w:t xml:space="preserve">If you have extra time, edit the CamModule to change functionality depending on machine mode.  If in maintenance mode, have it gear in instead of running a cam.  </w:t>
+      </w:r>
+    </w:p>
+    <w:p>
+      <w:r>
+        <w:t>After this project swap to the belt indexing project.</w:t>
+      </w:r>
+    </w:p>
+    <w:p>
+      <w:r>
+        <w:t>For your presentation, discuss where to save the NC offset (drive or encoder?) and the cam table you created or the edits you  made to the "WriteCamParameters" methods and show it running with the middle inserts in place if you got that far</w:t>
       </w:r>
     </w:p>
     <w:p>
@@ -505,145 +440,145 @@
     </w:p>
     <w:p>
       <w:r>
+        <w:t>Hint: touchprobe</w:t>
+      </w:r>
+    </w:p>
+    <w:p>
+      <w:r>
+        <w:t>After this project switch to the gearing/camming project</w:t>
+      </w:r>
+    </w:p>
+    <w:p>
+      <w:r>
+        <w:t xml:space="preserve">Registration Mark wiring: </w:t>
+      </w:r>
+      <w:r>
+        <w:tab/>
+      </w:r>
+      <w:r>
+        <w:t>Brown +</w:t>
+      </w:r>
+      <w:r>
+        <w:t>24vdc, Blue 0vdc, white signal</w:t>
+      </w:r>
+    </w:p>
+    <w:p>
+      <w:r>
+        <w:t xml:space="preserve">In the discussion at the end of the session, discuss the logic you added and any applications where you’ve used this in the past. </w:t>
+      </w:r>
+      <w:r>
+        <w:br w:type="page"/>
+      </w:r>
+    </w:p>
+    <w:p/>
+    <w:p>
+      <w:r>
         <w:t> </w:t>
       </w:r>
       <w:r>
-        <w:t xml:space="preserve">Hint: </w:t>
-      </w:r>
-      <w:proofErr w:type="spellStart"/>
-      <w:r>
-        <w:t>touchprobe</w:t>
-      </w:r>
-      <w:proofErr w:type="spellEnd"/>
-    </w:p>
-    <w:p>
-      <w:r>
-        <w:t xml:space="preserve">Registration Mark wiring: </w:t>
-      </w:r>
-    </w:p>
-    <w:p>
-      <w:r>
-        <w:t>Brown +</w:t>
-      </w:r>
-      <w:r>
-        <w:t>24vdc, Blue 0vdc, white signal</w:t>
-      </w:r>
-    </w:p>
-    <w:p/>
-    <w:p>
-      <w:r>
-        <w:t xml:space="preserve">In the discussion at the end of the session, discuss the logic you added and any applications where you’ve used this in the past. </w:t>
-      </w:r>
-      <w:r>
-        <w:br w:type="page"/>
-      </w:r>
-    </w:p>
-    <w:p/>
+        <w:rPr>
+          <w:b/>
+          <w:bCs/>
+        </w:rPr>
+        <w:t>Camera Trigger with XFC</w:t>
+      </w:r>
+      <w:r>
+        <w:rPr>
+          <w:b/>
+          <w:bCs/>
+        </w:rPr>
+        <w:tab/>
+      </w:r>
+      <w:r>
+        <w:rPr>
+          <w:b/>
+          <w:bCs/>
+        </w:rPr>
+        <w:tab/>
+      </w:r>
+      <w:r>
+        <w:rPr>
+          <w:b/>
+          <w:bCs/>
+        </w:rPr>
+        <w:tab/>
+      </w:r>
+      <w:r>
+        <w:rPr>
+          <w:b/>
+          <w:bCs/>
+        </w:rPr>
+        <w:tab/>
+      </w:r>
+      <w:r>
+        <w:rPr>
+          <w:b/>
+          <w:bCs/>
+        </w:rPr>
+        <w:tab/>
+      </w:r>
+      <w:r>
+        <w:rPr>
+          <w:b/>
+          <w:bCs/>
+        </w:rPr>
+        <w:tab/>
+      </w:r>
+      <w:r>
+        <w:rPr>
+          <w:b/>
+          <w:bCs/>
+        </w:rPr>
+        <w:tab/>
+      </w:r>
+      <w:r>
+        <w:rPr>
+          <w:b/>
+          <w:bCs/>
+        </w:rPr>
+        <w:tab/>
+      </w:r>
+      <w:r>
+        <w:rPr>
+          <w:b/>
+          <w:bCs/>
+        </w:rPr>
+        <w:tab/>
+        <w:t>DHCP</w:t>
+      </w:r>
+    </w:p>
+    <w:p>
+      <w:r>
+        <w:t>This project has a servo that spins a can and a camera looking at the can.  The project currently "works" but the camera image trigger is done poorly</w:t>
+      </w:r>
+      <w:r>
+        <w:t xml:space="preserve">.  You will implement an XFC camera trigger instead. </w:t>
+      </w:r>
+    </w:p>
+    <w:p>
+      <w:r>
+        <w:t xml:space="preserve">Get the system into the executing state and view the images that are taken.  You should see a lot of variance in the can position.  </w:t>
+      </w:r>
+      <w:r>
+        <w:t>The default settings spin the can at 500 degrees per second.  Increase this to 1000 degrees per second, then to 2000.  You should see that the error in the camera trigger timing is a function of speed (among other things).  Note for the sake of emphasis, the plc code is running at 100ms</w:t>
+      </w:r>
+      <w:r>
+        <w:t xml:space="preserve"> so there is also exaggerated jitter due to task timings.</w:t>
+      </w:r>
+    </w:p>
     <w:p>
       <w:r>
         <w:t> </w:t>
       </w:r>
       <w:r>
-        <w:rPr>
-          <w:b/>
-          <w:bCs/>
-        </w:rPr>
-        <w:t>Camera Trigger with XFC</w:t>
-      </w:r>
-      <w:r>
-        <w:rPr>
-          <w:b/>
-          <w:bCs/>
-        </w:rPr>
-        <w:tab/>
-      </w:r>
-      <w:r>
-        <w:rPr>
-          <w:b/>
-          <w:bCs/>
-        </w:rPr>
-        <w:tab/>
-      </w:r>
-      <w:r>
-        <w:rPr>
-          <w:b/>
-          <w:bCs/>
-        </w:rPr>
-        <w:tab/>
-      </w:r>
-      <w:r>
-        <w:rPr>
-          <w:b/>
-          <w:bCs/>
-        </w:rPr>
-        <w:tab/>
-      </w:r>
-      <w:r>
-        <w:rPr>
-          <w:b/>
-          <w:bCs/>
-        </w:rPr>
-        <w:tab/>
-      </w:r>
-      <w:r>
-        <w:rPr>
-          <w:b/>
-          <w:bCs/>
-        </w:rPr>
-        <w:tab/>
-      </w:r>
-      <w:r>
-        <w:rPr>
-          <w:b/>
-          <w:bCs/>
-        </w:rPr>
-        <w:tab/>
-      </w:r>
-      <w:r>
-        <w:rPr>
-          <w:b/>
-          <w:bCs/>
-        </w:rPr>
-        <w:tab/>
-      </w:r>
-      <w:r>
-        <w:rPr>
-          <w:b/>
-          <w:bCs/>
-        </w:rPr>
-        <w:tab/>
-        <w:t>DHCP</w:t>
-      </w:r>
-    </w:p>
-    <w:p>
-      <w:r>
-        <w:t>This project has a servo that spins a can and a camera looking at the can.  The project currently "works" but the camera image trigger is done poorly</w:t>
-      </w:r>
-      <w:r>
-        <w:t xml:space="preserve">.  You will implement an XFC camera trigger instead. </w:t>
-      </w:r>
-    </w:p>
-    <w:p>
-      <w:r>
-        <w:t xml:space="preserve">Get the system into the executing state and view the images that are taken.  You should see a lot of variance in the can position.  </w:t>
-      </w:r>
-      <w:r>
-        <w:t>The default settings spin the can at 500 degrees per second.  Increase this to 1000 degrees per second, then to 2000.  You should see that the error in the camera trigger timing is a function of speed (among other things).  Note for the sake of emphasis, the plc code is running at 100ms</w:t>
-      </w:r>
-      <w:r>
-        <w:t xml:space="preserve"> so there is also exaggerated jitter due to task timings.</w:t>
-      </w:r>
-    </w:p>
-    <w:p>
-      <w:r>
-        <w:t> </w:t>
-      </w:r>
-      <w:r>
         <w:t>Trigger configuration:</w:t>
       </w:r>
     </w:p>
     <w:p>
       <w:r>
+        <w:rPr>
+          <w:noProof/>
+        </w:rPr>
         <w:drawing>
           <wp:inline distT="0" distB="0" distL="0" distR="0" wp14:anchorId="2C4F4CBC" wp14:editId="52F0D5E1">
             <wp:extent cx="5943600" cy="3604895"/>
@@ -688,15 +623,7 @@
     </w:p>
     <w:p>
       <w:r>
-        <w:t xml:space="preserve">You have the change camera trigger settings in the configuration window as shown above to switch between software trigger (starter project) and </w:t>
-      </w:r>
-      <w:proofErr w:type="spellStart"/>
-      <w:r>
-        <w:t>ethercat</w:t>
-      </w:r>
-      <w:proofErr w:type="spellEnd"/>
-      <w:r>
-        <w:t xml:space="preserve"> </w:t>
+        <w:t xml:space="preserve">You have the change camera trigger settings in the configuration window as shown above to switch between software trigger (starter project) and ethercat </w:t>
       </w:r>
       <w:r>
         <w:t xml:space="preserve">timestamp </w:t>
@@ -728,6 +655,9 @@
       <w:r>
         <w:t>In your discussion at the end of the session discuss the fundamentals of the changes you made and your results.</w:t>
       </w:r>
+      <w:r>
+        <w:t xml:space="preserve">  Try to get group discussion about how to further minimize difference of trigger positions and low and high velocities.</w:t>
+      </w:r>
     </w:p>
     <w:p>
       <w:r>
@@ -789,51 +719,196 @@
     </w:p>
     <w:p>
       <w:r>
-        <w:t xml:space="preserve">This project has two opposing servo axes - one (axis #??) has a resolver and the other has an </w:t>
-      </w:r>
-      <w:r>
-        <w:t>absolute</w:t>
-      </w:r>
-      <w:r>
-        <w:t xml:space="preserve"> encoder.</w:t>
-      </w:r>
-    </w:p>
-    <w:p>
-      <w:r>
-        <w:t xml:space="preserve">In mode 1, the axis in channel A should be set to torque mode and apply 0.5NM of torque to the other servo, which is in position mode and </w:t>
-      </w:r>
-      <w:proofErr w:type="spellStart"/>
-      <w:r>
-        <w:t>oscilates</w:t>
-      </w:r>
-      <w:proofErr w:type="spellEnd"/>
-      <w:r>
-        <w:t xml:space="preserve"> between 0 and 180 degrees with 1 second dwells.  Just do these moves with </w:t>
-      </w:r>
-      <w:proofErr w:type="spellStart"/>
-      <w:r>
-        <w:t>MoveAbsolute</w:t>
-      </w:r>
-      <w:proofErr w:type="spellEnd"/>
-      <w:r>
-        <w:t>()</w:t>
-      </w:r>
-    </w:p>
-    <w:p>
-      <w:r>
-        <w:t>In mode 2, swap the modes the axes are in, so channel B should now be set to torque mode and Channel A in position mode, performing the same motion.</w:t>
-      </w:r>
-    </w:p>
-    <w:p>
-      <w:r>
-        <w:t>For your presentation show how to change the operation mode programmatically and show a scope of the position vs torque of both axes.</w:t>
-      </w:r>
-      <w:r>
-        <w:br/>
+        <w:t>This project has two opposing servo axes - one (axis #??) has a resolver and the other has an absolute encoder.</w:t>
+      </w:r>
+    </w:p>
+    <w:p>
+      <w:r>
+        <w:t xml:space="preserve">Scan in the AX5000 unit and the motors.  You’ll see only the channel B motor has an electronic nameplate.  Use drive manager 2 to select the motor for channel A.  </w:t>
+      </w:r>
+    </w:p>
+    <w:p>
+      <w:r>
+        <w:t xml:space="preserve">Configure </w:t>
+      </w:r>
+      <w:r>
+        <w:t>one axis to be in torque</w:t>
+      </w:r>
+      <w:r>
+        <w:t xml:space="preserve"> mode and </w:t>
+      </w:r>
+      <w:r>
+        <w:t xml:space="preserve">the other </w:t>
+      </w:r>
+      <w:r>
+        <w:t>in position mode.  Configure both to be rotary axes.</w:t>
+      </w:r>
+      <w:r>
+        <w:t xml:space="preserve">  Through DM2 start a reversing sequence on the position control axis and tune the controller</w:t>
+      </w:r>
+      <w:r>
+        <w:t>s (one at a time with other disabled)</w:t>
+      </w:r>
+      <w:r>
+        <w:t xml:space="preserve"> to be pretty stiff.</w:t>
+      </w:r>
+    </w:p>
+    <w:p>
+      <w:r>
+        <w:t>The starter project enables “PositionAxis”, sets current position to 0, and stars a reversing sequence.  Ensure this is working before continuing on.</w:t>
+      </w:r>
+    </w:p>
+    <w:p>
+      <w:r>
+        <w:t>Now follow Matt Prellwitz’s guide on the wiki for MC_TorqueControl on an AX5000</w:t>
+      </w:r>
+      <w:r>
+        <w:t xml:space="preserve"> titled “AX5000 MC_TorqueControlSetup” and implement logic for “TorqueAxis” to apply a constant 0.1nm torque.</w:t>
+      </w:r>
+    </w:p>
+    <w:p>
+      <w:r>
+        <w:t xml:space="preserve">For your presentation show how to change the operation mode programmatically </w:t>
+      </w:r>
+      <w:r>
+        <w:t>and things to look out for.  (Imagine this setup but the Position Axis faults, and the torque axis can now accelerate)</w:t>
+      </w:r>
+    </w:p>
+    <w:p>
+      <w:r>
+        <w:br w:type="page"/>
+      </w:r>
+    </w:p>
+    <w:p>
+      <w:r>
+        <w:lastRenderedPageBreak/>
+        <w:t>Autotune – re-use matt prellwitz’s autotuning lab from NEM</w:t>
+      </w:r>
+      <w:r>
+        <w:br/>
+      </w:r>
+    </w:p>
+    <w:p/>
+    <w:p>
+      <w:r>
+        <w:t xml:space="preserve">Ballscrew – Nick making a lab with ax8000, ballscrew, </w:t>
+      </w:r>
+      <w:r>
+        <w:t>limit switches</w:t>
+      </w:r>
+      <w:r>
         <w:t> </w:t>
       </w:r>
     </w:p>
-    <w:p/>
+    <w:p>
+      <w:r>
+        <w:br w:type="page"/>
+      </w:r>
+    </w:p>
+    <w:p>
+      <w:pPr>
+        <w:rPr>
+          <w:highlight w:val="yellow"/>
+        </w:rPr>
+      </w:pPr>
+      <w:r>
+        <w:lastRenderedPageBreak/>
+        <w:t>List of who’s going to be doing the demos:</w:t>
+      </w:r>
+      <w:r>
+        <w:br/>
+      </w:r>
+      <w:r>
+        <w:t>Adam</w:t>
+      </w:r>
+      <w:r>
+        <w:br/>
+        <w:t>Ben</w:t>
+      </w:r>
+      <w:r>
+        <w:br/>
+        <w:t>Nick</w:t>
+      </w:r>
+      <w:r>
+        <w:br/>
+        <w:t>Matthew</w:t>
+      </w:r>
+      <w:r>
+        <w:br/>
+        <w:t>Kurt</w:t>
+      </w:r>
+      <w:r>
+        <w:br/>
+        <w:t>Alina</w:t>
+      </w:r>
+      <w:r>
+        <w:br/>
+        <w:t>Arthur</w:t>
+      </w:r>
+      <w:r>
+        <w:br/>
+        <w:t>Yizhou</w:t>
+      </w:r>
+      <w:r>
+        <w:br/>
+        <w:t>Steve</w:t>
+      </w:r>
+      <w:r>
+        <w:br/>
+      </w:r>
+      <w:r>
+        <w:t>Andrew Hyder</w:t>
+      </w:r>
+      <w:r>
+        <w:rPr>
+          <w:highlight w:val="yellow"/>
+        </w:rPr>
+        <w:br/>
+      </w:r>
+      <w:r>
+        <w:t>Connor</w:t>
+      </w:r>
+      <w:r>
+        <w:t xml:space="preserve"> (Wednesday only)</w:t>
+      </w:r>
+      <w:r>
+        <w:br/>
+      </w:r>
+    </w:p>
+    <w:p>
+      <w:r>
+        <w:t>Teams</w:t>
+      </w:r>
+      <w:r>
+        <w:br/>
+        <w:t>Nick and Alina</w:t>
+      </w:r>
+      <w:r>
+        <w:br/>
+        <w:t>Steve and Arthur</w:t>
+      </w:r>
+      <w:r>
+        <w:br/>
+        <w:t>Adam and Kurt</w:t>
+      </w:r>
+      <w:r>
+        <w:br/>
+        <w:t xml:space="preserve">Yizhou and </w:t>
+      </w:r>
+      <w:r>
+        <w:t>Ben</w:t>
+      </w:r>
+      <w:r>
+        <w:br/>
+        <w:t>Matthew and Connor</w:t>
+      </w:r>
+      <w:r>
+        <w:t xml:space="preserve"> (Wednesday) and Andrew Hyder</w:t>
+      </w:r>
+      <w:r>
+        <w:br/>
+      </w:r>
+    </w:p>
     <w:sectPr>
       <w:pgSz w:w="12240" w:h="15840"/>
       <w:pgMar w:top="1440" w:right="1440" w:bottom="1440" w:left="1440" w:header="720" w:footer="720" w:gutter="0"/>
@@ -1447,6 +1522,7 @@
   <w:style w:type="character" w:default="1" w:styleId="DefaultParagraphFont">
     <w:name w:val="Default Paragraph Font"/>
     <w:uiPriority w:val="1"/>
+    <w:semiHidden/>
     <w:unhideWhenUsed/>
   </w:style>
   <w:style w:type="table" w:default="1" w:styleId="TableNormal">

</xml_diff>

<commit_message>
Coupled motion lab finished
</commit_message>
<xml_diff>
--- a/Instructions.docx
+++ b/Instructions.docx
@@ -26,20 +26,50 @@
       </w:pPr>
     </w:p>
     <w:p>
-      <w:r>
-        <w:rPr>
-          <w:b/>
-          <w:bCs/>
-        </w:rPr>
-        <w:t>Requirements : new TC 4026, PTP and advanced motion pack, drive manager 2, scope, vision</w:t>
-      </w:r>
-    </w:p>
-    <w:p>
-      <w:r>
-        <w:t xml:space="preserve">A sample project is provided that includes a generic SPT framework structure with a machine module implemented and visu interface.  </w:t>
-      </w:r>
-      <w:r>
-        <w:t xml:space="preserve">Hardare is scanned in, and twinsafe is set up but you will need to use drive manager to configure the axes to do your project.  </w:t>
+      <w:proofErr w:type="gramStart"/>
+      <w:r>
+        <w:rPr>
+          <w:b/>
+          <w:bCs/>
+        </w:rPr>
+        <w:t>Requirements :</w:t>
+      </w:r>
+      <w:proofErr w:type="gramEnd"/>
+      <w:r>
+        <w:rPr>
+          <w:b/>
+          <w:bCs/>
+        </w:rPr>
+        <w:t xml:space="preserve"> new TC 4026, PTP and advanced motion pack, drive manager 2, scope, vision</w:t>
+      </w:r>
+    </w:p>
+    <w:p>
+      <w:r>
+        <w:t xml:space="preserve">A sample project is provided that includes a generic SPT framework structure with a machine module implemented and </w:t>
+      </w:r>
+      <w:proofErr w:type="spellStart"/>
+      <w:r>
+        <w:t>visu</w:t>
+      </w:r>
+      <w:proofErr w:type="spellEnd"/>
+      <w:r>
+        <w:t xml:space="preserve"> interface.  </w:t>
+      </w:r>
+      <w:proofErr w:type="spellStart"/>
+      <w:r>
+        <w:t>Hardare</w:t>
+      </w:r>
+      <w:proofErr w:type="spellEnd"/>
+      <w:r>
+        <w:t xml:space="preserve"> is scanned in, and </w:t>
+      </w:r>
+      <w:proofErr w:type="spellStart"/>
+      <w:r>
+        <w:t>twinsafe</w:t>
+      </w:r>
+      <w:proofErr w:type="spellEnd"/>
+      <w:r>
+        <w:t xml:space="preserve"> is set up but you will need to use drive manager to configure the axes to do your project.  </w:t>
       </w:r>
       <w:r>
         <w:t xml:space="preserve">The goal is to </w:t>
@@ -51,7 +81,15 @@
         <w:t xml:space="preserve">equipment module </w:t>
       </w:r>
       <w:r>
-        <w:t>in your start project and add functionality to accomplish your project goals.  Each project already has a machine module with visu interface connected, and an equipment module</w:t>
+        <w:t xml:space="preserve">in your start project and add functionality to accomplish your project goals.  Each project already has a machine module with </w:t>
+      </w:r>
+      <w:proofErr w:type="spellStart"/>
+      <w:r>
+        <w:t>visu</w:t>
+      </w:r>
+      <w:proofErr w:type="spellEnd"/>
+      <w:r>
+        <w:t xml:space="preserve"> interface connected, and an equipment module</w:t>
       </w:r>
       <w:r>
         <w:t xml:space="preserve"> </w:t>
@@ -79,7 +117,15 @@
         <w:t>SECOND</w:t>
       </w:r>
       <w:r>
-        <w:t xml:space="preserve"> lab they did.  Explain the project, the steps you did to make it work, and try to elicit a conversation about the topic for everyone to discuss (as a group) more intricate details of the topics.  i.e. inner workings of the advanced homing library (for rack and pinion project), or the time base of the XFC output for the vision lab.</w:t>
+        <w:t xml:space="preserve"> lab they did.  Explain the project, the steps you </w:t>
+      </w:r>
+      <w:proofErr w:type="gramStart"/>
+      <w:r>
+        <w:t>did</w:t>
+      </w:r>
+      <w:proofErr w:type="gramEnd"/>
+      <w:r>
+        <w:t xml:space="preserve"> to make it work, and try to elicit a conversation about the topic for everyone to discuss (as a group) more intricate details of the topics.  i.e. inner workings of the advanced homing library (for rack and pinion project), or the time base of the XFC output for the vision lab.</w:t>
       </w:r>
     </w:p>
     <w:p>
@@ -94,7 +140,23 @@
           <w:b/>
           <w:bCs/>
         </w:rPr>
-        <w:t>Rack and pinion - Hardware Kit A</w:t>
+        <w:t xml:space="preserve">Rack and </w:t>
+      </w:r>
+      <w:proofErr w:type="gramStart"/>
+      <w:r>
+        <w:rPr>
+          <w:b/>
+          <w:bCs/>
+        </w:rPr>
+        <w:t>pinion</w:t>
+      </w:r>
+      <w:proofErr w:type="gramEnd"/>
+      <w:r>
+        <w:rPr>
+          <w:b/>
+          <w:bCs/>
+        </w:rPr>
+        <w:t xml:space="preserve"> - Hardware Kit A</w:t>
       </w:r>
       <w:r>
         <w:rPr>
@@ -163,7 +225,15 @@
       </w:r>
       <w:r>
         <w:br/>
-        <w:t>Accel/Decel 1,000 mm/s</w:t>
+        <w:t>Accel/</w:t>
+      </w:r>
+      <w:proofErr w:type="spellStart"/>
+      <w:r>
+        <w:t>Decel</w:t>
+      </w:r>
+      <w:proofErr w:type="spellEnd"/>
+      <w:r>
+        <w:t xml:space="preserve"> 1,000 mm/s</w:t>
       </w:r>
       <w:r>
         <w:br/>
@@ -172,7 +242,23 @@
     </w:p>
     <w:p>
       <w:r>
-        <w:t xml:space="preserve">Write homing routines that implement I_MotionSequence according to the SPT documentation to home each axis.  The left servo homes to a home switch at position </w:t>
+        <w:t xml:space="preserve">Write </w:t>
+      </w:r>
+      <w:proofErr w:type="gramStart"/>
+      <w:r>
+        <w:t>homing</w:t>
+      </w:r>
+      <w:proofErr w:type="gramEnd"/>
+      <w:r>
+        <w:t xml:space="preserve"> routines that implement </w:t>
+      </w:r>
+      <w:proofErr w:type="spellStart"/>
+      <w:r>
+        <w:t>I_MotionSequence</w:t>
+      </w:r>
+      <w:proofErr w:type="spellEnd"/>
+      <w:r>
+        <w:t xml:space="preserve"> according to the SPT documentation to home each axis.  The left servo homes to a home switch at position </w:t>
       </w:r>
       <w:r>
         <w:rPr>
@@ -202,7 +288,23 @@
         <w:t>50%</w:t>
       </w:r>
       <w:r>
-        <w:t xml:space="preserve">.  Use 50mm/s for the homing velocity for both methods, accel/decel of 1k, and jerk of 10k. Follow the SPT motion documentation to create a homing routine that implements I_MotionSequence to complete the homing process and then trigger the homing in </w:t>
+        <w:t>.  Use 50mm/s for the homing velocity for both methods, accel/</w:t>
+      </w:r>
+      <w:proofErr w:type="spellStart"/>
+      <w:r>
+        <w:t>decel</w:t>
+      </w:r>
+      <w:proofErr w:type="spellEnd"/>
+      <w:r>
+        <w:t xml:space="preserve"> of 1k, and jerk of 10k. Follow the SPT motion documentation to create a homing routine that implements </w:t>
+      </w:r>
+      <w:proofErr w:type="spellStart"/>
+      <w:r>
+        <w:t>I_MotionSequence</w:t>
+      </w:r>
+      <w:proofErr w:type="spellEnd"/>
+      <w:r>
+        <w:t xml:space="preserve"> to complete the homing process and then trigger the homing in </w:t>
       </w:r>
       <w:r>
         <w:t>starting</w:t>
@@ -224,14 +326,38 @@
     </w:p>
     <w:p>
       <w:r>
-        <w:t>After this project swap to the ballscrew project.</w:t>
-      </w:r>
-      <w:r>
-        <w:br/>
-      </w:r>
-      <w:r>
-        <w:br/>
-        <w:t>For your presentation, show the axis configuration for homing settings, when to use MC_Home vs the advanced homing library, and the difference between collision avoidance modes.</w:t>
+        <w:t xml:space="preserve">After this </w:t>
+      </w:r>
+      <w:proofErr w:type="gramStart"/>
+      <w:r>
+        <w:t>project</w:t>
+      </w:r>
+      <w:proofErr w:type="gramEnd"/>
+      <w:r>
+        <w:t xml:space="preserve"> swap to the </w:t>
+      </w:r>
+      <w:proofErr w:type="spellStart"/>
+      <w:r>
+        <w:t>ballscrew</w:t>
+      </w:r>
+      <w:proofErr w:type="spellEnd"/>
+      <w:r>
+        <w:t xml:space="preserve"> project.</w:t>
+      </w:r>
+      <w:r>
+        <w:br/>
+      </w:r>
+      <w:r>
+        <w:br/>
+        <w:t xml:space="preserve">For your presentation, show the axis configuration for homing settings, when to use </w:t>
+      </w:r>
+      <w:proofErr w:type="spellStart"/>
+      <w:r>
+        <w:t>MC_Home</w:t>
+      </w:r>
+      <w:proofErr w:type="spellEnd"/>
+      <w:r>
+        <w:t xml:space="preserve"> vs the advanced homing library, and the difference between collision avoidance modes.</w:t>
       </w:r>
     </w:p>
     <w:p>
@@ -251,8 +377,17 @@
           <w:bCs/>
         </w:rPr>
         <w:lastRenderedPageBreak/>
-        <w:t>Gearing/Camming - Hardware Kit A</w:t>
-      </w:r>
+        <w:t xml:space="preserve">Gearing/Camming - Hardware Kit </w:t>
+      </w:r>
+      <w:proofErr w:type="gramStart"/>
+      <w:r>
+        <w:rPr>
+          <w:b/>
+          <w:bCs/>
+        </w:rPr>
+        <w:t>A</w:t>
+      </w:r>
+      <w:proofErr w:type="gramEnd"/>
       <w:r>
         <w:rPr>
           <w:b/>
@@ -302,7 +437,15 @@
     </w:p>
     <w:p>
       <w:r>
-        <w:t>Download the SPT camming example and copy the "CamModule_UpdateTable" folder into our project.</w:t>
+        <w:t>Download the SPT camming example and copy the "</w:t>
+      </w:r>
+      <w:proofErr w:type="spellStart"/>
+      <w:r>
+        <w:t>CamModule_UpdateTable</w:t>
+      </w:r>
+      <w:proofErr w:type="spellEnd"/>
+      <w:r>
+        <w:t>" folder into our project.</w:t>
       </w:r>
       <w:r>
         <w:br/>
@@ -317,23 +460,100 @@
     </w:p>
     <w:p>
       <w:r>
-        <w:t>Either create a cam table or edit the "WriteCamParameters" methods to create a cam that advances the cam slave axis one "pocket" every 180 degree rotation.  The top gear has 20 pockets and both axes are the same diameter - use this to calculate the angular length of the synchronous zone.  I wasn't able to figure out how to get the CamSlave FB to use a cam table from the NC, so not sure if it's possible</w:t>
-      </w:r>
-    </w:p>
-    <w:p>
-      <w:r>
-        <w:t>Hints for editing WriteCamParameters</w:t>
-      </w:r>
+        <w:t>Either create a cam table or edit the "</w:t>
+      </w:r>
+      <w:proofErr w:type="spellStart"/>
+      <w:r>
+        <w:t>WriteCamParameters</w:t>
+      </w:r>
+      <w:proofErr w:type="spellEnd"/>
+      <w:r>
+        <w:t xml:space="preserve">" methods to create a cam that advances the cam slave axis one "pocket" every </w:t>
+      </w:r>
+      <w:proofErr w:type="gramStart"/>
+      <w:r>
+        <w:t>180 degree</w:t>
+      </w:r>
+      <w:proofErr w:type="gramEnd"/>
+      <w:r>
+        <w:t xml:space="preserve"> rotation.  The top gear has 20 pockets and both axes are the same diameter - use this to calculate the angular length of the synchronous zone.  I </w:t>
+      </w:r>
+      <w:proofErr w:type="gramStart"/>
+      <w:r>
+        <w:t>wasn't able to</w:t>
+      </w:r>
+      <w:proofErr w:type="gramEnd"/>
+      <w:r>
+        <w:t xml:space="preserve"> figure out how to get the </w:t>
+      </w:r>
+      <w:proofErr w:type="spellStart"/>
+      <w:r>
+        <w:t>CamSlave</w:t>
+      </w:r>
+      <w:proofErr w:type="spellEnd"/>
+      <w:r>
+        <w:t xml:space="preserve"> FB to use a cam table from the NC, </w:t>
+      </w:r>
+      <w:proofErr w:type="gramStart"/>
+      <w:r>
+        <w:t>so</w:t>
+      </w:r>
+      <w:proofErr w:type="gramEnd"/>
+      <w:r>
+        <w:t xml:space="preserve"> not sure if it's possible</w:t>
+      </w:r>
+    </w:p>
+    <w:p>
+      <w:r>
+        <w:t xml:space="preserve">Hints for editing </w:t>
+      </w:r>
+      <w:proofErr w:type="spellStart"/>
+      <w:r>
+        <w:t>WriteCamParameters</w:t>
+      </w:r>
+      <w:proofErr w:type="spellEnd"/>
       <w:r>
         <w:t xml:space="preserve"> - </w:t>
       </w:r>
       <w:r>
-        <w:t xml:space="preserve">See infosys "MC_MotionFunctionType" </w:t>
-      </w:r>
-    </w:p>
-    <w:p>
-      <w:r>
-        <w:t>"Upload Cam" into cam table to see position, velocity, accel etc comparisons to see if you made the table you think you did.</w:t>
+        <w:t xml:space="preserve">See </w:t>
+      </w:r>
+      <w:proofErr w:type="spellStart"/>
+      <w:r>
+        <w:t>infosys</w:t>
+      </w:r>
+      <w:proofErr w:type="spellEnd"/>
+      <w:r>
+        <w:t xml:space="preserve"> "</w:t>
+      </w:r>
+      <w:proofErr w:type="spellStart"/>
+      <w:r>
+        <w:t>MC_MotionFunctionType</w:t>
+      </w:r>
+      <w:proofErr w:type="spellEnd"/>
+      <w:r>
+        <w:t xml:space="preserve">" </w:t>
+      </w:r>
+    </w:p>
+    <w:p>
+      <w:r>
+        <w:t xml:space="preserve">"Upload Cam" into cam table to see position, velocity, accel </w:t>
+      </w:r>
+      <w:proofErr w:type="spellStart"/>
+      <w:r>
+        <w:t>etc</w:t>
+      </w:r>
+      <w:proofErr w:type="spellEnd"/>
+      <w:r>
+        <w:t xml:space="preserve"> comparisons to see if you made the </w:t>
+      </w:r>
+      <w:proofErr w:type="gramStart"/>
+      <w:r>
+        <w:t>table</w:t>
+      </w:r>
+      <w:proofErr w:type="gramEnd"/>
+      <w:r>
+        <w:t xml:space="preserve"> you think you did.</w:t>
       </w:r>
     </w:p>
     <w:p>
@@ -343,17 +563,49 @@
     </w:p>
     <w:p>
       <w:r>
-        <w:t xml:space="preserve">If you have extra time, edit the CamModule to change functionality depending on machine mode.  If in maintenance mode, have it gear in instead of running a cam.  </w:t>
-      </w:r>
-    </w:p>
-    <w:p>
-      <w:r>
-        <w:t>After this project swap to the belt indexing project.</w:t>
-      </w:r>
-    </w:p>
-    <w:p>
-      <w:r>
-        <w:t>For your presentation, discuss where to save the NC offset (drive or encoder?) and the cam table you created or the edits you  made to the "WriteCamParameters" methods and show it running with the middle inserts in place if you got that far</w:t>
+        <w:t xml:space="preserve">If you have extra time, edit the </w:t>
+      </w:r>
+      <w:proofErr w:type="spellStart"/>
+      <w:r>
+        <w:t>CamModule</w:t>
+      </w:r>
+      <w:proofErr w:type="spellEnd"/>
+      <w:r>
+        <w:t xml:space="preserve"> to change functionality depending on machine mode.  If in maintenance mode, have it gear in instead of running a cam.  </w:t>
+      </w:r>
+    </w:p>
+    <w:p>
+      <w:r>
+        <w:t xml:space="preserve">After this project </w:t>
+      </w:r>
+      <w:proofErr w:type="gramStart"/>
+      <w:r>
+        <w:t>swap to</w:t>
+      </w:r>
+      <w:proofErr w:type="gramEnd"/>
+      <w:r>
+        <w:t xml:space="preserve"> the belt indexing project.</w:t>
+      </w:r>
+    </w:p>
+    <w:p>
+      <w:r>
+        <w:t xml:space="preserve">For your presentation, discuss where to save the NC offset (drive or encoder?) and the cam table you created or the edits </w:t>
+      </w:r>
+      <w:proofErr w:type="gramStart"/>
+      <w:r>
+        <w:t>you  made</w:t>
+      </w:r>
+      <w:proofErr w:type="gramEnd"/>
+      <w:r>
+        <w:t xml:space="preserve"> to the "</w:t>
+      </w:r>
+      <w:proofErr w:type="spellStart"/>
+      <w:r>
+        <w:t>WriteCamParameters</w:t>
+      </w:r>
+      <w:proofErr w:type="spellEnd"/>
+      <w:r>
+        <w:t>" methods and show it running with the middle inserts in place if you got that far</w:t>
       </w:r>
     </w:p>
     <w:p>
@@ -373,8 +625,17 @@
           <w:bCs/>
         </w:rPr>
         <w:lastRenderedPageBreak/>
-        <w:t>Indexing to Drive Input - Hardware Kit A</w:t>
-      </w:r>
+        <w:t xml:space="preserve">Indexing to Drive Input - Hardware Kit </w:t>
+      </w:r>
+      <w:proofErr w:type="gramStart"/>
+      <w:r>
+        <w:rPr>
+          <w:b/>
+          <w:bCs/>
+        </w:rPr>
+        <w:t>A</w:t>
+      </w:r>
+      <w:proofErr w:type="gramEnd"/>
       <w:r>
         <w:rPr>
           <w:b/>
@@ -419,10 +680,27 @@
     </w:p>
     <w:p>
       <w:r>
-        <w:t xml:space="preserve">The belt is a timing belt with 5mm pitch between teeth.  The belt pulleys have 24 teeth and the gear ratio of the gears is 2:1 (2 rotations of the motor = 1 rotation of the pulley).  The belt has 120 teeth.  There is a 420mm offset from the registration mark sensor to the marks to index to. </w:t>
-      </w:r>
-    </w:p>
-    <w:p>
+        <w:t xml:space="preserve">The belt is a timing belt with 5mm pitch between teeth.  The belt pulleys have 24 </w:t>
+      </w:r>
+      <w:proofErr w:type="gramStart"/>
+      <w:r>
+        <w:t>teeth</w:t>
+      </w:r>
+      <w:proofErr w:type="gramEnd"/>
+      <w:r>
+        <w:t xml:space="preserve"> and the gear ratio of the gears is 2:1 (2 rotations of the motor = 1 rotation of the pulley).  The belt has 120 teeth.  There is a 420mm offset from the registration mark sensor to the marks to index </w:t>
+      </w:r>
+      <w:proofErr w:type="gramStart"/>
+      <w:r>
+        <w:t>to</w:t>
+      </w:r>
+      <w:proofErr w:type="gramEnd"/>
+      <w:r>
+        <w:t xml:space="preserve">. </w:t>
+      </w:r>
+      <w:r>
+        <w:br/>
+      </w:r>
       <w:r>
         <w:br/>
         <w:t>In the reset routine, set the current position to 0</w:t>
@@ -430,7 +708,18 @@
     </w:p>
     <w:p>
       <w:r>
-        <w:t xml:space="preserve">In the running routine, move in the positive direction, where the belt side facing you is moving upwards, at 250mm/s.  Notice in the execute routine there is already logic for buffering the registration mark positions.  You must configure the drive inputs and add </w:t>
+        <w:t xml:space="preserve">In the running routine, move in the positive direction, where the belt side facing you is moving upwards, at 250mm/s.  Notice in the </w:t>
+      </w:r>
+      <w:proofErr w:type="gramStart"/>
+      <w:r>
+        <w:t>execute</w:t>
+      </w:r>
+      <w:proofErr w:type="gramEnd"/>
+      <w:r>
+        <w:t xml:space="preserve"> routine there is already logic for buffering the registration mark positions.  You must configure the drive inputs and add </w:t>
+      </w:r>
+      <w:r>
+        <w:t>touch probe functionality to buffer the positions and index to them.</w:t>
       </w:r>
     </w:p>
     <w:p>
@@ -440,23 +729,21 @@
     </w:p>
     <w:p>
       <w:r>
-        <w:t>Hint: touchprobe</w:t>
-      </w:r>
-    </w:p>
-    <w:p>
-      <w:r>
-        <w:t>After this project switch to the gearing/camming project</w:t>
-      </w:r>
-    </w:p>
-    <w:p>
-      <w:r>
-        <w:t xml:space="preserve">Registration Mark wiring: </w:t>
-      </w:r>
-      <w:r>
-        <w:tab/>
-      </w:r>
-      <w:r>
-        <w:t>Brown +</w:t>
+        <w:t>Registration Mark wiring</w:t>
+      </w:r>
+      <w:proofErr w:type="gramStart"/>
+      <w:r>
+        <w:t xml:space="preserve">: </w:t>
+      </w:r>
+      <w:r>
+        <w:tab/>
+      </w:r>
+      <w:r>
+        <w:t>Brown</w:t>
+      </w:r>
+      <w:proofErr w:type="gramEnd"/>
+      <w:r>
+        <w:t xml:space="preserve"> +</w:t>
       </w:r>
       <w:r>
         <w:t>24vdc, Blue 0vdc, white signal</w:t>
@@ -557,7 +844,15 @@
     </w:p>
     <w:p>
       <w:r>
-        <w:t xml:space="preserve">Get the system into the executing state and view the images that are taken.  You should see a lot of variance in the can position.  </w:t>
+        <w:t xml:space="preserve">Get the system into the executing state and view the images that are taken.  You should see a lot of </w:t>
+      </w:r>
+      <w:proofErr w:type="gramStart"/>
+      <w:r>
+        <w:t>variance</w:t>
+      </w:r>
+      <w:proofErr w:type="gramEnd"/>
+      <w:r>
+        <w:t xml:space="preserve"> in the can position.  </w:t>
       </w:r>
       <w:r>
         <w:t>The default settings spin the can at 500 degrees per second.  Increase this to 1000 degrees per second, then to 2000.  You should see that the error in the camera trigger timing is a function of speed (among other things).  Note for the sake of emphasis, the plc code is running at 100ms</w:t>
@@ -623,7 +918,15 @@
     </w:p>
     <w:p>
       <w:r>
-        <w:t xml:space="preserve">You have the change camera trigger settings in the configuration window as shown above to switch between software trigger (starter project) and ethercat </w:t>
+        <w:t xml:space="preserve">You have the change camera trigger settings in the configuration window as shown above to switch between software trigger (starter project) and </w:t>
+      </w:r>
+      <w:proofErr w:type="spellStart"/>
+      <w:r>
+        <w:t>ethercat</w:t>
+      </w:r>
+      <w:proofErr w:type="spellEnd"/>
+      <w:r>
+        <w:t xml:space="preserve"> </w:t>
       </w:r>
       <w:r>
         <w:t xml:space="preserve">timestamp </w:t>
@@ -638,7 +941,23 @@
     <w:p>
       <w:r>
         <w:lastRenderedPageBreak/>
-        <w:t>The XFC blocks are non-modulo.  Use the function MODTURNS in tc2_math to get the current number of turns of the axis based on the set position.  You can do some math with this value to determine a non-modulo target trigger position along with your capture angle.  You feed this position into the XFC block, but the XFC block outputs a 32 bit DC time, whereas the camera expects a 64 bit.  There’s a function in the XFC library to convert the 32 bit time to 64.</w:t>
+        <w:t xml:space="preserve">The XFC blocks are non-modulo.  Use the function MODTURNS in tc2_math to get the current number of turns of the axis based on the set position.  You can do some math with this value to determine a non-modulo target trigger position along with your capture angle.  You feed this position into the XFC block, but the XFC block outputs a </w:t>
+      </w:r>
+      <w:proofErr w:type="gramStart"/>
+      <w:r>
+        <w:t>32 bit</w:t>
+      </w:r>
+      <w:proofErr w:type="gramEnd"/>
+      <w:r>
+        <w:t xml:space="preserve"> DC time, whereas the camera expects a 64 bit.  There’s a function in the XFC library to convert the </w:t>
+      </w:r>
+      <w:proofErr w:type="gramStart"/>
+      <w:r>
+        <w:t>32 bit</w:t>
+      </w:r>
+      <w:proofErr w:type="gramEnd"/>
+      <w:r>
+        <w:t xml:space="preserve"> time to 64.</w:t>
       </w:r>
     </w:p>
     <w:p/>
@@ -647,16 +966,48 @@
         <w:t>After implementing this</w:t>
       </w:r>
       <w:r>
-        <w:t xml:space="preserve"> you should see very little jitter on the can position when the image is taken.  Force the speed to 2000 from default (500) and execution state back to 0, you will see can speed up.  If you didn’t configure the XFC block to account for acceleration you will see some misses while the axis accelerates, but when it gets to its new target velocity, it should be very close to the position the images were showing at 500 velocity.  I saw a small difference.  </w:t>
+        <w:t xml:space="preserve"> you should see very little jitter on the can position when the image is taken.  Force the speed to 2000 from default (500) and execution state back to 0, you will see can speed up.  If you didn’t configure the XFC block to account for acceleration you will see some misses while the axis accelerates, but when it gets to its new target velocity, it should be very close to the position the </w:t>
+      </w:r>
+      <w:proofErr w:type="gramStart"/>
+      <w:r>
+        <w:t>images were</w:t>
+      </w:r>
+      <w:proofErr w:type="gramEnd"/>
+      <w:r>
+        <w:t xml:space="preserve"> showing at 500 </w:t>
+      </w:r>
+      <w:proofErr w:type="gramStart"/>
+      <w:r>
+        <w:t>velocity</w:t>
+      </w:r>
+      <w:proofErr w:type="gramEnd"/>
+      <w:r>
+        <w:t xml:space="preserve">.  I saw a small difference.  </w:t>
       </w:r>
     </w:p>
     <w:p/>
     <w:p>
       <w:r>
-        <w:t>In your discussion at the end of the session discuss the fundamentals of the changes you made and your results.</w:t>
-      </w:r>
-      <w:r>
-        <w:t xml:space="preserve">  Try to get group discussion about how to further minimize difference of trigger positions and low and high velocities.</w:t>
+        <w:t xml:space="preserve">In your discussion at the end of the session </w:t>
+      </w:r>
+      <w:proofErr w:type="gramStart"/>
+      <w:r>
+        <w:t>discuss</w:t>
+      </w:r>
+      <w:proofErr w:type="gramEnd"/>
+      <w:r>
+        <w:t xml:space="preserve"> the fundamentals of the changes you made and your results.</w:t>
+      </w:r>
+      <w:r>
+        <w:t xml:space="preserve">  Try to get group discussion about how to further minimize </w:t>
+      </w:r>
+      <w:proofErr w:type="gramStart"/>
+      <w:r>
+        <w:t>difference</w:t>
+      </w:r>
+      <w:proofErr w:type="gramEnd"/>
+      <w:r>
+        <w:t xml:space="preserve"> of trigger positions and low and high velocities.</w:t>
       </w:r>
     </w:p>
     <w:p>
@@ -719,12 +1070,34 @@
     </w:p>
     <w:p>
       <w:r>
-        <w:t>This project has two opposing servo axes - one (axis #??) has a resolver and the other has an absolute encoder.</w:t>
-      </w:r>
-    </w:p>
-    <w:p>
-      <w:r>
-        <w:t xml:space="preserve">Scan in the AX5000 unit and the motors.  You’ll see only the channel B motor has an electronic nameplate.  Use drive manager 2 to select the motor for channel A.  </w:t>
+        <w:t xml:space="preserve">This project has two opposing servo axes </w:t>
+      </w:r>
+      <w:r>
+        <w:t xml:space="preserve">coupled together.  </w:t>
+      </w:r>
+      <w:r>
+        <w:t>We are going to control one in position mode and one in torque mode.</w:t>
+      </w:r>
+    </w:p>
+    <w:p>
+      <w:r>
+        <w:t xml:space="preserve">Scan in the AX5000 unit and the motors.  You’ll see only </w:t>
+      </w:r>
+      <w:proofErr w:type="gramStart"/>
+      <w:r>
+        <w:t>the channel</w:t>
+      </w:r>
+      <w:proofErr w:type="gramEnd"/>
+      <w:r>
+        <w:t xml:space="preserve"> B motor has an electronic nameplate.  Use </w:t>
+      </w:r>
+      <w:proofErr w:type="gramStart"/>
+      <w:r>
+        <w:t>drive manager</w:t>
+      </w:r>
+      <w:proofErr w:type="gramEnd"/>
+      <w:r>
+        <w:t xml:space="preserve"> 2 to select the motor for channel A.  </w:t>
       </w:r>
     </w:p>
     <w:p>
@@ -750,20 +1123,82 @@
         <w:t>s (one at a time with other disabled)</w:t>
       </w:r>
       <w:r>
-        <w:t xml:space="preserve"> to be pretty stiff.</w:t>
-      </w:r>
-    </w:p>
-    <w:p>
-      <w:r>
-        <w:t>The starter project enables “PositionAxis”, sets current position to 0, and stars a reversing sequence.  Ensure this is working before continuing on.</w:t>
-      </w:r>
-    </w:p>
-    <w:p>
-      <w:r>
-        <w:t>Now follow Matt Prellwitz’s guide on the wiki for MC_TorqueControl on an AX5000</w:t>
-      </w:r>
-      <w:r>
-        <w:t xml:space="preserve"> titled “AX5000 MC_TorqueControlSetup” and implement logic for “TorqueAxis” to apply a constant 0.1nm torque.</w:t>
+        <w:t xml:space="preserve"> to be </w:t>
+      </w:r>
+      <w:proofErr w:type="gramStart"/>
+      <w:r>
+        <w:t>pretty stiff</w:t>
+      </w:r>
+      <w:proofErr w:type="gramEnd"/>
+      <w:r>
+        <w:t>.</w:t>
+      </w:r>
+    </w:p>
+    <w:p>
+      <w:r>
+        <w:t xml:space="preserve">Now follow Matt Prellwitz’s guide on the wiki for </w:t>
+      </w:r>
+      <w:proofErr w:type="spellStart"/>
+      <w:r>
+        <w:t>MC_TorqueControl</w:t>
+      </w:r>
+      <w:proofErr w:type="spellEnd"/>
+      <w:r>
+        <w:t xml:space="preserve"> on an AX5000</w:t>
+      </w:r>
+      <w:r>
+        <w:t xml:space="preserve"> titled “AX5000 </w:t>
+      </w:r>
+      <w:proofErr w:type="spellStart"/>
+      <w:r>
+        <w:t>MC_TorqueControlSetup</w:t>
+      </w:r>
+      <w:proofErr w:type="spellEnd"/>
+      <w:r>
+        <w:t>” and implement logic for “</w:t>
+      </w:r>
+      <w:proofErr w:type="spellStart"/>
+      <w:r>
+        <w:t>TorqueAxis</w:t>
+      </w:r>
+      <w:proofErr w:type="spellEnd"/>
+      <w:r>
+        <w:t xml:space="preserve">” to apply a constant </w:t>
+      </w:r>
+      <w:r>
+        <w:t xml:space="preserve">0.12NM </w:t>
+      </w:r>
+      <w:r>
+        <w:t>torque.</w:t>
+      </w:r>
+      <w:r>
+        <w:t xml:space="preserve"> Additionally add logic to the relevant “acting states” for the </w:t>
+      </w:r>
+      <w:proofErr w:type="spellStart"/>
+      <w:r>
+        <w:t>TorqueAxis</w:t>
+      </w:r>
+      <w:proofErr w:type="spellEnd"/>
+      <w:r>
+        <w:t xml:space="preserve"> now.</w:t>
+      </w:r>
+    </w:p>
+    <w:p>
+      <w:r>
+        <w:t>Change the torque setpoint while the position axis is moving and scope the results.</w:t>
+      </w:r>
+    </w:p>
+    <w:p>
+      <w:r>
+        <w:t xml:space="preserve">Lastly, add logic in the executing sequence for manual mode, that simply disables the position axis.  You should see the torque axis accelerate to the velocity limit.  The torque </w:t>
+      </w:r>
+      <w:proofErr w:type="gramStart"/>
+      <w:r>
+        <w:t>has to</w:t>
+      </w:r>
+      <w:proofErr w:type="gramEnd"/>
+      <w:r>
+        <w:t xml:space="preserve"> be high enough to accelerate.</w:t>
       </w:r>
     </w:p>
     <w:p>
@@ -771,7 +1206,10 @@
         <w:t xml:space="preserve">For your presentation show how to change the operation mode programmatically </w:t>
       </w:r>
       <w:r>
-        <w:t>and things to look out for.  (Imagine this setup but the Position Axis faults, and the torque axis can now accelerate)</w:t>
+        <w:t>and things to look out for.  (Imagine this setup but the Position Axis faults</w:t>
+      </w:r>
+      <w:r>
+        <w:t xml:space="preserve"> on a real machine.  Is there a way to automatically fault the torque axis?)</w:t>
       </w:r>
     </w:p>
     <w:p>
@@ -782,7 +1220,15 @@
     <w:p>
       <w:r>
         <w:lastRenderedPageBreak/>
-        <w:t>Autotune – re-use matt prellwitz’s autotuning lab from NEM</w:t>
+        <w:t xml:space="preserve">Autotune – re-use matt </w:t>
+      </w:r>
+      <w:proofErr w:type="spellStart"/>
+      <w:r>
+        <w:t>prellwitz’s</w:t>
+      </w:r>
+      <w:proofErr w:type="spellEnd"/>
+      <w:r>
+        <w:t xml:space="preserve"> autotuning lab from NEM</w:t>
       </w:r>
       <w:r>
         <w:br/>
@@ -790,8 +1236,21 @@
     </w:p>
     <w:p/>
     <w:p>
-      <w:r>
-        <w:t xml:space="preserve">Ballscrew – Nick making a lab with ax8000, ballscrew, </w:t>
+      <w:proofErr w:type="spellStart"/>
+      <w:r>
+        <w:t>Ballscrew</w:t>
+      </w:r>
+      <w:proofErr w:type="spellEnd"/>
+      <w:r>
+        <w:t xml:space="preserve"> – Nick making a lab with ax8000, </w:t>
+      </w:r>
+      <w:proofErr w:type="spellStart"/>
+      <w:r>
+        <w:t>ballscrew</w:t>
+      </w:r>
+      <w:proofErr w:type="spellEnd"/>
+      <w:r>
+        <w:t xml:space="preserve">, </w:t>
       </w:r>
       <w:r>
         <w:t>limit switches</w:t>

</xml_diff>

<commit_message>
Added autotuning demo starter project
</commit_message>
<xml_diff>
--- a/Instructions.docx
+++ b/Instructions.docx
@@ -26,50 +26,20 @@
       </w:pPr>
     </w:p>
     <w:p>
-      <w:proofErr w:type="gramStart"/>
-      <w:r>
-        <w:rPr>
-          <w:b/>
-          <w:bCs/>
-        </w:rPr>
-        <w:t>Requirements :</w:t>
-      </w:r>
-      <w:proofErr w:type="gramEnd"/>
-      <w:r>
-        <w:rPr>
-          <w:b/>
-          <w:bCs/>
-        </w:rPr>
-        <w:t xml:space="preserve"> new TC 4026, PTP and advanced motion pack, drive manager 2, scope, vision</w:t>
-      </w:r>
-    </w:p>
-    <w:p>
-      <w:r>
-        <w:t xml:space="preserve">A sample project is provided that includes a generic SPT framework structure with a machine module implemented and </w:t>
-      </w:r>
-      <w:proofErr w:type="spellStart"/>
-      <w:r>
-        <w:t>visu</w:t>
-      </w:r>
-      <w:proofErr w:type="spellEnd"/>
-      <w:r>
-        <w:t xml:space="preserve"> interface.  </w:t>
-      </w:r>
-      <w:proofErr w:type="spellStart"/>
-      <w:r>
-        <w:t>Hardare</w:t>
-      </w:r>
-      <w:proofErr w:type="spellEnd"/>
-      <w:r>
-        <w:t xml:space="preserve"> is scanned in, and </w:t>
-      </w:r>
-      <w:proofErr w:type="spellStart"/>
-      <w:r>
-        <w:t>twinsafe</w:t>
-      </w:r>
-      <w:proofErr w:type="spellEnd"/>
-      <w:r>
-        <w:t xml:space="preserve"> is set up but you will need to use drive manager to configure the axes to do your project.  </w:t>
+      <w:r>
+        <w:rPr>
+          <w:b/>
+          <w:bCs/>
+        </w:rPr>
+        <w:t>Requirements : new TC 4026, PTP and advanced motion pack, drive manager 2, scope, vision</w:t>
+      </w:r>
+    </w:p>
+    <w:p>
+      <w:r>
+        <w:t xml:space="preserve">A sample project is provided that includes a generic SPT framework structure with a machine module implemented and visu interface.  </w:t>
+      </w:r>
+      <w:r>
+        <w:t xml:space="preserve">Hardare is scanned in, and twinsafe is set up but you will need to use drive manager to configure the axes to do your project.  </w:t>
       </w:r>
       <w:r>
         <w:t xml:space="preserve">The goal is to </w:t>
@@ -81,15 +51,7 @@
         <w:t xml:space="preserve">equipment module </w:t>
       </w:r>
       <w:r>
-        <w:t xml:space="preserve">in your start project and add functionality to accomplish your project goals.  Each project already has a machine module with </w:t>
-      </w:r>
-      <w:proofErr w:type="spellStart"/>
-      <w:r>
-        <w:t>visu</w:t>
-      </w:r>
-      <w:proofErr w:type="spellEnd"/>
-      <w:r>
-        <w:t xml:space="preserve"> interface connected, and an equipment module</w:t>
+        <w:t>in your start project and add functionality to accomplish your project goals.  Each project already has a machine module with visu interface connected, and an equipment module</w:t>
       </w:r>
       <w:r>
         <w:t xml:space="preserve"> </w:t>
@@ -117,15 +79,7 @@
         <w:t>SECOND</w:t>
       </w:r>
       <w:r>
-        <w:t xml:space="preserve"> lab they did.  Explain the project, the steps you </w:t>
-      </w:r>
-      <w:proofErr w:type="gramStart"/>
-      <w:r>
-        <w:t>did</w:t>
-      </w:r>
-      <w:proofErr w:type="gramEnd"/>
-      <w:r>
-        <w:t xml:space="preserve"> to make it work, and try to elicit a conversation about the topic for everyone to discuss (as a group) more intricate details of the topics.  i.e. inner workings of the advanced homing library (for rack and pinion project), or the time base of the XFC output for the vision lab.</w:t>
+        <w:t xml:space="preserve"> lab they did.  Explain the project, the steps you did to make it work, and try to elicit a conversation about the topic for everyone to discuss (as a group) more intricate details of the topics.  i.e. inner workings of the advanced homing library (for rack and pinion project), or the time base of the XFC output for the vision lab.</w:t>
       </w:r>
     </w:p>
     <w:p>
@@ -140,73 +94,49 @@
           <w:b/>
           <w:bCs/>
         </w:rPr>
-        <w:t xml:space="preserve">Rack and </w:t>
-      </w:r>
-      <w:proofErr w:type="gramStart"/>
-      <w:r>
-        <w:rPr>
-          <w:b/>
-          <w:bCs/>
-        </w:rPr>
-        <w:t>pinion</w:t>
-      </w:r>
-      <w:proofErr w:type="gramEnd"/>
-      <w:r>
-        <w:rPr>
-          <w:b/>
-          <w:bCs/>
-        </w:rPr>
-        <w:t xml:space="preserve"> - Hardware Kit A</w:t>
-      </w:r>
-      <w:r>
-        <w:rPr>
-          <w:b/>
-          <w:bCs/>
-        </w:rPr>
-        <w:tab/>
-      </w:r>
-      <w:r>
-        <w:rPr>
-          <w:b/>
-          <w:bCs/>
-        </w:rPr>
-        <w:tab/>
-      </w:r>
-      <w:r>
-        <w:rPr>
-          <w:b/>
-          <w:bCs/>
-        </w:rPr>
-        <w:tab/>
-      </w:r>
-      <w:r>
-        <w:rPr>
-          <w:b/>
-          <w:bCs/>
-        </w:rPr>
-        <w:tab/>
-      </w:r>
-      <w:r>
-        <w:rPr>
-          <w:b/>
-          <w:bCs/>
-        </w:rPr>
-        <w:tab/>
-      </w:r>
-      <w:r>
-        <w:rPr>
-          <w:b/>
-          <w:bCs/>
-        </w:rPr>
-        <w:tab/>
-      </w:r>
-      <w:r>
-        <w:rPr>
-          <w:b/>
-          <w:bCs/>
-        </w:rPr>
-        <w:tab/>
-        <w:t>DHCP</w:t>
+        <w:t>Rack and pinion</w:t>
+      </w:r>
+      <w:r>
+        <w:rPr>
+          <w:b/>
+          <w:bCs/>
+        </w:rPr>
+        <w:tab/>
+      </w:r>
+      <w:r>
+        <w:rPr>
+          <w:b/>
+          <w:bCs/>
+        </w:rPr>
+        <w:tab/>
+      </w:r>
+      <w:r>
+        <w:rPr>
+          <w:b/>
+          <w:bCs/>
+        </w:rPr>
+        <w:tab/>
+      </w:r>
+      <w:r>
+        <w:rPr>
+          <w:b/>
+          <w:bCs/>
+        </w:rPr>
+        <w:tab/>
+      </w:r>
+      <w:r>
+        <w:rPr>
+          <w:b/>
+          <w:bCs/>
+        </w:rPr>
+        <w:tab/>
+      </w:r>
+      <w:r>
+        <w:rPr>
+          <w:b/>
+          <w:bCs/>
+        </w:rPr>
+        <w:tab/>
       </w:r>
     </w:p>
     <w:p>
@@ -225,15 +155,7 @@
       </w:r>
       <w:r>
         <w:br/>
-        <w:t>Accel/</w:t>
-      </w:r>
-      <w:proofErr w:type="spellStart"/>
-      <w:r>
-        <w:t>Decel</w:t>
-      </w:r>
-      <w:proofErr w:type="spellEnd"/>
-      <w:r>
-        <w:t xml:space="preserve"> 1,000 mm/s</w:t>
+        <w:t>Accel/Decel 1,000 mm/s</w:t>
       </w:r>
       <w:r>
         <w:br/>
@@ -242,23 +164,7 @@
     </w:p>
     <w:p>
       <w:r>
-        <w:t xml:space="preserve">Write </w:t>
-      </w:r>
-      <w:proofErr w:type="gramStart"/>
-      <w:r>
-        <w:t>homing</w:t>
-      </w:r>
-      <w:proofErr w:type="gramEnd"/>
-      <w:r>
-        <w:t xml:space="preserve"> routines that implement </w:t>
-      </w:r>
-      <w:proofErr w:type="spellStart"/>
-      <w:r>
-        <w:t>I_MotionSequence</w:t>
-      </w:r>
-      <w:proofErr w:type="spellEnd"/>
-      <w:r>
-        <w:t xml:space="preserve"> according to the SPT documentation to home each axis.  The left servo homes to a home switch at position </w:t>
+        <w:t xml:space="preserve">Write homing routines that implement I_MotionSequence according to the SPT documentation to home each axis.  The left servo homes to a home switch at position </w:t>
       </w:r>
       <w:r>
         <w:rPr>
@@ -288,23 +194,7 @@
         <w:t>50%</w:t>
       </w:r>
       <w:r>
-        <w:t>.  Use 50mm/s for the homing velocity for both methods, accel/</w:t>
-      </w:r>
-      <w:proofErr w:type="spellStart"/>
-      <w:r>
-        <w:t>decel</w:t>
-      </w:r>
-      <w:proofErr w:type="spellEnd"/>
-      <w:r>
-        <w:t xml:space="preserve"> of 1k, and jerk of 10k. Follow the SPT motion documentation to create a homing routine that implements </w:t>
-      </w:r>
-      <w:proofErr w:type="spellStart"/>
-      <w:r>
-        <w:t>I_MotionSequence</w:t>
-      </w:r>
-      <w:proofErr w:type="spellEnd"/>
-      <w:r>
-        <w:t xml:space="preserve"> to complete the homing process and then trigger the homing in </w:t>
+        <w:t xml:space="preserve">.  Use 50mm/s for the homing velocity for both methods, accel/decel of 1k, and jerk of 10k. Follow the SPT motion documentation to create a homing routine that implements I_MotionSequence to complete the homing process and then trigger the homing in </w:t>
       </w:r>
       <w:r>
         <w:t>starting</w:t>
@@ -326,38 +216,14 @@
     </w:p>
     <w:p>
       <w:r>
-        <w:t xml:space="preserve">After this </w:t>
-      </w:r>
-      <w:proofErr w:type="gramStart"/>
-      <w:r>
-        <w:t>project</w:t>
-      </w:r>
-      <w:proofErr w:type="gramEnd"/>
-      <w:r>
-        <w:t xml:space="preserve"> swap to the </w:t>
-      </w:r>
-      <w:proofErr w:type="spellStart"/>
-      <w:r>
-        <w:t>ballscrew</w:t>
-      </w:r>
-      <w:proofErr w:type="spellEnd"/>
-      <w:r>
-        <w:t xml:space="preserve"> project.</w:t>
-      </w:r>
-      <w:r>
-        <w:br/>
-      </w:r>
-      <w:r>
-        <w:br/>
-        <w:t xml:space="preserve">For your presentation, show the axis configuration for homing settings, when to use </w:t>
-      </w:r>
-      <w:proofErr w:type="spellStart"/>
-      <w:r>
-        <w:t>MC_Home</w:t>
-      </w:r>
-      <w:proofErr w:type="spellEnd"/>
-      <w:r>
-        <w:t xml:space="preserve"> vs the advanced homing library, and the difference between collision avoidance modes.</w:t>
+        <w:t>After this project swap to the ballscrew project.</w:t>
+      </w:r>
+      <w:r>
+        <w:br/>
+      </w:r>
+      <w:r>
+        <w:br/>
+        <w:t>For your presentation, show the axis configuration for homing settings, when to use MC_Home vs the advanced homing library, and the difference between collision avoidance modes.</w:t>
       </w:r>
     </w:p>
     <w:p>
@@ -377,52 +243,28 @@
           <w:bCs/>
         </w:rPr>
         <w:lastRenderedPageBreak/>
-        <w:t xml:space="preserve">Gearing/Camming - Hardware Kit </w:t>
-      </w:r>
-      <w:proofErr w:type="gramStart"/>
-      <w:r>
-        <w:rPr>
-          <w:b/>
-          <w:bCs/>
-        </w:rPr>
-        <w:t>A</w:t>
-      </w:r>
-      <w:proofErr w:type="gramEnd"/>
-      <w:r>
-        <w:rPr>
-          <w:b/>
-          <w:bCs/>
-        </w:rPr>
-        <w:tab/>
-      </w:r>
-      <w:r>
-        <w:rPr>
-          <w:b/>
-          <w:bCs/>
-        </w:rPr>
-        <w:tab/>
-      </w:r>
-      <w:r>
-        <w:rPr>
-          <w:b/>
-          <w:bCs/>
-        </w:rPr>
-        <w:tab/>
-      </w:r>
-      <w:r>
-        <w:rPr>
-          <w:b/>
-          <w:bCs/>
-        </w:rPr>
-        <w:tab/>
-      </w:r>
-      <w:r>
-        <w:rPr>
-          <w:b/>
-          <w:bCs/>
-        </w:rPr>
-        <w:tab/>
-        <w:t>IP 192.158.10.100</w:t>
+        <w:t>Gearing/Camming</w:t>
+      </w:r>
+      <w:r>
+        <w:rPr>
+          <w:b/>
+          <w:bCs/>
+        </w:rPr>
+        <w:tab/>
+      </w:r>
+      <w:r>
+        <w:rPr>
+          <w:b/>
+          <w:bCs/>
+        </w:rPr>
+        <w:tab/>
+      </w:r>
+      <w:r>
+        <w:rPr>
+          <w:b/>
+          <w:bCs/>
+        </w:rPr>
+        <w:tab/>
       </w:r>
     </w:p>
     <w:p>
@@ -437,15 +279,7 @@
     </w:p>
     <w:p>
       <w:r>
-        <w:t>Download the SPT camming example and copy the "</w:t>
-      </w:r>
-      <w:proofErr w:type="spellStart"/>
-      <w:r>
-        <w:t>CamModule_UpdateTable</w:t>
-      </w:r>
-      <w:proofErr w:type="spellEnd"/>
-      <w:r>
-        <w:t>" folder into our project.</w:t>
+        <w:t>Download the SPT camming example and copy the "CamModule_UpdateTable" folder into our project.</w:t>
       </w:r>
       <w:r>
         <w:br/>
@@ -460,100 +294,23 @@
     </w:p>
     <w:p>
       <w:r>
-        <w:t>Either create a cam table or edit the "</w:t>
-      </w:r>
-      <w:proofErr w:type="spellStart"/>
-      <w:r>
-        <w:t>WriteCamParameters</w:t>
-      </w:r>
-      <w:proofErr w:type="spellEnd"/>
-      <w:r>
-        <w:t xml:space="preserve">" methods to create a cam that advances the cam slave axis one "pocket" every </w:t>
-      </w:r>
-      <w:proofErr w:type="gramStart"/>
-      <w:r>
-        <w:t>180 degree</w:t>
-      </w:r>
-      <w:proofErr w:type="gramEnd"/>
-      <w:r>
-        <w:t xml:space="preserve"> rotation.  The top gear has 20 pockets and both axes are the same diameter - use this to calculate the angular length of the synchronous zone.  I </w:t>
-      </w:r>
-      <w:proofErr w:type="gramStart"/>
-      <w:r>
-        <w:t>wasn't able to</w:t>
-      </w:r>
-      <w:proofErr w:type="gramEnd"/>
-      <w:r>
-        <w:t xml:space="preserve"> figure out how to get the </w:t>
-      </w:r>
-      <w:proofErr w:type="spellStart"/>
-      <w:r>
-        <w:t>CamSlave</w:t>
-      </w:r>
-      <w:proofErr w:type="spellEnd"/>
-      <w:r>
-        <w:t xml:space="preserve"> FB to use a cam table from the NC, </w:t>
-      </w:r>
-      <w:proofErr w:type="gramStart"/>
-      <w:r>
-        <w:t>so</w:t>
-      </w:r>
-      <w:proofErr w:type="gramEnd"/>
-      <w:r>
-        <w:t xml:space="preserve"> not sure if it's possible</w:t>
-      </w:r>
-    </w:p>
-    <w:p>
-      <w:r>
-        <w:t xml:space="preserve">Hints for editing </w:t>
-      </w:r>
-      <w:proofErr w:type="spellStart"/>
-      <w:r>
-        <w:t>WriteCamParameters</w:t>
-      </w:r>
-      <w:proofErr w:type="spellEnd"/>
+        <w:t>Either create a cam table or edit the "WriteCamParameters" methods to create a cam that advances the cam slave axis one "pocket" every 180 degree rotation.  The top gear has 20 pockets and both axes are the same diameter - use this to calculate the angular length of the synchronous zone.  I wasn't able to figure out how to get the CamSlave FB to use a cam table from the NC, so not sure if it's possible</w:t>
+      </w:r>
+    </w:p>
+    <w:p>
+      <w:r>
+        <w:t>Hints for editing WriteCamParameters</w:t>
+      </w:r>
       <w:r>
         <w:t xml:space="preserve"> - </w:t>
       </w:r>
       <w:r>
-        <w:t xml:space="preserve">See </w:t>
-      </w:r>
-      <w:proofErr w:type="spellStart"/>
-      <w:r>
-        <w:t>infosys</w:t>
-      </w:r>
-      <w:proofErr w:type="spellEnd"/>
-      <w:r>
-        <w:t xml:space="preserve"> "</w:t>
-      </w:r>
-      <w:proofErr w:type="spellStart"/>
-      <w:r>
-        <w:t>MC_MotionFunctionType</w:t>
-      </w:r>
-      <w:proofErr w:type="spellEnd"/>
-      <w:r>
-        <w:t xml:space="preserve">" </w:t>
-      </w:r>
-    </w:p>
-    <w:p>
-      <w:r>
-        <w:t xml:space="preserve">"Upload Cam" into cam table to see position, velocity, accel </w:t>
-      </w:r>
-      <w:proofErr w:type="spellStart"/>
-      <w:r>
-        <w:t>etc</w:t>
-      </w:r>
-      <w:proofErr w:type="spellEnd"/>
-      <w:r>
-        <w:t xml:space="preserve"> comparisons to see if you made the </w:t>
-      </w:r>
-      <w:proofErr w:type="gramStart"/>
-      <w:r>
-        <w:t>table</w:t>
-      </w:r>
-      <w:proofErr w:type="gramEnd"/>
-      <w:r>
-        <w:t xml:space="preserve"> you think you did.</w:t>
+        <w:t xml:space="preserve">See infosys "MC_MotionFunctionType" </w:t>
+      </w:r>
+    </w:p>
+    <w:p>
+      <w:r>
+        <w:t>"Upload Cam" into cam table to see position, velocity, accel etc comparisons to see if you made the table you think you did.</w:t>
       </w:r>
     </w:p>
     <w:p>
@@ -563,49 +320,17 @@
     </w:p>
     <w:p>
       <w:r>
-        <w:t xml:space="preserve">If you have extra time, edit the </w:t>
-      </w:r>
-      <w:proofErr w:type="spellStart"/>
-      <w:r>
-        <w:t>CamModule</w:t>
-      </w:r>
-      <w:proofErr w:type="spellEnd"/>
-      <w:r>
-        <w:t xml:space="preserve"> to change functionality depending on machine mode.  If in maintenance mode, have it gear in instead of running a cam.  </w:t>
-      </w:r>
-    </w:p>
-    <w:p>
-      <w:r>
-        <w:t xml:space="preserve">After this project </w:t>
-      </w:r>
-      <w:proofErr w:type="gramStart"/>
-      <w:r>
-        <w:t>swap to</w:t>
-      </w:r>
-      <w:proofErr w:type="gramEnd"/>
-      <w:r>
-        <w:t xml:space="preserve"> the belt indexing project.</w:t>
-      </w:r>
-    </w:p>
-    <w:p>
-      <w:r>
-        <w:t xml:space="preserve">For your presentation, discuss where to save the NC offset (drive or encoder?) and the cam table you created or the edits </w:t>
-      </w:r>
-      <w:proofErr w:type="gramStart"/>
-      <w:r>
-        <w:t>you  made</w:t>
-      </w:r>
-      <w:proofErr w:type="gramEnd"/>
-      <w:r>
-        <w:t xml:space="preserve"> to the "</w:t>
-      </w:r>
-      <w:proofErr w:type="spellStart"/>
-      <w:r>
-        <w:t>WriteCamParameters</w:t>
-      </w:r>
-      <w:proofErr w:type="spellEnd"/>
-      <w:r>
-        <w:t>" methods and show it running with the middle inserts in place if you got that far</w:t>
+        <w:t xml:space="preserve">If you have extra time, edit the CamModule to change functionality depending on machine mode.  If in maintenance mode, have it gear in instead of running a cam.  </w:t>
+      </w:r>
+    </w:p>
+    <w:p>
+      <w:r>
+        <w:t>After this project swap to the belt indexing project.</w:t>
+      </w:r>
+    </w:p>
+    <w:p>
+      <w:r>
+        <w:t>For your presentation, discuss where to save the NC offset (drive or encoder?) and the cam table you created or the edits you  made to the "WriteCamParameters" methods and show it running with the middle inserts in place if you got that far</w:t>
       </w:r>
     </w:p>
     <w:p>
@@ -625,52 +350,28 @@
           <w:bCs/>
         </w:rPr>
         <w:lastRenderedPageBreak/>
-        <w:t xml:space="preserve">Indexing to Drive Input - Hardware Kit </w:t>
-      </w:r>
-      <w:proofErr w:type="gramStart"/>
-      <w:r>
-        <w:rPr>
-          <w:b/>
-          <w:bCs/>
-        </w:rPr>
-        <w:t>A</w:t>
-      </w:r>
-      <w:proofErr w:type="gramEnd"/>
-      <w:r>
-        <w:rPr>
-          <w:b/>
-          <w:bCs/>
-        </w:rPr>
-        <w:tab/>
-      </w:r>
-      <w:r>
-        <w:rPr>
-          <w:b/>
-          <w:bCs/>
-        </w:rPr>
-        <w:tab/>
-      </w:r>
-      <w:r>
-        <w:rPr>
-          <w:b/>
-          <w:bCs/>
-        </w:rPr>
-        <w:tab/>
-      </w:r>
-      <w:r>
-        <w:rPr>
-          <w:b/>
-          <w:bCs/>
-        </w:rPr>
-        <w:tab/>
-      </w:r>
-      <w:r>
-        <w:rPr>
-          <w:b/>
-          <w:bCs/>
-        </w:rPr>
-        <w:tab/>
-        <w:t>IP 192.168.10.100</w:t>
+        <w:t>Indexing to Drive Input</w:t>
+      </w:r>
+      <w:r>
+        <w:rPr>
+          <w:b/>
+          <w:bCs/>
+        </w:rPr>
+        <w:tab/>
+      </w:r>
+      <w:r>
+        <w:rPr>
+          <w:b/>
+          <w:bCs/>
+        </w:rPr>
+        <w:tab/>
+      </w:r>
+      <w:r>
+        <w:rPr>
+          <w:b/>
+          <w:bCs/>
+        </w:rPr>
+        <w:tab/>
       </w:r>
     </w:p>
     <w:p>
@@ -680,23 +381,7 @@
     </w:p>
     <w:p>
       <w:r>
-        <w:t xml:space="preserve">The belt is a timing belt with 5mm pitch between teeth.  The belt pulleys have 24 </w:t>
-      </w:r>
-      <w:proofErr w:type="gramStart"/>
-      <w:r>
-        <w:t>teeth</w:t>
-      </w:r>
-      <w:proofErr w:type="gramEnd"/>
-      <w:r>
-        <w:t xml:space="preserve"> and the gear ratio of the gears is 2:1 (2 rotations of the motor = 1 rotation of the pulley).  The belt has 120 teeth.  There is a 420mm offset from the registration mark sensor to the marks to index </w:t>
-      </w:r>
-      <w:proofErr w:type="gramStart"/>
-      <w:r>
-        <w:t>to</w:t>
-      </w:r>
-      <w:proofErr w:type="gramEnd"/>
-      <w:r>
-        <w:t xml:space="preserve">. </w:t>
+        <w:t xml:space="preserve">The belt is a timing belt with 5mm pitch between teeth.  The belt pulleys have 24 teeth and the gear ratio of the gears is 2:1 (2 rotations of the motor = 1 rotation of the pulley).  The belt has 120 teeth.  There is a 420mm offset from the registration mark sensor to the marks to index to. </w:t>
       </w:r>
       <w:r>
         <w:br/>
@@ -708,15 +393,7 @@
     </w:p>
     <w:p>
       <w:r>
-        <w:t xml:space="preserve">In the running routine, move in the positive direction, where the belt side facing you is moving upwards, at 250mm/s.  Notice in the </w:t>
-      </w:r>
-      <w:proofErr w:type="gramStart"/>
-      <w:r>
-        <w:t>execute</w:t>
-      </w:r>
-      <w:proofErr w:type="gramEnd"/>
-      <w:r>
-        <w:t xml:space="preserve"> routine there is already logic for buffering the registration mark positions.  You must configure the drive inputs and add </w:t>
+        <w:t xml:space="preserve">In the running routine, move in the positive direction, where the belt side facing you is moving upwards, at 250mm/s.  Notice in the execute routine there is already logic for buffering the registration mark positions.  You must configure the drive inputs and add </w:t>
       </w:r>
       <w:r>
         <w:t>touch probe functionality to buffer the positions and index to them.</w:t>
@@ -729,21 +406,13 @@
     </w:p>
     <w:p>
       <w:r>
-        <w:t>Registration Mark wiring</w:t>
-      </w:r>
-      <w:proofErr w:type="gramStart"/>
-      <w:r>
-        <w:t xml:space="preserve">: </w:t>
-      </w:r>
-      <w:r>
-        <w:tab/>
-      </w:r>
-      <w:r>
-        <w:t>Brown</w:t>
-      </w:r>
-      <w:proofErr w:type="gramEnd"/>
-      <w:r>
-        <w:t xml:space="preserve"> +</w:t>
+        <w:t xml:space="preserve">Registration Mark wiring: </w:t>
+      </w:r>
+      <w:r>
+        <w:tab/>
+      </w:r>
+      <w:r>
+        <w:t>Brown +</w:t>
       </w:r>
       <w:r>
         <w:t>24vdc, Blue 0vdc, white signal</w:t>
@@ -831,7 +500,6 @@
           <w:bCs/>
         </w:rPr>
         <w:tab/>
-        <w:t>DHCP</w:t>
       </w:r>
     </w:p>
     <w:p>
@@ -844,15 +512,7 @@
     </w:p>
     <w:p>
       <w:r>
-        <w:t xml:space="preserve">Get the system into the executing state and view the images that are taken.  You should see a lot of </w:t>
-      </w:r>
-      <w:proofErr w:type="gramStart"/>
-      <w:r>
-        <w:t>variance</w:t>
-      </w:r>
-      <w:proofErr w:type="gramEnd"/>
-      <w:r>
-        <w:t xml:space="preserve"> in the can position.  </w:t>
+        <w:t xml:space="preserve">Get the system into the executing state and view the images that are taken.  You should see a lot of variance in the can position.  </w:t>
       </w:r>
       <w:r>
         <w:t>The default settings spin the can at 500 degrees per second.  Increase this to 1000 degrees per second, then to 2000.  You should see that the error in the camera trigger timing is a function of speed (among other things).  Note for the sake of emphasis, the plc code is running at 100ms</w:t>
@@ -918,15 +578,7 @@
     </w:p>
     <w:p>
       <w:r>
-        <w:t xml:space="preserve">You have the change camera trigger settings in the configuration window as shown above to switch between software trigger (starter project) and </w:t>
-      </w:r>
-      <w:proofErr w:type="spellStart"/>
-      <w:r>
-        <w:t>ethercat</w:t>
-      </w:r>
-      <w:proofErr w:type="spellEnd"/>
-      <w:r>
-        <w:t xml:space="preserve"> </w:t>
+        <w:t xml:space="preserve">You have the change camera trigger settings in the configuration window as shown above to switch between software trigger (starter project) and ethercat </w:t>
       </w:r>
       <w:r>
         <w:t xml:space="preserve">timestamp </w:t>
@@ -941,23 +593,7 @@
     <w:p>
       <w:r>
         <w:lastRenderedPageBreak/>
-        <w:t xml:space="preserve">The XFC blocks are non-modulo.  Use the function MODTURNS in tc2_math to get the current number of turns of the axis based on the set position.  You can do some math with this value to determine a non-modulo target trigger position along with your capture angle.  You feed this position into the XFC block, but the XFC block outputs a </w:t>
-      </w:r>
-      <w:proofErr w:type="gramStart"/>
-      <w:r>
-        <w:t>32 bit</w:t>
-      </w:r>
-      <w:proofErr w:type="gramEnd"/>
-      <w:r>
-        <w:t xml:space="preserve"> DC time, whereas the camera expects a 64 bit.  There’s a function in the XFC library to convert the </w:t>
-      </w:r>
-      <w:proofErr w:type="gramStart"/>
-      <w:r>
-        <w:t>32 bit</w:t>
-      </w:r>
-      <w:proofErr w:type="gramEnd"/>
-      <w:r>
-        <w:t xml:space="preserve"> time to 64.</w:t>
+        <w:t>The XFC blocks are non-modulo.  Use the function MODTURNS in tc2_math to get the current number of turns of the axis based on the set position.  You can do some math with this value to determine a non-modulo target trigger position along with your capture angle.  You feed this position into the XFC block, but the XFC block outputs a 32 bit DC time, whereas the camera expects a 64 bit.  There’s a function in the XFC library to convert the 32 bit time to 64.</w:t>
       </w:r>
     </w:p>
     <w:p/>
@@ -966,48 +602,16 @@
         <w:t>After implementing this</w:t>
       </w:r>
       <w:r>
-        <w:t xml:space="preserve"> you should see very little jitter on the can position when the image is taken.  Force the speed to 2000 from default (500) and execution state back to 0, you will see can speed up.  If you didn’t configure the XFC block to account for acceleration you will see some misses while the axis accelerates, but when it gets to its new target velocity, it should be very close to the position the </w:t>
-      </w:r>
-      <w:proofErr w:type="gramStart"/>
-      <w:r>
-        <w:t>images were</w:t>
-      </w:r>
-      <w:proofErr w:type="gramEnd"/>
-      <w:r>
-        <w:t xml:space="preserve"> showing at 500 </w:t>
-      </w:r>
-      <w:proofErr w:type="gramStart"/>
-      <w:r>
-        <w:t>velocity</w:t>
-      </w:r>
-      <w:proofErr w:type="gramEnd"/>
-      <w:r>
-        <w:t xml:space="preserve">.  I saw a small difference.  </w:t>
+        <w:t xml:space="preserve"> you should see very little jitter on the can position when the image is taken.  Force the speed to 2000 from default (500) and execution state back to 0, you will see can speed up.  If you didn’t configure the XFC block to account for acceleration you will see some misses while the axis accelerates, but when it gets to its new target velocity, it should be very close to the position the images were showing at 500 velocity.  I saw a small difference.  </w:t>
       </w:r>
     </w:p>
     <w:p/>
     <w:p>
       <w:r>
-        <w:t xml:space="preserve">In your discussion at the end of the session </w:t>
-      </w:r>
-      <w:proofErr w:type="gramStart"/>
-      <w:r>
-        <w:t>discuss</w:t>
-      </w:r>
-      <w:proofErr w:type="gramEnd"/>
-      <w:r>
-        <w:t xml:space="preserve"> the fundamentals of the changes you made and your results.</w:t>
-      </w:r>
-      <w:r>
-        <w:t xml:space="preserve">  Try to get group discussion about how to further minimize </w:t>
-      </w:r>
-      <w:proofErr w:type="gramStart"/>
-      <w:r>
-        <w:t>difference</w:t>
-      </w:r>
-      <w:proofErr w:type="gramEnd"/>
-      <w:r>
-        <w:t xml:space="preserve"> of trigger positions and low and high velocities.</w:t>
+        <w:t>In your discussion at the end of the session discuss the fundamentals of the changes you made and your results.</w:t>
+      </w:r>
+      <w:r>
+        <w:t xml:space="preserve">  Try to get group discussion about how to further minimize difference of trigger positions and low and high velocities.</w:t>
       </w:r>
     </w:p>
     <w:p>
@@ -1022,50 +626,42 @@
           <w:bCs/>
         </w:rPr>
         <w:lastRenderedPageBreak/>
-        <w:t>Dual Axis Opposing Motion - Hardware Kit B</w:t>
-      </w:r>
-      <w:r>
-        <w:rPr>
-          <w:b/>
-          <w:bCs/>
-        </w:rPr>
-        <w:tab/>
-      </w:r>
-      <w:r>
-        <w:rPr>
-          <w:b/>
-          <w:bCs/>
-        </w:rPr>
-        <w:tab/>
-      </w:r>
-      <w:r>
-        <w:rPr>
-          <w:b/>
-          <w:bCs/>
-        </w:rPr>
-        <w:tab/>
-      </w:r>
-      <w:r>
-        <w:rPr>
-          <w:b/>
-          <w:bCs/>
-        </w:rPr>
-        <w:tab/>
-      </w:r>
-      <w:r>
-        <w:rPr>
-          <w:b/>
-          <w:bCs/>
-        </w:rPr>
-        <w:tab/>
-      </w:r>
-      <w:r>
-        <w:rPr>
-          <w:b/>
-          <w:bCs/>
-        </w:rPr>
-        <w:tab/>
-        <w:t>DHCP</w:t>
+        <w:t>Dual Axis Opposing Motion</w:t>
+      </w:r>
+      <w:r>
+        <w:rPr>
+          <w:b/>
+          <w:bCs/>
+        </w:rPr>
+        <w:tab/>
+      </w:r>
+      <w:r>
+        <w:rPr>
+          <w:b/>
+          <w:bCs/>
+        </w:rPr>
+        <w:tab/>
+      </w:r>
+      <w:r>
+        <w:rPr>
+          <w:b/>
+          <w:bCs/>
+        </w:rPr>
+        <w:tab/>
+      </w:r>
+      <w:r>
+        <w:rPr>
+          <w:b/>
+          <w:bCs/>
+        </w:rPr>
+        <w:tab/>
+      </w:r>
+      <w:r>
+        <w:rPr>
+          <w:b/>
+          <w:bCs/>
+        </w:rPr>
+        <w:tab/>
       </w:r>
     </w:p>
     <w:p>
@@ -1081,23 +677,7 @@
     </w:p>
     <w:p>
       <w:r>
-        <w:t xml:space="preserve">Scan in the AX5000 unit and the motors.  You’ll see only </w:t>
-      </w:r>
-      <w:proofErr w:type="gramStart"/>
-      <w:r>
-        <w:t>the channel</w:t>
-      </w:r>
-      <w:proofErr w:type="gramEnd"/>
-      <w:r>
-        <w:t xml:space="preserve"> B motor has an electronic nameplate.  Use </w:t>
-      </w:r>
-      <w:proofErr w:type="gramStart"/>
-      <w:r>
-        <w:t>drive manager</w:t>
-      </w:r>
-      <w:proofErr w:type="gramEnd"/>
-      <w:r>
-        <w:t xml:space="preserve"> 2 to select the motor for channel A.  </w:t>
+        <w:t xml:space="preserve">Scan in the AX5000 unit and the motors.  You’ll see only the channel B motor has an electronic nameplate.  Use drive manager 2 to select the motor for channel A.  </w:t>
       </w:r>
     </w:p>
     <w:p>
@@ -1123,47 +703,15 @@
         <w:t>s (one at a time with other disabled)</w:t>
       </w:r>
       <w:r>
-        <w:t xml:space="preserve"> to be </w:t>
-      </w:r>
-      <w:proofErr w:type="gramStart"/>
-      <w:r>
-        <w:t>pretty stiff</w:t>
-      </w:r>
-      <w:proofErr w:type="gramEnd"/>
-      <w:r>
-        <w:t>.</w:t>
-      </w:r>
-    </w:p>
-    <w:p>
-      <w:r>
-        <w:t xml:space="preserve">Now follow Matt Prellwitz’s guide on the wiki for </w:t>
-      </w:r>
-      <w:proofErr w:type="spellStart"/>
-      <w:r>
-        <w:t>MC_TorqueControl</w:t>
-      </w:r>
-      <w:proofErr w:type="spellEnd"/>
-      <w:r>
-        <w:t xml:space="preserve"> on an AX5000</w:t>
-      </w:r>
-      <w:r>
-        <w:t xml:space="preserve"> titled “AX5000 </w:t>
-      </w:r>
-      <w:proofErr w:type="spellStart"/>
-      <w:r>
-        <w:t>MC_TorqueControlSetup</w:t>
-      </w:r>
-      <w:proofErr w:type="spellEnd"/>
-      <w:r>
-        <w:t>” and implement logic for “</w:t>
-      </w:r>
-      <w:proofErr w:type="spellStart"/>
-      <w:r>
-        <w:t>TorqueAxis</w:t>
-      </w:r>
-      <w:proofErr w:type="spellEnd"/>
-      <w:r>
-        <w:t xml:space="preserve">” to apply a constant </w:t>
+        <w:t xml:space="preserve"> to be pretty stiff.</w:t>
+      </w:r>
+    </w:p>
+    <w:p>
+      <w:r>
+        <w:t>Now follow Matt Prellwitz’s guide on the wiki for MC_TorqueControl on an AX5000</w:t>
+      </w:r>
+      <w:r>
+        <w:t xml:space="preserve"> titled “AX5000 MC_TorqueControlSetup” and implement logic for “TorqueAxis” to apply a constant </w:t>
       </w:r>
       <w:r>
         <w:t xml:space="preserve">0.12NM </w:t>
@@ -1172,15 +720,7 @@
         <w:t>torque.</w:t>
       </w:r>
       <w:r>
-        <w:t xml:space="preserve"> Additionally add logic to the relevant “acting states” for the </w:t>
-      </w:r>
-      <w:proofErr w:type="spellStart"/>
-      <w:r>
-        <w:t>TorqueAxis</w:t>
-      </w:r>
-      <w:proofErr w:type="spellEnd"/>
-      <w:r>
-        <w:t xml:space="preserve"> now.</w:t>
+        <w:t xml:space="preserve"> Additionally add logic to the relevant “acting states” for the TorqueAxis now.</w:t>
       </w:r>
     </w:p>
     <w:p>
@@ -1190,15 +730,7 @@
     </w:p>
     <w:p>
       <w:r>
-        <w:t xml:space="preserve">Lastly, add logic in the executing sequence for manual mode, that simply disables the position axis.  You should see the torque axis accelerate to the velocity limit.  The torque </w:t>
-      </w:r>
-      <w:proofErr w:type="gramStart"/>
-      <w:r>
-        <w:t>has to</w:t>
-      </w:r>
-      <w:proofErr w:type="gramEnd"/>
-      <w:r>
-        <w:t xml:space="preserve"> be high enough to accelerate.</w:t>
+        <w:t>Lastly, add logic in the executing sequence for manual mode, that simply disables the position axis.  You should see the torque axis accelerate to the velocity limit.  The torque has to be high enough to accelerate.</w:t>
       </w:r>
     </w:p>
     <w:p>
@@ -1218,17 +750,24 @@
       </w:r>
     </w:p>
     <w:p>
-      <w:r>
+      <w:pPr>
+        <w:rPr>
+          <w:b/>
+          <w:bCs/>
+        </w:rPr>
+      </w:pPr>
+      <w:r>
+        <w:rPr>
+          <w:b/>
+          <w:bCs/>
+        </w:rPr>
         <w:lastRenderedPageBreak/>
-        <w:t xml:space="preserve">Autotune – re-use matt </w:t>
-      </w:r>
-      <w:proofErr w:type="spellStart"/>
-      <w:r>
-        <w:t>prellwitz’s</w:t>
-      </w:r>
-      <w:proofErr w:type="spellEnd"/>
-      <w:r>
-        <w:t xml:space="preserve"> autotuning lab from NEM</w:t>
+        <w:t>Autotuning</w:t>
+      </w:r>
+    </w:p>
+    <w:p>
+      <w:r>
+        <w:t>Follow the pdf guide from Matt Prellwitz’s autotuning lab from NEM2024</w:t>
       </w:r>
       <w:r>
         <w:br/>
@@ -1236,21 +775,8 @@
     </w:p>
     <w:p/>
     <w:p>
-      <w:proofErr w:type="spellStart"/>
-      <w:r>
-        <w:t>Ballscrew</w:t>
-      </w:r>
-      <w:proofErr w:type="spellEnd"/>
-      <w:r>
-        <w:t xml:space="preserve"> – Nick making a lab with ax8000, </w:t>
-      </w:r>
-      <w:proofErr w:type="spellStart"/>
-      <w:r>
-        <w:t>ballscrew</w:t>
-      </w:r>
-      <w:proofErr w:type="spellEnd"/>
-      <w:r>
-        <w:t xml:space="preserve">, </w:t>
+      <w:r>
+        <w:t xml:space="preserve">Ballscrew – Nick making a lab with ax8000, ballscrew, </w:t>
       </w:r>
       <w:r>
         <w:t>limit switches</w:t>

</xml_diff>

<commit_message>
added starter project for rack and pinion
</commit_message>
<xml_diff>
--- a/Instructions.docx
+++ b/Instructions.docx
@@ -26,20 +26,50 @@
       </w:pPr>
     </w:p>
     <w:p>
-      <w:r>
-        <w:rPr>
-          <w:b/>
-          <w:bCs/>
-        </w:rPr>
-        <w:t>Requirements : new TC 4026, PTP and advanced motion pack, drive manager 2, scope, vision</w:t>
-      </w:r>
-    </w:p>
-    <w:p>
-      <w:r>
-        <w:t xml:space="preserve">A sample project is provided that includes a generic SPT framework structure with a machine module implemented and visu interface.  </w:t>
-      </w:r>
-      <w:r>
-        <w:t xml:space="preserve">Hardare is scanned in, and twinsafe is set up but you will need to use drive manager to configure the axes to do your project.  </w:t>
+      <w:proofErr w:type="gramStart"/>
+      <w:r>
+        <w:rPr>
+          <w:b/>
+          <w:bCs/>
+        </w:rPr>
+        <w:t>Requirements :</w:t>
+      </w:r>
+      <w:proofErr w:type="gramEnd"/>
+      <w:r>
+        <w:rPr>
+          <w:b/>
+          <w:bCs/>
+        </w:rPr>
+        <w:t xml:space="preserve"> new TC 4026, PTP and advanced motion pack, drive manager 2, scope, vision</w:t>
+      </w:r>
+    </w:p>
+    <w:p>
+      <w:r>
+        <w:t xml:space="preserve">A sample project is provided that includes a generic SPT framework structure with a machine module implemented and </w:t>
+      </w:r>
+      <w:proofErr w:type="spellStart"/>
+      <w:r>
+        <w:t>visu</w:t>
+      </w:r>
+      <w:proofErr w:type="spellEnd"/>
+      <w:r>
+        <w:t xml:space="preserve"> interface.  </w:t>
+      </w:r>
+      <w:proofErr w:type="spellStart"/>
+      <w:r>
+        <w:t>Hardare</w:t>
+      </w:r>
+      <w:proofErr w:type="spellEnd"/>
+      <w:r>
+        <w:t xml:space="preserve"> is scanned in, and </w:t>
+      </w:r>
+      <w:proofErr w:type="spellStart"/>
+      <w:r>
+        <w:t>twinsafe</w:t>
+      </w:r>
+      <w:proofErr w:type="spellEnd"/>
+      <w:r>
+        <w:t xml:space="preserve"> is set up but you will need to use drive manager to configure the axes to do your project.  </w:t>
       </w:r>
       <w:r>
         <w:t xml:space="preserve">The goal is to </w:t>
@@ -51,7 +81,15 @@
         <w:t xml:space="preserve">equipment module </w:t>
       </w:r>
       <w:r>
-        <w:t>in your start project and add functionality to accomplish your project goals.  Each project already has a machine module with visu interface connected, and an equipment module</w:t>
+        <w:t xml:space="preserve">in your start project and add functionality to accomplish your project goals.  Each project already has a machine module with </w:t>
+      </w:r>
+      <w:proofErr w:type="spellStart"/>
+      <w:r>
+        <w:t>visu</w:t>
+      </w:r>
+      <w:proofErr w:type="spellEnd"/>
+      <w:r>
+        <w:t xml:space="preserve"> interface connected, and an equipment module</w:t>
       </w:r>
       <w:r>
         <w:t xml:space="preserve"> </w:t>
@@ -79,7 +117,15 @@
         <w:t>SECOND</w:t>
       </w:r>
       <w:r>
-        <w:t xml:space="preserve"> lab they did.  Explain the project, the steps you did to make it work, and try to elicit a conversation about the topic for everyone to discuss (as a group) more intricate details of the topics.  i.e. inner workings of the advanced homing library (for rack and pinion project), or the time base of the XFC output for the vision lab.</w:t>
+        <w:t xml:space="preserve"> lab they did.  Explain the project, the steps you </w:t>
+      </w:r>
+      <w:proofErr w:type="gramStart"/>
+      <w:r>
+        <w:t>did</w:t>
+      </w:r>
+      <w:proofErr w:type="gramEnd"/>
+      <w:r>
+        <w:t xml:space="preserve"> to make it work, and try to elicit a conversation about the topic for everyone to discuss (as a group) more intricate details of the topics.  i.e. inner workings of the advanced homing library (for rack and pinion project), or the time base of the XFC output for the vision lab.</w:t>
       </w:r>
     </w:p>
     <w:p>
@@ -94,8 +140,17 @@
           <w:b/>
           <w:bCs/>
         </w:rPr>
-        <w:t>Rack and pinion</w:t>
-      </w:r>
+        <w:t xml:space="preserve">Rack and </w:t>
+      </w:r>
+      <w:proofErr w:type="gramStart"/>
+      <w:r>
+        <w:rPr>
+          <w:b/>
+          <w:bCs/>
+        </w:rPr>
+        <w:t>pinion</w:t>
+      </w:r>
+      <w:proofErr w:type="gramEnd"/>
       <w:r>
         <w:rPr>
           <w:b/>
@@ -155,7 +210,15 @@
       </w:r>
       <w:r>
         <w:br/>
-        <w:t>Accel/Decel 1,000 mm/s</w:t>
+        <w:t>Accel/</w:t>
+      </w:r>
+      <w:proofErr w:type="spellStart"/>
+      <w:r>
+        <w:t>Decel</w:t>
+      </w:r>
+      <w:proofErr w:type="spellEnd"/>
+      <w:r>
+        <w:t xml:space="preserve"> 1,000 mm/s</w:t>
       </w:r>
       <w:r>
         <w:br/>
@@ -164,7 +227,23 @@
     </w:p>
     <w:p>
       <w:r>
-        <w:t xml:space="preserve">Write homing routines that implement I_MotionSequence according to the SPT documentation to home each axis.  The left servo homes to a home switch at position </w:t>
+        <w:t xml:space="preserve">Write </w:t>
+      </w:r>
+      <w:proofErr w:type="gramStart"/>
+      <w:r>
+        <w:t>homing</w:t>
+      </w:r>
+      <w:proofErr w:type="gramEnd"/>
+      <w:r>
+        <w:t xml:space="preserve"> routines that implement </w:t>
+      </w:r>
+      <w:proofErr w:type="spellStart"/>
+      <w:r>
+        <w:t>I_MotionSequence</w:t>
+      </w:r>
+      <w:proofErr w:type="spellEnd"/>
+      <w:r>
+        <w:t xml:space="preserve"> according to the SPT documentation to home each axis.  The left servo homes to a home switch at position </w:t>
       </w:r>
       <w:r>
         <w:rPr>
@@ -194,7 +273,23 @@
         <w:t>50%</w:t>
       </w:r>
       <w:r>
-        <w:t xml:space="preserve">.  Use 50mm/s for the homing velocity for both methods, accel/decel of 1k, and jerk of 10k. Follow the SPT motion documentation to create a homing routine that implements I_MotionSequence to complete the homing process and then trigger the homing in </w:t>
+        <w:t>.  Use 50mm/s for the homing velocity for both methods, accel/</w:t>
+      </w:r>
+      <w:proofErr w:type="spellStart"/>
+      <w:r>
+        <w:t>decel</w:t>
+      </w:r>
+      <w:proofErr w:type="spellEnd"/>
+      <w:r>
+        <w:t xml:space="preserve"> of 1k, and jerk of 10k. Follow the SPT motion documentation to create a homing routine that implements </w:t>
+      </w:r>
+      <w:proofErr w:type="spellStart"/>
+      <w:r>
+        <w:t>I_MotionSequence</w:t>
+      </w:r>
+      <w:proofErr w:type="spellEnd"/>
+      <w:r>
+        <w:t xml:space="preserve"> to complete the homing process and then trigger the homing in </w:t>
       </w:r>
       <w:r>
         <w:t>starting</w:t>
@@ -216,14 +311,38 @@
     </w:p>
     <w:p>
       <w:r>
-        <w:t>After this project swap to the ballscrew project.</w:t>
-      </w:r>
-      <w:r>
-        <w:br/>
-      </w:r>
-      <w:r>
-        <w:br/>
-        <w:t>For your presentation, show the axis configuration for homing settings, when to use MC_Home vs the advanced homing library, and the difference between collision avoidance modes.</w:t>
+        <w:t xml:space="preserve">After this </w:t>
+      </w:r>
+      <w:proofErr w:type="gramStart"/>
+      <w:r>
+        <w:t>project</w:t>
+      </w:r>
+      <w:proofErr w:type="gramEnd"/>
+      <w:r>
+        <w:t xml:space="preserve"> swap to the </w:t>
+      </w:r>
+      <w:proofErr w:type="spellStart"/>
+      <w:r>
+        <w:t>ballscrew</w:t>
+      </w:r>
+      <w:proofErr w:type="spellEnd"/>
+      <w:r>
+        <w:t xml:space="preserve"> project.</w:t>
+      </w:r>
+      <w:r>
+        <w:br/>
+      </w:r>
+      <w:r>
+        <w:br/>
+        <w:t xml:space="preserve">For your presentation, show the axis configuration for homing settings, when to use </w:t>
+      </w:r>
+      <w:proofErr w:type="spellStart"/>
+      <w:r>
+        <w:t>MC_Home</w:t>
+      </w:r>
+      <w:proofErr w:type="spellEnd"/>
+      <w:r>
+        <w:t xml:space="preserve"> vs the advanced homing library, and the difference between collision avoidance modes.</w:t>
       </w:r>
     </w:p>
     <w:p>
@@ -279,7 +398,15 @@
     </w:p>
     <w:p>
       <w:r>
-        <w:t>Download the SPT camming example and copy the "CamModule_UpdateTable" folder into our project.</w:t>
+        <w:t>Download the SPT camming example and copy the "</w:t>
+      </w:r>
+      <w:proofErr w:type="spellStart"/>
+      <w:r>
+        <w:t>CamModule_UpdateTable</w:t>
+      </w:r>
+      <w:proofErr w:type="spellEnd"/>
+      <w:r>
+        <w:t>" folder into our project.</w:t>
       </w:r>
       <w:r>
         <w:br/>
@@ -294,23 +421,100 @@
     </w:p>
     <w:p>
       <w:r>
-        <w:t>Either create a cam table or edit the "WriteCamParameters" methods to create a cam that advances the cam slave axis one "pocket" every 180 degree rotation.  The top gear has 20 pockets and both axes are the same diameter - use this to calculate the angular length of the synchronous zone.  I wasn't able to figure out how to get the CamSlave FB to use a cam table from the NC, so not sure if it's possible</w:t>
-      </w:r>
-    </w:p>
-    <w:p>
-      <w:r>
-        <w:t>Hints for editing WriteCamParameters</w:t>
-      </w:r>
+        <w:t>Either create a cam table or edit the "</w:t>
+      </w:r>
+      <w:proofErr w:type="spellStart"/>
+      <w:r>
+        <w:t>WriteCamParameters</w:t>
+      </w:r>
+      <w:proofErr w:type="spellEnd"/>
+      <w:r>
+        <w:t xml:space="preserve">" methods to create a cam that advances the cam slave axis one "pocket" every </w:t>
+      </w:r>
+      <w:proofErr w:type="gramStart"/>
+      <w:r>
+        <w:t>180 degree</w:t>
+      </w:r>
+      <w:proofErr w:type="gramEnd"/>
+      <w:r>
+        <w:t xml:space="preserve"> rotation.  The top gear has 20 pockets and both axes are the same diameter - use this to calculate the angular length of the synchronous zone.  I </w:t>
+      </w:r>
+      <w:proofErr w:type="gramStart"/>
+      <w:r>
+        <w:t>wasn't able to</w:t>
+      </w:r>
+      <w:proofErr w:type="gramEnd"/>
+      <w:r>
+        <w:t xml:space="preserve"> figure out how to get the </w:t>
+      </w:r>
+      <w:proofErr w:type="spellStart"/>
+      <w:r>
+        <w:t>CamSlave</w:t>
+      </w:r>
+      <w:proofErr w:type="spellEnd"/>
+      <w:r>
+        <w:t xml:space="preserve"> FB to use a cam table from the NC, </w:t>
+      </w:r>
+      <w:proofErr w:type="gramStart"/>
+      <w:r>
+        <w:t>so</w:t>
+      </w:r>
+      <w:proofErr w:type="gramEnd"/>
+      <w:r>
+        <w:t xml:space="preserve"> not sure if it's possible</w:t>
+      </w:r>
+    </w:p>
+    <w:p>
+      <w:r>
+        <w:t xml:space="preserve">Hints for editing </w:t>
+      </w:r>
+      <w:proofErr w:type="spellStart"/>
+      <w:r>
+        <w:t>WriteCamParameters</w:t>
+      </w:r>
+      <w:proofErr w:type="spellEnd"/>
       <w:r>
         <w:t xml:space="preserve"> - </w:t>
       </w:r>
       <w:r>
-        <w:t xml:space="preserve">See infosys "MC_MotionFunctionType" </w:t>
-      </w:r>
-    </w:p>
-    <w:p>
-      <w:r>
-        <w:t>"Upload Cam" into cam table to see position, velocity, accel etc comparisons to see if you made the table you think you did.</w:t>
+        <w:t xml:space="preserve">See </w:t>
+      </w:r>
+      <w:proofErr w:type="spellStart"/>
+      <w:r>
+        <w:t>infosys</w:t>
+      </w:r>
+      <w:proofErr w:type="spellEnd"/>
+      <w:r>
+        <w:t xml:space="preserve"> "</w:t>
+      </w:r>
+      <w:proofErr w:type="spellStart"/>
+      <w:r>
+        <w:t>MC_MotionFunctionType</w:t>
+      </w:r>
+      <w:proofErr w:type="spellEnd"/>
+      <w:r>
+        <w:t xml:space="preserve">" </w:t>
+      </w:r>
+    </w:p>
+    <w:p>
+      <w:r>
+        <w:t xml:space="preserve">"Upload Cam" into cam table to see position, velocity, accel </w:t>
+      </w:r>
+      <w:proofErr w:type="spellStart"/>
+      <w:r>
+        <w:t>etc</w:t>
+      </w:r>
+      <w:proofErr w:type="spellEnd"/>
+      <w:r>
+        <w:t xml:space="preserve"> comparisons to see if you made the </w:t>
+      </w:r>
+      <w:proofErr w:type="gramStart"/>
+      <w:r>
+        <w:t>table</w:t>
+      </w:r>
+      <w:proofErr w:type="gramEnd"/>
+      <w:r>
+        <w:t xml:space="preserve"> you think you did.</w:t>
       </w:r>
     </w:p>
     <w:p>
@@ -320,17 +524,49 @@
     </w:p>
     <w:p>
       <w:r>
-        <w:t xml:space="preserve">If you have extra time, edit the CamModule to change functionality depending on machine mode.  If in maintenance mode, have it gear in instead of running a cam.  </w:t>
-      </w:r>
-    </w:p>
-    <w:p>
-      <w:r>
-        <w:t>After this project swap to the belt indexing project.</w:t>
-      </w:r>
-    </w:p>
-    <w:p>
-      <w:r>
-        <w:t>For your presentation, discuss where to save the NC offset (drive or encoder?) and the cam table you created or the edits you  made to the "WriteCamParameters" methods and show it running with the middle inserts in place if you got that far</w:t>
+        <w:t xml:space="preserve">If you have extra time, edit the </w:t>
+      </w:r>
+      <w:proofErr w:type="spellStart"/>
+      <w:r>
+        <w:t>CamModule</w:t>
+      </w:r>
+      <w:proofErr w:type="spellEnd"/>
+      <w:r>
+        <w:t xml:space="preserve"> to change functionality depending on machine mode.  If in maintenance mode, have it gear in instead of running a cam.  </w:t>
+      </w:r>
+    </w:p>
+    <w:p>
+      <w:r>
+        <w:t xml:space="preserve">After this project </w:t>
+      </w:r>
+      <w:proofErr w:type="gramStart"/>
+      <w:r>
+        <w:t>swap to</w:t>
+      </w:r>
+      <w:proofErr w:type="gramEnd"/>
+      <w:r>
+        <w:t xml:space="preserve"> the belt indexing project.</w:t>
+      </w:r>
+    </w:p>
+    <w:p>
+      <w:r>
+        <w:t xml:space="preserve">For your presentation, discuss where to save the NC offset (drive or encoder?) and the cam table you created or the edits </w:t>
+      </w:r>
+      <w:proofErr w:type="gramStart"/>
+      <w:r>
+        <w:t>you  made</w:t>
+      </w:r>
+      <w:proofErr w:type="gramEnd"/>
+      <w:r>
+        <w:t xml:space="preserve"> to the "</w:t>
+      </w:r>
+      <w:proofErr w:type="spellStart"/>
+      <w:r>
+        <w:t>WriteCamParameters</w:t>
+      </w:r>
+      <w:proofErr w:type="spellEnd"/>
+      <w:r>
+        <w:t>" methods and show it running with the middle inserts in place if you got that far</w:t>
       </w:r>
     </w:p>
     <w:p>
@@ -381,7 +617,23 @@
     </w:p>
     <w:p>
       <w:r>
-        <w:t xml:space="preserve">The belt is a timing belt with 5mm pitch between teeth.  The belt pulleys have 24 teeth and the gear ratio of the gears is 2:1 (2 rotations of the motor = 1 rotation of the pulley).  The belt has 120 teeth.  There is a 420mm offset from the registration mark sensor to the marks to index to. </w:t>
+        <w:t xml:space="preserve">The belt is a timing belt with 5mm pitch between teeth.  The belt pulleys have 24 </w:t>
+      </w:r>
+      <w:proofErr w:type="gramStart"/>
+      <w:r>
+        <w:t>teeth</w:t>
+      </w:r>
+      <w:proofErr w:type="gramEnd"/>
+      <w:r>
+        <w:t xml:space="preserve"> and the gear ratio of the gears is 2:1 (2 rotations of the motor = 1 rotation of the pulley).  The belt has 120 teeth.  There is a 420mm offset from the registration mark sensor to the marks to index </w:t>
+      </w:r>
+      <w:proofErr w:type="gramStart"/>
+      <w:r>
+        <w:t>to</w:t>
+      </w:r>
+      <w:proofErr w:type="gramEnd"/>
+      <w:r>
+        <w:t xml:space="preserve">. </w:t>
       </w:r>
       <w:r>
         <w:br/>
@@ -393,7 +645,15 @@
     </w:p>
     <w:p>
       <w:r>
-        <w:t xml:space="preserve">In the running routine, move in the positive direction, where the belt side facing you is moving upwards, at 250mm/s.  Notice in the execute routine there is already logic for buffering the registration mark positions.  You must configure the drive inputs and add </w:t>
+        <w:t xml:space="preserve">In the running routine, move in the positive direction, where the belt side facing you is moving upwards, at 250mm/s.  Notice in the </w:t>
+      </w:r>
+      <w:proofErr w:type="gramStart"/>
+      <w:r>
+        <w:t>execute</w:t>
+      </w:r>
+      <w:proofErr w:type="gramEnd"/>
+      <w:r>
+        <w:t xml:space="preserve"> routine there is already logic for buffering the registration mark positions.  You must configure the drive inputs and add </w:t>
       </w:r>
       <w:r>
         <w:t>touch probe functionality to buffer the positions and index to them.</w:t>
@@ -406,13 +666,21 @@
     </w:p>
     <w:p>
       <w:r>
-        <w:t xml:space="preserve">Registration Mark wiring: </w:t>
-      </w:r>
-      <w:r>
-        <w:tab/>
-      </w:r>
-      <w:r>
-        <w:t>Brown +</w:t>
+        <w:t>Registration Mark wiring</w:t>
+      </w:r>
+      <w:proofErr w:type="gramStart"/>
+      <w:r>
+        <w:t xml:space="preserve">: </w:t>
+      </w:r>
+      <w:r>
+        <w:tab/>
+      </w:r>
+      <w:r>
+        <w:t>Brown</w:t>
+      </w:r>
+      <w:proofErr w:type="gramEnd"/>
+      <w:r>
+        <w:t xml:space="preserve"> +</w:t>
       </w:r>
       <w:r>
         <w:t>24vdc, Blue 0vdc, white signal</w:t>
@@ -512,7 +780,15 @@
     </w:p>
     <w:p>
       <w:r>
-        <w:t xml:space="preserve">Get the system into the executing state and view the images that are taken.  You should see a lot of variance in the can position.  </w:t>
+        <w:t xml:space="preserve">Get the system into the executing state and view the images that are taken.  You should see a lot of </w:t>
+      </w:r>
+      <w:proofErr w:type="gramStart"/>
+      <w:r>
+        <w:t>variance</w:t>
+      </w:r>
+      <w:proofErr w:type="gramEnd"/>
+      <w:r>
+        <w:t xml:space="preserve"> in the can position.  </w:t>
       </w:r>
       <w:r>
         <w:t>The default settings spin the can at 500 degrees per second.  Increase this to 1000 degrees per second, then to 2000.  You should see that the error in the camera trigger timing is a function of speed (among other things).  Note for the sake of emphasis, the plc code is running at 100ms</w:t>
@@ -578,7 +854,15 @@
     </w:p>
     <w:p>
       <w:r>
-        <w:t xml:space="preserve">You have the change camera trigger settings in the configuration window as shown above to switch between software trigger (starter project) and ethercat </w:t>
+        <w:t xml:space="preserve">You have the change camera trigger settings in the configuration window as shown above to switch between software trigger (starter project) and </w:t>
+      </w:r>
+      <w:proofErr w:type="spellStart"/>
+      <w:r>
+        <w:t>ethercat</w:t>
+      </w:r>
+      <w:proofErr w:type="spellEnd"/>
+      <w:r>
+        <w:t xml:space="preserve"> </w:t>
       </w:r>
       <w:r>
         <w:t xml:space="preserve">timestamp </w:t>
@@ -593,7 +877,23 @@
     <w:p>
       <w:r>
         <w:lastRenderedPageBreak/>
-        <w:t>The XFC blocks are non-modulo.  Use the function MODTURNS in tc2_math to get the current number of turns of the axis based on the set position.  You can do some math with this value to determine a non-modulo target trigger position along with your capture angle.  You feed this position into the XFC block, but the XFC block outputs a 32 bit DC time, whereas the camera expects a 64 bit.  There’s a function in the XFC library to convert the 32 bit time to 64.</w:t>
+        <w:t xml:space="preserve">The XFC blocks are non-modulo.  Use the function MODTURNS in tc2_math to get the current number of turns of the axis based on the set position.  You can do some math with this value to determine a non-modulo target trigger position along with your capture angle.  You feed this position into the XFC block, but the XFC block outputs a </w:t>
+      </w:r>
+      <w:proofErr w:type="gramStart"/>
+      <w:r>
+        <w:t>32 bit</w:t>
+      </w:r>
+      <w:proofErr w:type="gramEnd"/>
+      <w:r>
+        <w:t xml:space="preserve"> DC time, whereas the camera expects a 64 bit.  There’s a function in the XFC library to convert the </w:t>
+      </w:r>
+      <w:proofErr w:type="gramStart"/>
+      <w:r>
+        <w:t>32 bit</w:t>
+      </w:r>
+      <w:proofErr w:type="gramEnd"/>
+      <w:r>
+        <w:t xml:space="preserve"> time to 64.</w:t>
       </w:r>
     </w:p>
     <w:p/>
@@ -602,16 +902,48 @@
         <w:t>After implementing this</w:t>
       </w:r>
       <w:r>
-        <w:t xml:space="preserve"> you should see very little jitter on the can position when the image is taken.  Force the speed to 2000 from default (500) and execution state back to 0, you will see can speed up.  If you didn’t configure the XFC block to account for acceleration you will see some misses while the axis accelerates, but when it gets to its new target velocity, it should be very close to the position the images were showing at 500 velocity.  I saw a small difference.  </w:t>
+        <w:t xml:space="preserve"> you should see very little jitter on the can position when the image is taken.  Force the speed to 2000 from default (500) and execution state back to 0, you will see can speed up.  If you didn’t configure the XFC block to account for acceleration you will see some misses while the axis accelerates, but when it gets to its new target velocity, it should be very close to the position the </w:t>
+      </w:r>
+      <w:proofErr w:type="gramStart"/>
+      <w:r>
+        <w:t>images were</w:t>
+      </w:r>
+      <w:proofErr w:type="gramEnd"/>
+      <w:r>
+        <w:t xml:space="preserve"> showing at 500 </w:t>
+      </w:r>
+      <w:proofErr w:type="gramStart"/>
+      <w:r>
+        <w:t>velocity</w:t>
+      </w:r>
+      <w:proofErr w:type="gramEnd"/>
+      <w:r>
+        <w:t xml:space="preserve">.  I saw a small difference.  </w:t>
       </w:r>
     </w:p>
     <w:p/>
     <w:p>
       <w:r>
-        <w:t>In your discussion at the end of the session discuss the fundamentals of the changes you made and your results.</w:t>
-      </w:r>
-      <w:r>
-        <w:t xml:space="preserve">  Try to get group discussion about how to further minimize difference of trigger positions and low and high velocities.</w:t>
+        <w:t xml:space="preserve">In your discussion at the end of the session </w:t>
+      </w:r>
+      <w:proofErr w:type="gramStart"/>
+      <w:r>
+        <w:t>discuss</w:t>
+      </w:r>
+      <w:proofErr w:type="gramEnd"/>
+      <w:r>
+        <w:t xml:space="preserve"> the fundamentals of the changes you made and your results.</w:t>
+      </w:r>
+      <w:r>
+        <w:t xml:space="preserve">  Try to get group discussion about how to further minimize </w:t>
+      </w:r>
+      <w:proofErr w:type="gramStart"/>
+      <w:r>
+        <w:t>difference</w:t>
+      </w:r>
+      <w:proofErr w:type="gramEnd"/>
+      <w:r>
+        <w:t xml:space="preserve"> of trigger positions and low and high velocities.</w:t>
       </w:r>
     </w:p>
     <w:p>
@@ -677,7 +1009,23 @@
     </w:p>
     <w:p>
       <w:r>
-        <w:t xml:space="preserve">Scan in the AX5000 unit and the motors.  You’ll see only the channel B motor has an electronic nameplate.  Use drive manager 2 to select the motor for channel A.  </w:t>
+        <w:t xml:space="preserve">Scan in the AX5000 unit and the motors.  You’ll see only </w:t>
+      </w:r>
+      <w:proofErr w:type="gramStart"/>
+      <w:r>
+        <w:t>the channel</w:t>
+      </w:r>
+      <w:proofErr w:type="gramEnd"/>
+      <w:r>
+        <w:t xml:space="preserve"> B motor has an electronic nameplate.  Use </w:t>
+      </w:r>
+      <w:proofErr w:type="gramStart"/>
+      <w:r>
+        <w:t>drive manager</w:t>
+      </w:r>
+      <w:proofErr w:type="gramEnd"/>
+      <w:r>
+        <w:t xml:space="preserve"> 2 to select the motor for channel A.  </w:t>
       </w:r>
     </w:p>
     <w:p>
@@ -703,15 +1051,47 @@
         <w:t>s (one at a time with other disabled)</w:t>
       </w:r>
       <w:r>
-        <w:t xml:space="preserve"> to be pretty stiff.</w:t>
-      </w:r>
-    </w:p>
-    <w:p>
-      <w:r>
-        <w:t>Now follow Matt Prellwitz’s guide on the wiki for MC_TorqueControl on an AX5000</w:t>
-      </w:r>
-      <w:r>
-        <w:t xml:space="preserve"> titled “AX5000 MC_TorqueControlSetup” and implement logic for “TorqueAxis” to apply a constant </w:t>
+        <w:t xml:space="preserve"> to be </w:t>
+      </w:r>
+      <w:proofErr w:type="gramStart"/>
+      <w:r>
+        <w:t>pretty stiff</w:t>
+      </w:r>
+      <w:proofErr w:type="gramEnd"/>
+      <w:r>
+        <w:t>.</w:t>
+      </w:r>
+    </w:p>
+    <w:p>
+      <w:r>
+        <w:t xml:space="preserve">Now follow Matt Prellwitz’s guide on the wiki for </w:t>
+      </w:r>
+      <w:proofErr w:type="spellStart"/>
+      <w:r>
+        <w:t>MC_TorqueControl</w:t>
+      </w:r>
+      <w:proofErr w:type="spellEnd"/>
+      <w:r>
+        <w:t xml:space="preserve"> on an AX5000</w:t>
+      </w:r>
+      <w:r>
+        <w:t xml:space="preserve"> titled “AX5000 </w:t>
+      </w:r>
+      <w:proofErr w:type="spellStart"/>
+      <w:r>
+        <w:t>MC_TorqueControlSetup</w:t>
+      </w:r>
+      <w:proofErr w:type="spellEnd"/>
+      <w:r>
+        <w:t>” and implement logic for “</w:t>
+      </w:r>
+      <w:proofErr w:type="spellStart"/>
+      <w:r>
+        <w:t>TorqueAxis</w:t>
+      </w:r>
+      <w:proofErr w:type="spellEnd"/>
+      <w:r>
+        <w:t xml:space="preserve">” to apply a constant </w:t>
       </w:r>
       <w:r>
         <w:t xml:space="preserve">0.12NM </w:t>
@@ -720,7 +1100,15 @@
         <w:t>torque.</w:t>
       </w:r>
       <w:r>
-        <w:t xml:space="preserve"> Additionally add logic to the relevant “acting states” for the TorqueAxis now.</w:t>
+        <w:t xml:space="preserve"> Additionally add logic to the relevant “acting states” for the </w:t>
+      </w:r>
+      <w:proofErr w:type="spellStart"/>
+      <w:r>
+        <w:t>TorqueAxis</w:t>
+      </w:r>
+      <w:proofErr w:type="spellEnd"/>
+      <w:r>
+        <w:t xml:space="preserve"> now.</w:t>
       </w:r>
     </w:p>
     <w:p>
@@ -730,7 +1118,15 @@
     </w:p>
     <w:p>
       <w:r>
-        <w:t>Lastly, add logic in the executing sequence for manual mode, that simply disables the position axis.  You should see the torque axis accelerate to the velocity limit.  The torque has to be high enough to accelerate.</w:t>
+        <w:t xml:space="preserve">Lastly, add logic in the executing sequence for manual mode, that simply disables the position axis.  You should see the torque axis accelerate to the velocity limit.  The torque </w:t>
+      </w:r>
+      <w:proofErr w:type="gramStart"/>
+      <w:r>
+        <w:t>has to</w:t>
+      </w:r>
+      <w:proofErr w:type="gramEnd"/>
+      <w:r>
+        <w:t xml:space="preserve"> be high enough to accelerate.</w:t>
       </w:r>
     </w:p>
     <w:p>
@@ -773,10 +1169,28 @@
         <w:br/>
       </w:r>
     </w:p>
+    <w:p>
+      <w:r>
+        <w:br w:type="page"/>
+      </w:r>
+    </w:p>
     <w:p/>
     <w:p>
-      <w:r>
-        <w:t xml:space="preserve">Ballscrew – Nick making a lab with ax8000, ballscrew, </w:t>
+      <w:proofErr w:type="spellStart"/>
+      <w:r>
+        <w:t>Ballscrew</w:t>
+      </w:r>
+      <w:proofErr w:type="spellEnd"/>
+      <w:r>
+        <w:t xml:space="preserve"> – Nick making a lab with ax8000, </w:t>
+      </w:r>
+      <w:proofErr w:type="spellStart"/>
+      <w:r>
+        <w:t>ballscrew</w:t>
+      </w:r>
+      <w:proofErr w:type="spellEnd"/>
+      <w:r>
+        <w:t xml:space="preserve">, </w:t>
       </w:r>
       <w:r>
         <w:t>limit switches</w:t>
@@ -869,14 +1283,33 @@
         <w:t>Nick and Alina</w:t>
       </w:r>
       <w:r>
-        <w:br/>
-        <w:t>Steve and Arthur</w:t>
+        <w:t xml:space="preserve"> – rack and pinion/</w:t>
+      </w:r>
+      <w:proofErr w:type="spellStart"/>
+      <w:r>
+        <w:t>ballscrew</w:t>
+      </w:r>
+      <w:proofErr w:type="spellEnd"/>
+      <w:r>
+        <w:br/>
+      </w:r>
+      <w:r>
+        <w:t>Matthew</w:t>
+      </w:r>
+      <w:r>
+        <w:t xml:space="preserve"> and Arthur</w:t>
+      </w:r>
+      <w:r>
+        <w:t xml:space="preserve"> – indexing and camming</w:t>
       </w:r>
       <w:r>
         <w:br/>
         <w:t>Adam and Kurt</w:t>
       </w:r>
       <w:r>
+        <w:t xml:space="preserve"> – Coupled Motion</w:t>
+      </w:r>
+      <w:r>
         <w:br/>
         <w:t xml:space="preserve">Yizhou and </w:t>
       </w:r>
@@ -884,8 +1317,16 @@
         <w:t>Ben</w:t>
       </w:r>
       <w:r>
-        <w:br/>
-        <w:t>Matthew and Connor</w:t>
+        <w:t xml:space="preserve"> - Vision</w:t>
+      </w:r>
+      <w:r>
+        <w:br/>
+      </w:r>
+      <w:r>
+        <w:t>Steve</w:t>
+      </w:r>
+      <w:r>
+        <w:t xml:space="preserve"> and Connor</w:t>
       </w:r>
       <w:r>
         <w:t xml:space="preserve"> (Wednesday) and Andrew Hyder</w:t>

</xml_diff>

<commit_message>
updated belt indexing demo - it still had touchprobe logic
</commit_message>
<xml_diff>
--- a/Instructions.docx
+++ b/Instructions.docx
@@ -26,50 +26,20 @@
       </w:pPr>
     </w:p>
     <w:p>
-      <w:proofErr w:type="gramStart"/>
-      <w:r>
-        <w:rPr>
-          <w:b/>
-          <w:bCs/>
-        </w:rPr>
-        <w:t>Requirements :</w:t>
-      </w:r>
-      <w:proofErr w:type="gramEnd"/>
-      <w:r>
-        <w:rPr>
-          <w:b/>
-          <w:bCs/>
-        </w:rPr>
-        <w:t xml:space="preserve"> new TC 4026, PTP and advanced motion pack, drive manager 2, scope, vision</w:t>
-      </w:r>
-    </w:p>
-    <w:p>
-      <w:r>
-        <w:t xml:space="preserve">A sample project is provided that includes a generic SPT framework structure with a machine module implemented and </w:t>
-      </w:r>
-      <w:proofErr w:type="spellStart"/>
-      <w:r>
-        <w:t>visu</w:t>
-      </w:r>
-      <w:proofErr w:type="spellEnd"/>
-      <w:r>
-        <w:t xml:space="preserve"> interface.  </w:t>
-      </w:r>
-      <w:proofErr w:type="spellStart"/>
-      <w:r>
-        <w:t>Hardare</w:t>
-      </w:r>
-      <w:proofErr w:type="spellEnd"/>
-      <w:r>
-        <w:t xml:space="preserve"> is scanned in, and </w:t>
-      </w:r>
-      <w:proofErr w:type="spellStart"/>
-      <w:r>
-        <w:t>twinsafe</w:t>
-      </w:r>
-      <w:proofErr w:type="spellEnd"/>
-      <w:r>
-        <w:t xml:space="preserve"> is set up but you will need to use drive manager to configure the axes to do your project.  </w:t>
+      <w:r>
+        <w:rPr>
+          <w:b/>
+          <w:bCs/>
+        </w:rPr>
+        <w:t>Requirements : new TC 4026, PTP and advanced motion pack, drive manager 2, scope, vision</w:t>
+      </w:r>
+    </w:p>
+    <w:p>
+      <w:r>
+        <w:t xml:space="preserve">A sample project is provided that includes a generic SPT framework structure with a machine module implemented and visu interface.  </w:t>
+      </w:r>
+      <w:r>
+        <w:t xml:space="preserve">Hardare is scanned in, and twinsafe is set up but you will need to use drive manager to configure the axes to do your project.  </w:t>
       </w:r>
       <w:r>
         <w:t xml:space="preserve">The goal is to </w:t>
@@ -81,15 +51,7 @@
         <w:t xml:space="preserve">equipment module </w:t>
       </w:r>
       <w:r>
-        <w:t xml:space="preserve">in your start project and add functionality to accomplish your project goals.  Each project already has a machine module with </w:t>
-      </w:r>
-      <w:proofErr w:type="spellStart"/>
-      <w:r>
-        <w:t>visu</w:t>
-      </w:r>
-      <w:proofErr w:type="spellEnd"/>
-      <w:r>
-        <w:t xml:space="preserve"> interface connected, and an equipment module</w:t>
+        <w:t>in your start project and add functionality to accomplish your project goals.  Each project already has a machine module with visu interface connected, and an equipment module</w:t>
       </w:r>
       <w:r>
         <w:t xml:space="preserve"> </w:t>
@@ -117,15 +79,7 @@
         <w:t>SECOND</w:t>
       </w:r>
       <w:r>
-        <w:t xml:space="preserve"> lab they did.  Explain the project, the steps you </w:t>
-      </w:r>
-      <w:proofErr w:type="gramStart"/>
-      <w:r>
-        <w:t>did</w:t>
-      </w:r>
-      <w:proofErr w:type="gramEnd"/>
-      <w:r>
-        <w:t xml:space="preserve"> to make it work, and try to elicit a conversation about the topic for everyone to discuss (as a group) more intricate details of the topics.  i.e. inner workings of the advanced homing library (for rack and pinion project), or the time base of the XFC output for the vision lab.</w:t>
+        <w:t xml:space="preserve"> lab they did.  Explain the project, the steps you did to make it work, and try to elicit a conversation about the topic for everyone to discuss (as a group) more intricate details of the topics.  i.e. inner workings of the advanced homing library (for rack and pinion project), or the time base of the XFC output for the vision lab.</w:t>
       </w:r>
     </w:p>
     <w:p>
@@ -140,17 +94,8 @@
           <w:b/>
           <w:bCs/>
         </w:rPr>
-        <w:t xml:space="preserve">Rack and </w:t>
-      </w:r>
-      <w:proofErr w:type="gramStart"/>
-      <w:r>
-        <w:rPr>
-          <w:b/>
-          <w:bCs/>
-        </w:rPr>
-        <w:t>pinion</w:t>
-      </w:r>
-      <w:proofErr w:type="gramEnd"/>
+        <w:t>Rack and pinion</w:t>
+      </w:r>
       <w:r>
         <w:rPr>
           <w:b/>
@@ -210,15 +155,7 @@
       </w:r>
       <w:r>
         <w:br/>
-        <w:t>Accel/</w:t>
-      </w:r>
-      <w:proofErr w:type="spellStart"/>
-      <w:r>
-        <w:t>Decel</w:t>
-      </w:r>
-      <w:proofErr w:type="spellEnd"/>
-      <w:r>
-        <w:t xml:space="preserve"> 1,000 mm/s</w:t>
+        <w:t>Accel/Decel 1,000 mm/s</w:t>
       </w:r>
       <w:r>
         <w:br/>
@@ -227,23 +164,7 @@
     </w:p>
     <w:p>
       <w:r>
-        <w:t xml:space="preserve">Write </w:t>
-      </w:r>
-      <w:proofErr w:type="gramStart"/>
-      <w:r>
-        <w:t>homing</w:t>
-      </w:r>
-      <w:proofErr w:type="gramEnd"/>
-      <w:r>
-        <w:t xml:space="preserve"> routines that implement </w:t>
-      </w:r>
-      <w:proofErr w:type="spellStart"/>
-      <w:r>
-        <w:t>I_MotionSequence</w:t>
-      </w:r>
-      <w:proofErr w:type="spellEnd"/>
-      <w:r>
-        <w:t xml:space="preserve"> according to the SPT documentation to home each axis.  The left servo homes to a home switch at position </w:t>
+        <w:t xml:space="preserve">Write homing routines that implement I_MotionSequence according to the SPT documentation to home each axis.  The left servo homes to a home switch at position </w:t>
       </w:r>
       <w:r>
         <w:rPr>
@@ -273,23 +194,7 @@
         <w:t>50%</w:t>
       </w:r>
       <w:r>
-        <w:t>.  Use 50mm/s for the homing velocity for both methods, accel/</w:t>
-      </w:r>
-      <w:proofErr w:type="spellStart"/>
-      <w:r>
-        <w:t>decel</w:t>
-      </w:r>
-      <w:proofErr w:type="spellEnd"/>
-      <w:r>
-        <w:t xml:space="preserve"> of 1k, and jerk of 10k. Follow the SPT motion documentation to create a homing routine that implements </w:t>
-      </w:r>
-      <w:proofErr w:type="spellStart"/>
-      <w:r>
-        <w:t>I_MotionSequence</w:t>
-      </w:r>
-      <w:proofErr w:type="spellEnd"/>
-      <w:r>
-        <w:t xml:space="preserve"> to complete the homing process and then trigger the homing in </w:t>
+        <w:t xml:space="preserve">.  Use 50mm/s for the homing velocity for both methods, accel/decel of 1k, and jerk of 10k. Follow the SPT motion documentation to create a homing routine that implements I_MotionSequence to complete the homing process and then trigger the homing in </w:t>
       </w:r>
       <w:r>
         <w:t>starting</w:t>
@@ -311,38 +216,14 @@
     </w:p>
     <w:p>
       <w:r>
-        <w:t xml:space="preserve">After this </w:t>
-      </w:r>
-      <w:proofErr w:type="gramStart"/>
-      <w:r>
-        <w:t>project</w:t>
-      </w:r>
-      <w:proofErr w:type="gramEnd"/>
-      <w:r>
-        <w:t xml:space="preserve"> swap to the </w:t>
-      </w:r>
-      <w:proofErr w:type="spellStart"/>
-      <w:r>
-        <w:t>ballscrew</w:t>
-      </w:r>
-      <w:proofErr w:type="spellEnd"/>
-      <w:r>
-        <w:t xml:space="preserve"> project.</w:t>
-      </w:r>
-      <w:r>
-        <w:br/>
-      </w:r>
-      <w:r>
-        <w:br/>
-        <w:t xml:space="preserve">For your presentation, show the axis configuration for homing settings, when to use </w:t>
-      </w:r>
-      <w:proofErr w:type="spellStart"/>
-      <w:r>
-        <w:t>MC_Home</w:t>
-      </w:r>
-      <w:proofErr w:type="spellEnd"/>
-      <w:r>
-        <w:t xml:space="preserve"> vs the advanced homing library, and the difference between collision avoidance modes.</w:t>
+        <w:t>After this project swap to the ballscrew project.</w:t>
+      </w:r>
+      <w:r>
+        <w:br/>
+      </w:r>
+      <w:r>
+        <w:br/>
+        <w:t>For your presentation, show the axis configuration for homing settings, when to use MC_Home vs the advanced homing library, and the difference between collision avoidance modes.</w:t>
       </w:r>
     </w:p>
     <w:p>
@@ -398,15 +279,7 @@
     </w:p>
     <w:p>
       <w:r>
-        <w:t>Download the SPT camming example and copy the "</w:t>
-      </w:r>
-      <w:proofErr w:type="spellStart"/>
-      <w:r>
-        <w:t>CamModule_UpdateTable</w:t>
-      </w:r>
-      <w:proofErr w:type="spellEnd"/>
-      <w:r>
-        <w:t>" folder into our project.</w:t>
+        <w:t>Download the SPT camming example and copy the "CamModule_UpdateTable" folder into our project.</w:t>
       </w:r>
       <w:r>
         <w:br/>
@@ -421,100 +294,23 @@
     </w:p>
     <w:p>
       <w:r>
-        <w:t>Either create a cam table or edit the "</w:t>
-      </w:r>
-      <w:proofErr w:type="spellStart"/>
-      <w:r>
-        <w:t>WriteCamParameters</w:t>
-      </w:r>
-      <w:proofErr w:type="spellEnd"/>
-      <w:r>
-        <w:t xml:space="preserve">" methods to create a cam that advances the cam slave axis one "pocket" every </w:t>
-      </w:r>
-      <w:proofErr w:type="gramStart"/>
-      <w:r>
-        <w:t>180 degree</w:t>
-      </w:r>
-      <w:proofErr w:type="gramEnd"/>
-      <w:r>
-        <w:t xml:space="preserve"> rotation.  The top gear has 20 pockets and both axes are the same diameter - use this to calculate the angular length of the synchronous zone.  I </w:t>
-      </w:r>
-      <w:proofErr w:type="gramStart"/>
-      <w:r>
-        <w:t>wasn't able to</w:t>
-      </w:r>
-      <w:proofErr w:type="gramEnd"/>
-      <w:r>
-        <w:t xml:space="preserve"> figure out how to get the </w:t>
-      </w:r>
-      <w:proofErr w:type="spellStart"/>
-      <w:r>
-        <w:t>CamSlave</w:t>
-      </w:r>
-      <w:proofErr w:type="spellEnd"/>
-      <w:r>
-        <w:t xml:space="preserve"> FB to use a cam table from the NC, </w:t>
-      </w:r>
-      <w:proofErr w:type="gramStart"/>
-      <w:r>
-        <w:t>so</w:t>
-      </w:r>
-      <w:proofErr w:type="gramEnd"/>
-      <w:r>
-        <w:t xml:space="preserve"> not sure if it's possible</w:t>
-      </w:r>
-    </w:p>
-    <w:p>
-      <w:r>
-        <w:t xml:space="preserve">Hints for editing </w:t>
-      </w:r>
-      <w:proofErr w:type="spellStart"/>
-      <w:r>
-        <w:t>WriteCamParameters</w:t>
-      </w:r>
-      <w:proofErr w:type="spellEnd"/>
+        <w:t>Either create a cam table or edit the "WriteCamParameters" methods to create a cam that advances the cam slave axis one "pocket" every 180 degree rotation.  The top gear has 20 pockets and both axes are the same diameter - use this to calculate the angular length of the synchronous zone.  I wasn't able to figure out how to get the CamSlave FB to use a cam table from the NC, so not sure if it's possible</w:t>
+      </w:r>
+    </w:p>
+    <w:p>
+      <w:r>
+        <w:t>Hints for editing WriteCamParameters</w:t>
+      </w:r>
       <w:r>
         <w:t xml:space="preserve"> - </w:t>
       </w:r>
       <w:r>
-        <w:t xml:space="preserve">See </w:t>
-      </w:r>
-      <w:proofErr w:type="spellStart"/>
-      <w:r>
-        <w:t>infosys</w:t>
-      </w:r>
-      <w:proofErr w:type="spellEnd"/>
-      <w:r>
-        <w:t xml:space="preserve"> "</w:t>
-      </w:r>
-      <w:proofErr w:type="spellStart"/>
-      <w:r>
-        <w:t>MC_MotionFunctionType</w:t>
-      </w:r>
-      <w:proofErr w:type="spellEnd"/>
-      <w:r>
-        <w:t xml:space="preserve">" </w:t>
-      </w:r>
-    </w:p>
-    <w:p>
-      <w:r>
-        <w:t xml:space="preserve">"Upload Cam" into cam table to see position, velocity, accel </w:t>
-      </w:r>
-      <w:proofErr w:type="spellStart"/>
-      <w:r>
-        <w:t>etc</w:t>
-      </w:r>
-      <w:proofErr w:type="spellEnd"/>
-      <w:r>
-        <w:t xml:space="preserve"> comparisons to see if you made the </w:t>
-      </w:r>
-      <w:proofErr w:type="gramStart"/>
-      <w:r>
-        <w:t>table</w:t>
-      </w:r>
-      <w:proofErr w:type="gramEnd"/>
-      <w:r>
-        <w:t xml:space="preserve"> you think you did.</w:t>
+        <w:t xml:space="preserve">See infosys "MC_MotionFunctionType" </w:t>
+      </w:r>
+    </w:p>
+    <w:p>
+      <w:r>
+        <w:t>"Upload Cam" into cam table to see position, velocity, accel etc comparisons to see if you made the table you think you did.</w:t>
       </w:r>
     </w:p>
     <w:p>
@@ -524,49 +320,17 @@
     </w:p>
     <w:p>
       <w:r>
-        <w:t xml:space="preserve">If you have extra time, edit the </w:t>
-      </w:r>
-      <w:proofErr w:type="spellStart"/>
-      <w:r>
-        <w:t>CamModule</w:t>
-      </w:r>
-      <w:proofErr w:type="spellEnd"/>
-      <w:r>
-        <w:t xml:space="preserve"> to change functionality depending on machine mode.  If in maintenance mode, have it gear in instead of running a cam.  </w:t>
-      </w:r>
-    </w:p>
-    <w:p>
-      <w:r>
-        <w:t xml:space="preserve">After this project </w:t>
-      </w:r>
-      <w:proofErr w:type="gramStart"/>
-      <w:r>
-        <w:t>swap to</w:t>
-      </w:r>
-      <w:proofErr w:type="gramEnd"/>
-      <w:r>
-        <w:t xml:space="preserve"> the belt indexing project.</w:t>
-      </w:r>
-    </w:p>
-    <w:p>
-      <w:r>
-        <w:t xml:space="preserve">For your presentation, discuss where to save the NC offset (drive or encoder?) and the cam table you created or the edits </w:t>
-      </w:r>
-      <w:proofErr w:type="gramStart"/>
-      <w:r>
-        <w:t>you  made</w:t>
-      </w:r>
-      <w:proofErr w:type="gramEnd"/>
-      <w:r>
-        <w:t xml:space="preserve"> to the "</w:t>
-      </w:r>
-      <w:proofErr w:type="spellStart"/>
-      <w:r>
-        <w:t>WriteCamParameters</w:t>
-      </w:r>
-      <w:proofErr w:type="spellEnd"/>
-      <w:r>
-        <w:t>" methods and show it running with the middle inserts in place if you got that far</w:t>
+        <w:t xml:space="preserve">If you have extra time, edit the CamModule to change functionality depending on machine mode.  If in maintenance mode, have it gear in instead of running a cam.  </w:t>
+      </w:r>
+    </w:p>
+    <w:p>
+      <w:r>
+        <w:t>After this project swap to the belt indexing project.</w:t>
+      </w:r>
+    </w:p>
+    <w:p>
+      <w:r>
+        <w:t>For your presentation, discuss where to save the NC offset (drive or encoder?) and the cam table you created or the edits you  made to the "WriteCamParameters" methods and show it running with the middle inserts in place if you got that far</w:t>
       </w:r>
     </w:p>
     <w:p>
@@ -617,23 +381,7 @@
     </w:p>
     <w:p>
       <w:r>
-        <w:t xml:space="preserve">The belt is a timing belt with 5mm pitch between teeth.  The belt pulleys have 24 </w:t>
-      </w:r>
-      <w:proofErr w:type="gramStart"/>
-      <w:r>
-        <w:t>teeth</w:t>
-      </w:r>
-      <w:proofErr w:type="gramEnd"/>
-      <w:r>
-        <w:t xml:space="preserve"> and the gear ratio of the gears is 2:1 (2 rotations of the motor = 1 rotation of the pulley).  The belt has 120 teeth.  There is a 420mm offset from the registration mark sensor to the marks to index </w:t>
-      </w:r>
-      <w:proofErr w:type="gramStart"/>
-      <w:r>
-        <w:t>to</w:t>
-      </w:r>
-      <w:proofErr w:type="gramEnd"/>
-      <w:r>
-        <w:t xml:space="preserve">. </w:t>
+        <w:t xml:space="preserve">The belt is a timing belt with 5mm pitch between teeth.  The belt pulleys have 24 teeth and the gear ratio of the gears is 2:1 (2 rotations of the motor = 1 rotation of the pulley).  The belt has 120 teeth.  There is a 420mm offset from the registration mark sensor to the marks to index to. </w:t>
       </w:r>
       <w:r>
         <w:br/>
@@ -645,15 +393,7 @@
     </w:p>
     <w:p>
       <w:r>
-        <w:t xml:space="preserve">In the running routine, move in the positive direction, where the belt side facing you is moving upwards, at 250mm/s.  Notice in the </w:t>
-      </w:r>
-      <w:proofErr w:type="gramStart"/>
-      <w:r>
-        <w:t>execute</w:t>
-      </w:r>
-      <w:proofErr w:type="gramEnd"/>
-      <w:r>
-        <w:t xml:space="preserve"> routine there is already logic for buffering the registration mark positions.  You must configure the drive inputs and add </w:t>
+        <w:t xml:space="preserve">In the running routine, move in the positive direction, where the belt side facing you is moving upwards, at 250mm/s.  Notice in the execute routine there is already logic for buffering the registration mark positions.  You must configure the drive inputs and add </w:t>
       </w:r>
       <w:r>
         <w:t>touch probe functionality to buffer the positions and index to them.</w:t>
@@ -666,21 +406,13 @@
     </w:p>
     <w:p>
       <w:r>
-        <w:t>Registration Mark wiring</w:t>
-      </w:r>
-      <w:proofErr w:type="gramStart"/>
-      <w:r>
-        <w:t xml:space="preserve">: </w:t>
-      </w:r>
-      <w:r>
-        <w:tab/>
-      </w:r>
-      <w:r>
-        <w:t>Brown</w:t>
-      </w:r>
-      <w:proofErr w:type="gramEnd"/>
-      <w:r>
-        <w:t xml:space="preserve"> +</w:t>
+        <w:t xml:space="preserve">Registration Mark wiring: </w:t>
+      </w:r>
+      <w:r>
+        <w:tab/>
+      </w:r>
+      <w:r>
+        <w:t>Brown +</w:t>
       </w:r>
       <w:r>
         <w:t>24vdc, Blue 0vdc, white signal</w:t>
@@ -780,15 +512,7 @@
     </w:p>
     <w:p>
       <w:r>
-        <w:t xml:space="preserve">Get the system into the executing state and view the images that are taken.  You should see a lot of </w:t>
-      </w:r>
-      <w:proofErr w:type="gramStart"/>
-      <w:r>
-        <w:t>variance</w:t>
-      </w:r>
-      <w:proofErr w:type="gramEnd"/>
-      <w:r>
-        <w:t xml:space="preserve"> in the can position.  </w:t>
+        <w:t xml:space="preserve">Get the system into the executing state and view the images that are taken.  You should see a lot of variance in the can position.  </w:t>
       </w:r>
       <w:r>
         <w:t>The default settings spin the can at 500 degrees per second.  Increase this to 1000 degrees per second, then to 2000.  You should see that the error in the camera trigger timing is a function of speed (among other things).  Note for the sake of emphasis, the plc code is running at 100ms</w:t>
@@ -854,15 +578,7 @@
     </w:p>
     <w:p>
       <w:r>
-        <w:t xml:space="preserve">You have the change camera trigger settings in the configuration window as shown above to switch between software trigger (starter project) and </w:t>
-      </w:r>
-      <w:proofErr w:type="spellStart"/>
-      <w:r>
-        <w:t>ethercat</w:t>
-      </w:r>
-      <w:proofErr w:type="spellEnd"/>
-      <w:r>
-        <w:t xml:space="preserve"> </w:t>
+        <w:t xml:space="preserve">You have the change camera trigger settings in the configuration window as shown above to switch between software trigger (starter project) and ethercat </w:t>
       </w:r>
       <w:r>
         <w:t xml:space="preserve">timestamp </w:t>
@@ -877,23 +593,7 @@
     <w:p>
       <w:r>
         <w:lastRenderedPageBreak/>
-        <w:t xml:space="preserve">The XFC blocks are non-modulo.  Use the function MODTURNS in tc2_math to get the current number of turns of the axis based on the set position.  You can do some math with this value to determine a non-modulo target trigger position along with your capture angle.  You feed this position into the XFC block, but the XFC block outputs a </w:t>
-      </w:r>
-      <w:proofErr w:type="gramStart"/>
-      <w:r>
-        <w:t>32 bit</w:t>
-      </w:r>
-      <w:proofErr w:type="gramEnd"/>
-      <w:r>
-        <w:t xml:space="preserve"> DC time, whereas the camera expects a 64 bit.  There’s a function in the XFC library to convert the </w:t>
-      </w:r>
-      <w:proofErr w:type="gramStart"/>
-      <w:r>
-        <w:t>32 bit</w:t>
-      </w:r>
-      <w:proofErr w:type="gramEnd"/>
-      <w:r>
-        <w:t xml:space="preserve"> time to 64.</w:t>
+        <w:t>The XFC blocks are non-modulo.  Use the function MODTURNS in tc2_math to get the current number of turns of the axis based on the set position.  You can do some math with this value to determine a non-modulo target trigger position along with your capture angle.  You feed this position into the XFC block, but the XFC block outputs a 32 bit DC time, whereas the camera expects a 64 bit.  There’s a function in the XFC library to convert the 32 bit time to 64.</w:t>
       </w:r>
     </w:p>
     <w:p/>
@@ -902,48 +602,16 @@
         <w:t>After implementing this</w:t>
       </w:r>
       <w:r>
-        <w:t xml:space="preserve"> you should see very little jitter on the can position when the image is taken.  Force the speed to 2000 from default (500) and execution state back to 0, you will see can speed up.  If you didn’t configure the XFC block to account for acceleration you will see some misses while the axis accelerates, but when it gets to its new target velocity, it should be very close to the position the </w:t>
-      </w:r>
-      <w:proofErr w:type="gramStart"/>
-      <w:r>
-        <w:t>images were</w:t>
-      </w:r>
-      <w:proofErr w:type="gramEnd"/>
-      <w:r>
-        <w:t xml:space="preserve"> showing at 500 </w:t>
-      </w:r>
-      <w:proofErr w:type="gramStart"/>
-      <w:r>
-        <w:t>velocity</w:t>
-      </w:r>
-      <w:proofErr w:type="gramEnd"/>
-      <w:r>
-        <w:t xml:space="preserve">.  I saw a small difference.  </w:t>
+        <w:t xml:space="preserve"> you should see very little jitter on the can position when the image is taken.  Force the speed to 2000 from default (500) and execution state back to 0, you will see can speed up.  If you didn’t configure the XFC block to account for acceleration you will see some misses while the axis accelerates, but when it gets to its new target velocity, it should be very close to the position the images were showing at 500 velocity.  I saw a small difference.  </w:t>
       </w:r>
     </w:p>
     <w:p/>
     <w:p>
       <w:r>
-        <w:t xml:space="preserve">In your discussion at the end of the session </w:t>
-      </w:r>
-      <w:proofErr w:type="gramStart"/>
-      <w:r>
-        <w:t>discuss</w:t>
-      </w:r>
-      <w:proofErr w:type="gramEnd"/>
-      <w:r>
-        <w:t xml:space="preserve"> the fundamentals of the changes you made and your results.</w:t>
-      </w:r>
-      <w:r>
-        <w:t xml:space="preserve">  Try to get group discussion about how to further minimize </w:t>
-      </w:r>
-      <w:proofErr w:type="gramStart"/>
-      <w:r>
-        <w:t>difference</w:t>
-      </w:r>
-      <w:proofErr w:type="gramEnd"/>
-      <w:r>
-        <w:t xml:space="preserve"> of trigger positions and low and high velocities.</w:t>
+        <w:t>In your discussion at the end of the session discuss the fundamentals of the changes you made and your results.</w:t>
+      </w:r>
+      <w:r>
+        <w:t xml:space="preserve">  Try to get group discussion about how to further minimize difference of trigger positions and low and high velocities.</w:t>
       </w:r>
     </w:p>
     <w:p>
@@ -1009,40 +677,15 @@
     </w:p>
     <w:p>
       <w:r>
-        <w:t xml:space="preserve">Scan in the AX5000 unit and the motors.  You’ll see only </w:t>
-      </w:r>
-      <w:proofErr w:type="gramStart"/>
-      <w:r>
-        <w:t>the channel</w:t>
-      </w:r>
-      <w:proofErr w:type="gramEnd"/>
-      <w:r>
-        <w:t xml:space="preserve"> B motor has an electronic nameplate.  Use </w:t>
-      </w:r>
-      <w:proofErr w:type="gramStart"/>
-      <w:r>
-        <w:t>drive manager</w:t>
-      </w:r>
-      <w:proofErr w:type="gramEnd"/>
-      <w:r>
-        <w:t xml:space="preserve"> 2 to select the motor for channel A.  </w:t>
-      </w:r>
-    </w:p>
-    <w:p>
-      <w:r>
-        <w:t xml:space="preserve">Configure </w:t>
-      </w:r>
-      <w:r>
-        <w:t>one axis to be in torque</w:t>
-      </w:r>
-      <w:r>
-        <w:t xml:space="preserve"> mode and </w:t>
-      </w:r>
-      <w:r>
-        <w:t xml:space="preserve">the other </w:t>
-      </w:r>
-      <w:r>
-        <w:t>in position mode.  Configure both to be rotary axes.</w:t>
+        <w:t xml:space="preserve">Scan in the AX5000 unit and the motors.  You’ll see only the channel B motor has an electronic nameplate.  Use drive manager 2 to select the motor for channel A.  </w:t>
+      </w:r>
+    </w:p>
+    <w:p>
+      <w:r>
+        <w:t>Configure both axes to be in position mode, rotary, with 0-360 degrees position</w:t>
+      </w:r>
+      <w:r>
+        <w:t>.</w:t>
       </w:r>
       <w:r>
         <w:t xml:space="preserve">  Through DM2 start a reversing sequence on the position control axis and tune the controller</w:t>
@@ -1051,47 +694,15 @@
         <w:t>s (one at a time with other disabled)</w:t>
       </w:r>
       <w:r>
-        <w:t xml:space="preserve"> to be </w:t>
-      </w:r>
-      <w:proofErr w:type="gramStart"/>
-      <w:r>
-        <w:t>pretty stiff</w:t>
-      </w:r>
-      <w:proofErr w:type="gramEnd"/>
-      <w:r>
-        <w:t>.</w:t>
-      </w:r>
-    </w:p>
-    <w:p>
-      <w:r>
-        <w:t xml:space="preserve">Now follow Matt Prellwitz’s guide on the wiki for </w:t>
-      </w:r>
-      <w:proofErr w:type="spellStart"/>
-      <w:r>
-        <w:t>MC_TorqueControl</w:t>
-      </w:r>
-      <w:proofErr w:type="spellEnd"/>
-      <w:r>
-        <w:t xml:space="preserve"> on an AX5000</w:t>
-      </w:r>
-      <w:r>
-        <w:t xml:space="preserve"> titled “AX5000 </w:t>
-      </w:r>
-      <w:proofErr w:type="spellStart"/>
-      <w:r>
-        <w:t>MC_TorqueControlSetup</w:t>
-      </w:r>
-      <w:proofErr w:type="spellEnd"/>
-      <w:r>
-        <w:t>” and implement logic for “</w:t>
-      </w:r>
-      <w:proofErr w:type="spellStart"/>
-      <w:r>
-        <w:t>TorqueAxis</w:t>
-      </w:r>
-      <w:proofErr w:type="spellEnd"/>
-      <w:r>
-        <w:t xml:space="preserve">” to apply a constant </w:t>
+        <w:t xml:space="preserve"> to be pretty stiff.</w:t>
+      </w:r>
+    </w:p>
+    <w:p>
+      <w:r>
+        <w:t>Now follow Matt Prellwitz’s guide on the wiki for MC_TorqueControl on an AX5000</w:t>
+      </w:r>
+      <w:r>
+        <w:t xml:space="preserve"> titled “AX5000 MC_TorqueControlSetup” and implement logic for “TorqueAxis” to apply a constant </w:t>
       </w:r>
       <w:r>
         <w:t xml:space="preserve">0.12NM </w:t>
@@ -1100,15 +711,7 @@
         <w:t>torque.</w:t>
       </w:r>
       <w:r>
-        <w:t xml:space="preserve"> Additionally add logic to the relevant “acting states” for the </w:t>
-      </w:r>
-      <w:proofErr w:type="spellStart"/>
-      <w:r>
-        <w:t>TorqueAxis</w:t>
-      </w:r>
-      <w:proofErr w:type="spellEnd"/>
-      <w:r>
-        <w:t xml:space="preserve"> now.</w:t>
+        <w:t xml:space="preserve"> Additionally add logic to the relevant “acting states” for the TorqueAxis now.</w:t>
       </w:r>
     </w:p>
     <w:p>
@@ -1118,15 +721,7 @@
     </w:p>
     <w:p>
       <w:r>
-        <w:t xml:space="preserve">Lastly, add logic in the executing sequence for manual mode, that simply disables the position axis.  You should see the torque axis accelerate to the velocity limit.  The torque </w:t>
-      </w:r>
-      <w:proofErr w:type="gramStart"/>
-      <w:r>
-        <w:t>has to</w:t>
-      </w:r>
-      <w:proofErr w:type="gramEnd"/>
-      <w:r>
-        <w:t xml:space="preserve"> be high enough to accelerate.</w:t>
+        <w:t>Lastly, add logic in the executing sequence for manual mode, that simply disables the position axis.  You should see the torque axis accelerate to the velocity limit.  The torque has to be high enough to accelerate.</w:t>
       </w:r>
     </w:p>
     <w:p>
@@ -1176,21 +771,8 @@
     </w:p>
     <w:p/>
     <w:p>
-      <w:proofErr w:type="spellStart"/>
-      <w:r>
-        <w:t>Ballscrew</w:t>
-      </w:r>
-      <w:proofErr w:type="spellEnd"/>
-      <w:r>
-        <w:t xml:space="preserve"> – Nick making a lab with ax8000, </w:t>
-      </w:r>
-      <w:proofErr w:type="spellStart"/>
-      <w:r>
-        <w:t>ballscrew</w:t>
-      </w:r>
-      <w:proofErr w:type="spellEnd"/>
-      <w:r>
-        <w:t xml:space="preserve">, </w:t>
+      <w:r>
+        <w:t xml:space="preserve">Ballscrew – Nick making a lab with ax8000, ballscrew, </w:t>
       </w:r>
       <w:r>
         <w:t>limit switches</w:t>
@@ -1283,13 +865,8 @@
         <w:t>Nick and Alina</w:t>
       </w:r>
       <w:r>
-        <w:t xml:space="preserve"> – rack and pinion/</w:t>
-      </w:r>
-      <w:proofErr w:type="spellStart"/>
-      <w:r>
-        <w:t>ballscrew</w:t>
-      </w:r>
-      <w:proofErr w:type="spellEnd"/>
+        <w:t xml:space="preserve"> – rack and pinion/ballscrew</w:t>
+      </w:r>
       <w:r>
         <w:br/>
       </w:r>

</xml_diff>

<commit_message>
updated docs for rack and pinion
</commit_message>
<xml_diff>
--- a/Instructions.docx
+++ b/Instructions.docx
@@ -26,20 +26,50 @@
       </w:pPr>
     </w:p>
     <w:p>
-      <w:r>
-        <w:rPr>
-          <w:b/>
-          <w:bCs/>
-        </w:rPr>
-        <w:t>Requirements : new TC 4026, PTP and advanced motion pack, drive manager 2, scope, vision</w:t>
-      </w:r>
-    </w:p>
-    <w:p>
-      <w:r>
-        <w:t xml:space="preserve">A sample project is provided that includes a generic SPT framework structure with a machine module implemented and visu interface.  </w:t>
-      </w:r>
-      <w:r>
-        <w:t xml:space="preserve">Hardare is scanned in, and twinsafe is set up but you will need to use drive manager to configure the axes to do your project.  </w:t>
+      <w:proofErr w:type="gramStart"/>
+      <w:r>
+        <w:rPr>
+          <w:b/>
+          <w:bCs/>
+        </w:rPr>
+        <w:t>Requirements :</w:t>
+      </w:r>
+      <w:proofErr w:type="gramEnd"/>
+      <w:r>
+        <w:rPr>
+          <w:b/>
+          <w:bCs/>
+        </w:rPr>
+        <w:t xml:space="preserve"> new TC 4026, PTP and advanced motion pack, drive manager 2, scope, vision</w:t>
+      </w:r>
+    </w:p>
+    <w:p>
+      <w:r>
+        <w:t xml:space="preserve">A sample project is provided that includes a generic SPT framework structure with a machine module implemented and </w:t>
+      </w:r>
+      <w:proofErr w:type="spellStart"/>
+      <w:r>
+        <w:t>visu</w:t>
+      </w:r>
+      <w:proofErr w:type="spellEnd"/>
+      <w:r>
+        <w:t xml:space="preserve"> interface.  </w:t>
+      </w:r>
+      <w:proofErr w:type="spellStart"/>
+      <w:r>
+        <w:t>Hardare</w:t>
+      </w:r>
+      <w:proofErr w:type="spellEnd"/>
+      <w:r>
+        <w:t xml:space="preserve"> is scanned in, and </w:t>
+      </w:r>
+      <w:proofErr w:type="spellStart"/>
+      <w:r>
+        <w:t>twinsafe</w:t>
+      </w:r>
+      <w:proofErr w:type="spellEnd"/>
+      <w:r>
+        <w:t xml:space="preserve"> is set up but you will need to use drive manager to configure the axes to do your project.  </w:t>
       </w:r>
       <w:r>
         <w:t xml:space="preserve">The goal is to </w:t>
@@ -51,7 +81,15 @@
         <w:t xml:space="preserve">equipment module </w:t>
       </w:r>
       <w:r>
-        <w:t>in your start project and add functionality to accomplish your project goals.  Each project already has a machine module with visu interface connected, and an equipment module</w:t>
+        <w:t xml:space="preserve">in your start project and add functionality to accomplish your project goals.  Each project already has a machine module with </w:t>
+      </w:r>
+      <w:proofErr w:type="spellStart"/>
+      <w:r>
+        <w:t>visu</w:t>
+      </w:r>
+      <w:proofErr w:type="spellEnd"/>
+      <w:r>
+        <w:t xml:space="preserve"> interface connected, and an equipment module</w:t>
       </w:r>
       <w:r>
         <w:t xml:space="preserve"> </w:t>
@@ -79,7 +117,15 @@
         <w:t>SECOND</w:t>
       </w:r>
       <w:r>
-        <w:t xml:space="preserve"> lab they did.  Explain the project, the steps you did to make it work, and try to elicit a conversation about the topic for everyone to discuss (as a group) more intricate details of the topics.  i.e. inner workings of the advanced homing library (for rack and pinion project), or the time base of the XFC output for the vision lab.</w:t>
+        <w:t xml:space="preserve"> lab they did.  Explain the project, the steps you </w:t>
+      </w:r>
+      <w:proofErr w:type="gramStart"/>
+      <w:r>
+        <w:t>did</w:t>
+      </w:r>
+      <w:proofErr w:type="gramEnd"/>
+      <w:r>
+        <w:t xml:space="preserve"> to make it work, and try to elicit a conversation about the topic for everyone to discuss (as a group) more intricate details of the topics.  i.e. inner workings of the advanced homing library (for rack and pinion project), or the time base of the XFC output for the vision lab.</w:t>
       </w:r>
     </w:p>
     <w:p>
@@ -94,8 +140,17 @@
           <w:b/>
           <w:bCs/>
         </w:rPr>
-        <w:t>Rack and pinion</w:t>
-      </w:r>
+        <w:t xml:space="preserve">Rack and </w:t>
+      </w:r>
+      <w:proofErr w:type="gramStart"/>
+      <w:r>
+        <w:rPr>
+          <w:b/>
+          <w:bCs/>
+        </w:rPr>
+        <w:t>pinion</w:t>
+      </w:r>
+      <w:proofErr w:type="gramEnd"/>
       <w:r>
         <w:rPr>
           <w:b/>
@@ -155,7 +210,15 @@
       </w:r>
       <w:r>
         <w:br/>
-        <w:t>Accel/Decel 1,000 mm/s</w:t>
+        <w:t>Accel/</w:t>
+      </w:r>
+      <w:proofErr w:type="spellStart"/>
+      <w:r>
+        <w:t>Decel</w:t>
+      </w:r>
+      <w:proofErr w:type="spellEnd"/>
+      <w:r>
+        <w:t xml:space="preserve"> 1,000 mm/s</w:t>
       </w:r>
       <w:r>
         <w:br/>
@@ -164,7 +227,23 @@
     </w:p>
     <w:p>
       <w:r>
-        <w:t xml:space="preserve">Write homing routines that implement I_MotionSequence according to the SPT documentation to home each axis.  The left servo homes to a home switch at position </w:t>
+        <w:t xml:space="preserve">Write </w:t>
+      </w:r>
+      <w:proofErr w:type="gramStart"/>
+      <w:r>
+        <w:t>homing</w:t>
+      </w:r>
+      <w:proofErr w:type="gramEnd"/>
+      <w:r>
+        <w:t xml:space="preserve"> routines that implement </w:t>
+      </w:r>
+      <w:proofErr w:type="spellStart"/>
+      <w:r>
+        <w:t>I_MotionSequence</w:t>
+      </w:r>
+      <w:proofErr w:type="spellEnd"/>
+      <w:r>
+        <w:t xml:space="preserve"> according to the SPT documentation to home each axis.  The left servo homes to a home switch at position </w:t>
       </w:r>
       <w:r>
         <w:rPr>
@@ -194,7 +273,23 @@
         <w:t>50%</w:t>
       </w:r>
       <w:r>
-        <w:t xml:space="preserve">.  Use 50mm/s for the homing velocity for both methods, accel/decel of 1k, and jerk of 10k. Follow the SPT motion documentation to create a homing routine that implements I_MotionSequence to complete the homing process and then trigger the homing in </w:t>
+        <w:t>.  Use 50mm/s for the homing velocity for both methods, accel/</w:t>
+      </w:r>
+      <w:proofErr w:type="spellStart"/>
+      <w:r>
+        <w:t>decel</w:t>
+      </w:r>
+      <w:proofErr w:type="spellEnd"/>
+      <w:r>
+        <w:t xml:space="preserve"> of 1k, and jerk of 10k. Follow the SPT motion documentation to create a homing routine that implements </w:t>
+      </w:r>
+      <w:proofErr w:type="spellStart"/>
+      <w:r>
+        <w:t>I_MotionSequence</w:t>
+      </w:r>
+      <w:proofErr w:type="spellEnd"/>
+      <w:r>
+        <w:t xml:space="preserve"> to complete the homing process and then trigger the homing in </w:t>
       </w:r>
       <w:r>
         <w:t>starting</w:t>
@@ -211,19 +306,64 @@
     </w:p>
     <w:p>
       <w:r>
+        <w:t>The guide “</w:t>
+      </w:r>
+      <w:hyperlink r:id="rId4" w:history="1">
+        <w:r>
+          <w:t xml:space="preserve">AX8000: Setup </w:t>
+        </w:r>
+        <w:proofErr w:type="spellStart"/>
+        <w:r>
+          <w:t>MC_Home</w:t>
+        </w:r>
+        <w:proofErr w:type="spellEnd"/>
+        <w:r>
+          <w:t xml:space="preserve"> with touch probe input</w:t>
+        </w:r>
+      </w:hyperlink>
+      <w:r>
+        <w:t>” on our wiki is helpful to reference if needed</w:t>
+      </w:r>
+    </w:p>
+    <w:p>
+      <w:r>
         <w:t>In the Execute routine both motors are moved left and right to the positions 50 and 450 showing collision avoidance taking priority over the move commands.  The starter code has them set to a gap with an extra 10mm of space.  Add logic to change the collision avoidance mode the axes use depending on if they're moving left or right.  The difference should be visible.</w:t>
       </w:r>
     </w:p>
     <w:p>
       <w:r>
-        <w:t>After this project swap to the ballscrew project.</w:t>
-      </w:r>
-      <w:r>
-        <w:br/>
-      </w:r>
-      <w:r>
-        <w:br/>
-        <w:t>For your presentation, show the axis configuration for homing settings, when to use MC_Home vs the advanced homing library, and the difference between collision avoidance modes.</w:t>
+        <w:t xml:space="preserve">After this </w:t>
+      </w:r>
+      <w:proofErr w:type="gramStart"/>
+      <w:r>
+        <w:t>project</w:t>
+      </w:r>
+      <w:proofErr w:type="gramEnd"/>
+      <w:r>
+        <w:t xml:space="preserve"> swap to the </w:t>
+      </w:r>
+      <w:proofErr w:type="spellStart"/>
+      <w:r>
+        <w:t>ballscrew</w:t>
+      </w:r>
+      <w:proofErr w:type="spellEnd"/>
+      <w:r>
+        <w:t xml:space="preserve"> project.</w:t>
+      </w:r>
+      <w:r>
+        <w:br/>
+      </w:r>
+      <w:r>
+        <w:br/>
+        <w:t xml:space="preserve">For your presentation, show the axis configuration for homing settings, when to use </w:t>
+      </w:r>
+      <w:proofErr w:type="spellStart"/>
+      <w:r>
+        <w:t>MC_Home</w:t>
+      </w:r>
+      <w:proofErr w:type="spellEnd"/>
+      <w:r>
+        <w:t xml:space="preserve"> vs the advanced homing library, and the difference between collision avoidance modes.</w:t>
       </w:r>
     </w:p>
     <w:p>
@@ -279,7 +419,15 @@
     </w:p>
     <w:p>
       <w:r>
-        <w:t>Download the SPT camming example and copy the "CamModule_UpdateTable" folder into our project.</w:t>
+        <w:t>Download the SPT camming example and copy the "</w:t>
+      </w:r>
+      <w:proofErr w:type="spellStart"/>
+      <w:r>
+        <w:t>CamModule_UpdateTable</w:t>
+      </w:r>
+      <w:proofErr w:type="spellEnd"/>
+      <w:r>
+        <w:t>" folder into our project.</w:t>
       </w:r>
       <w:r>
         <w:br/>
@@ -294,23 +442,100 @@
     </w:p>
     <w:p>
       <w:r>
-        <w:t>Either create a cam table or edit the "WriteCamParameters" methods to create a cam that advances the cam slave axis one "pocket" every 180 degree rotation.  The top gear has 20 pockets and both axes are the same diameter - use this to calculate the angular length of the synchronous zone.  I wasn't able to figure out how to get the CamSlave FB to use a cam table from the NC, so not sure if it's possible</w:t>
-      </w:r>
-    </w:p>
-    <w:p>
-      <w:r>
-        <w:t>Hints for editing WriteCamParameters</w:t>
-      </w:r>
+        <w:t>Either create a cam table or edit the "</w:t>
+      </w:r>
+      <w:proofErr w:type="spellStart"/>
+      <w:r>
+        <w:t>WriteCamParameters</w:t>
+      </w:r>
+      <w:proofErr w:type="spellEnd"/>
+      <w:r>
+        <w:t xml:space="preserve">" methods to create a cam that advances the cam slave axis one "pocket" every </w:t>
+      </w:r>
+      <w:proofErr w:type="gramStart"/>
+      <w:r>
+        <w:t>180 degree</w:t>
+      </w:r>
+      <w:proofErr w:type="gramEnd"/>
+      <w:r>
+        <w:t xml:space="preserve"> rotation.  The top gear has 20 pockets and both axes are the same diameter - use this to calculate the angular length of the synchronous zone.  I </w:t>
+      </w:r>
+      <w:proofErr w:type="gramStart"/>
+      <w:r>
+        <w:t>wasn't able to</w:t>
+      </w:r>
+      <w:proofErr w:type="gramEnd"/>
+      <w:r>
+        <w:t xml:space="preserve"> figure out how to get the </w:t>
+      </w:r>
+      <w:proofErr w:type="spellStart"/>
+      <w:r>
+        <w:t>CamSlave</w:t>
+      </w:r>
+      <w:proofErr w:type="spellEnd"/>
+      <w:r>
+        <w:t xml:space="preserve"> FB to use a cam table from the NC, </w:t>
+      </w:r>
+      <w:proofErr w:type="gramStart"/>
+      <w:r>
+        <w:t>so</w:t>
+      </w:r>
+      <w:proofErr w:type="gramEnd"/>
+      <w:r>
+        <w:t xml:space="preserve"> not sure if it's possible</w:t>
+      </w:r>
+    </w:p>
+    <w:p>
+      <w:r>
+        <w:t xml:space="preserve">Hints for editing </w:t>
+      </w:r>
+      <w:proofErr w:type="spellStart"/>
+      <w:r>
+        <w:t>WriteCamParameters</w:t>
+      </w:r>
+      <w:proofErr w:type="spellEnd"/>
       <w:r>
         <w:t xml:space="preserve"> - </w:t>
       </w:r>
       <w:r>
-        <w:t xml:space="preserve">See infosys "MC_MotionFunctionType" </w:t>
-      </w:r>
-    </w:p>
-    <w:p>
-      <w:r>
-        <w:t>"Upload Cam" into cam table to see position, velocity, accel etc comparisons to see if you made the table you think you did.</w:t>
+        <w:t xml:space="preserve">See </w:t>
+      </w:r>
+      <w:proofErr w:type="spellStart"/>
+      <w:r>
+        <w:t>infosys</w:t>
+      </w:r>
+      <w:proofErr w:type="spellEnd"/>
+      <w:r>
+        <w:t xml:space="preserve"> "</w:t>
+      </w:r>
+      <w:proofErr w:type="spellStart"/>
+      <w:r>
+        <w:t>MC_MotionFunctionType</w:t>
+      </w:r>
+      <w:proofErr w:type="spellEnd"/>
+      <w:r>
+        <w:t xml:space="preserve">" </w:t>
+      </w:r>
+    </w:p>
+    <w:p>
+      <w:r>
+        <w:t xml:space="preserve">"Upload Cam" into cam table to see position, velocity, accel </w:t>
+      </w:r>
+      <w:proofErr w:type="spellStart"/>
+      <w:r>
+        <w:t>etc</w:t>
+      </w:r>
+      <w:proofErr w:type="spellEnd"/>
+      <w:r>
+        <w:t xml:space="preserve"> comparisons to see if you made the </w:t>
+      </w:r>
+      <w:proofErr w:type="gramStart"/>
+      <w:r>
+        <w:t>table</w:t>
+      </w:r>
+      <w:proofErr w:type="gramEnd"/>
+      <w:r>
+        <w:t xml:space="preserve"> you think you did.</w:t>
       </w:r>
     </w:p>
     <w:p>
@@ -320,17 +545,49 @@
     </w:p>
     <w:p>
       <w:r>
-        <w:t xml:space="preserve">If you have extra time, edit the CamModule to change functionality depending on machine mode.  If in maintenance mode, have it gear in instead of running a cam.  </w:t>
-      </w:r>
-    </w:p>
-    <w:p>
-      <w:r>
-        <w:t>After this project swap to the belt indexing project.</w:t>
-      </w:r>
-    </w:p>
-    <w:p>
-      <w:r>
-        <w:t>For your presentation, discuss where to save the NC offset (drive or encoder?) and the cam table you created or the edits you  made to the "WriteCamParameters" methods and show it running with the middle inserts in place if you got that far</w:t>
+        <w:t xml:space="preserve">If you have extra time, edit the </w:t>
+      </w:r>
+      <w:proofErr w:type="spellStart"/>
+      <w:r>
+        <w:t>CamModule</w:t>
+      </w:r>
+      <w:proofErr w:type="spellEnd"/>
+      <w:r>
+        <w:t xml:space="preserve"> to change functionality depending on machine mode.  If in maintenance mode, have it gear in instead of running a cam.  </w:t>
+      </w:r>
+    </w:p>
+    <w:p>
+      <w:r>
+        <w:t xml:space="preserve">After this project </w:t>
+      </w:r>
+      <w:proofErr w:type="gramStart"/>
+      <w:r>
+        <w:t>swap to</w:t>
+      </w:r>
+      <w:proofErr w:type="gramEnd"/>
+      <w:r>
+        <w:t xml:space="preserve"> the belt indexing project.</w:t>
+      </w:r>
+    </w:p>
+    <w:p>
+      <w:r>
+        <w:t xml:space="preserve">For your presentation, discuss where to save the NC offset (drive or encoder?) and the cam table you created or the edits </w:t>
+      </w:r>
+      <w:proofErr w:type="gramStart"/>
+      <w:r>
+        <w:t>you  made</w:t>
+      </w:r>
+      <w:proofErr w:type="gramEnd"/>
+      <w:r>
+        <w:t xml:space="preserve"> to the "</w:t>
+      </w:r>
+      <w:proofErr w:type="spellStart"/>
+      <w:r>
+        <w:t>WriteCamParameters</w:t>
+      </w:r>
+      <w:proofErr w:type="spellEnd"/>
+      <w:r>
+        <w:t>" methods and show it running with the middle inserts in place if you got that far</w:t>
       </w:r>
     </w:p>
     <w:p>
@@ -381,7 +638,23 @@
     </w:p>
     <w:p>
       <w:r>
-        <w:t xml:space="preserve">The belt is a timing belt with 5mm pitch between teeth.  The belt pulleys have 24 teeth and the gear ratio of the gears is 2:1 (2 rotations of the motor = 1 rotation of the pulley).  The belt has 120 teeth.  There is a 420mm offset from the registration mark sensor to the marks to index to. </w:t>
+        <w:t xml:space="preserve">The belt is a timing belt with 5mm pitch between teeth.  The belt pulleys have 24 </w:t>
+      </w:r>
+      <w:proofErr w:type="gramStart"/>
+      <w:r>
+        <w:t>teeth</w:t>
+      </w:r>
+      <w:proofErr w:type="gramEnd"/>
+      <w:r>
+        <w:t xml:space="preserve"> and the gear ratio of the gears is 2:1 (2 rotations of the motor = 1 rotation of the pulley).  The belt has 120 teeth.  There is a 420mm offset from the registration mark sensor to the marks to index </w:t>
+      </w:r>
+      <w:proofErr w:type="gramStart"/>
+      <w:r>
+        <w:t>to</w:t>
+      </w:r>
+      <w:proofErr w:type="gramEnd"/>
+      <w:r>
+        <w:t xml:space="preserve">. </w:t>
       </w:r>
       <w:r>
         <w:br/>
@@ -393,7 +666,15 @@
     </w:p>
     <w:p>
       <w:r>
-        <w:t xml:space="preserve">In the running routine, move in the positive direction, where the belt side facing you is moving upwards, at 250mm/s.  Notice in the execute routine there is already logic for buffering the registration mark positions.  You must configure the drive inputs and add </w:t>
+        <w:t xml:space="preserve">In the running routine, move in the positive direction, where the belt side facing you is moving upwards, at 250mm/s.  Notice in the </w:t>
+      </w:r>
+      <w:proofErr w:type="gramStart"/>
+      <w:r>
+        <w:t>execute</w:t>
+      </w:r>
+      <w:proofErr w:type="gramEnd"/>
+      <w:r>
+        <w:t xml:space="preserve"> routine there is already logic for buffering the registration mark positions.  You must configure the drive inputs and add </w:t>
       </w:r>
       <w:r>
         <w:t>touch probe functionality to buffer the positions and index to them.</w:t>
@@ -406,13 +687,21 @@
     </w:p>
     <w:p>
       <w:r>
-        <w:t xml:space="preserve">Registration Mark wiring: </w:t>
+        <w:t>Registration Mark wiring</w:t>
+      </w:r>
+      <w:proofErr w:type="gramStart"/>
+      <w:r>
+        <w:t xml:space="preserve">: </w:t>
       </w:r>
       <w:r>
         <w:tab/>
       </w:r>
       <w:r>
-        <w:t>Brown +</w:t>
+        <w:t>Brown</w:t>
+      </w:r>
+      <w:proofErr w:type="gramEnd"/>
+      <w:r>
+        <w:t xml:space="preserve"> +</w:t>
       </w:r>
       <w:r>
         <w:t>24vdc, Blue 0vdc, white signal</w:t>
@@ -512,7 +801,15 @@
     </w:p>
     <w:p>
       <w:r>
-        <w:t xml:space="preserve">Get the system into the executing state and view the images that are taken.  You should see a lot of variance in the can position.  </w:t>
+        <w:t xml:space="preserve">Get the system into the executing state and view the images that are taken.  You should see a lot of </w:t>
+      </w:r>
+      <w:proofErr w:type="gramStart"/>
+      <w:r>
+        <w:t>variance</w:t>
+      </w:r>
+      <w:proofErr w:type="gramEnd"/>
+      <w:r>
+        <w:t xml:space="preserve"> in the can position.  </w:t>
       </w:r>
       <w:r>
         <w:t>The default settings spin the can at 500 degrees per second.  Increase this to 1000 degrees per second, then to 2000.  You should see that the error in the camera trigger timing is a function of speed (among other things).  Note for the sake of emphasis, the plc code is running at 100ms</w:t>
@@ -550,7 +847,7 @@
                     <pic:cNvPicPr/>
                   </pic:nvPicPr>
                   <pic:blipFill>
-                    <a:blip r:embed="rId4"/>
+                    <a:blip r:embed="rId5"/>
                     <a:stretch>
                       <a:fillRect/>
                     </a:stretch>
@@ -578,7 +875,15 @@
     </w:p>
     <w:p>
       <w:r>
-        <w:t xml:space="preserve">You have the change camera trigger settings in the configuration window as shown above to switch between software trigger (starter project) and ethercat </w:t>
+        <w:t xml:space="preserve">You have the change camera trigger settings in the configuration window as shown above to switch between software trigger (starter project) and </w:t>
+      </w:r>
+      <w:proofErr w:type="spellStart"/>
+      <w:r>
+        <w:t>ethercat</w:t>
+      </w:r>
+      <w:proofErr w:type="spellEnd"/>
+      <w:r>
+        <w:t xml:space="preserve"> </w:t>
       </w:r>
       <w:r>
         <w:t xml:space="preserve">timestamp </w:t>
@@ -593,7 +898,23 @@
     <w:p>
       <w:r>
         <w:lastRenderedPageBreak/>
-        <w:t>The XFC blocks are non-modulo.  Use the function MODTURNS in tc2_math to get the current number of turns of the axis based on the set position.  You can do some math with this value to determine a non-modulo target trigger position along with your capture angle.  You feed this position into the XFC block, but the XFC block outputs a 32 bit DC time, whereas the camera expects a 64 bit.  There’s a function in the XFC library to convert the 32 bit time to 64.</w:t>
+        <w:t xml:space="preserve">The XFC blocks are non-modulo.  Use the function MODTURNS in tc2_math to get the current number of turns of the axis based on the set position.  You can do some math with this value to determine a non-modulo target trigger position along with your capture angle.  You feed this position into the XFC block, but the XFC block outputs a </w:t>
+      </w:r>
+      <w:proofErr w:type="gramStart"/>
+      <w:r>
+        <w:t>32 bit</w:t>
+      </w:r>
+      <w:proofErr w:type="gramEnd"/>
+      <w:r>
+        <w:t xml:space="preserve"> DC time, whereas the camera expects a 64 bit.  There’s a function in the XFC library to convert the </w:t>
+      </w:r>
+      <w:proofErr w:type="gramStart"/>
+      <w:r>
+        <w:t>32 bit</w:t>
+      </w:r>
+      <w:proofErr w:type="gramEnd"/>
+      <w:r>
+        <w:t xml:space="preserve"> time to 64.</w:t>
       </w:r>
     </w:p>
     <w:p/>
@@ -602,16 +923,48 @@
         <w:t>After implementing this</w:t>
       </w:r>
       <w:r>
-        <w:t xml:space="preserve"> you should see very little jitter on the can position when the image is taken.  Force the speed to 2000 from default (500) and execution state back to 0, you will see can speed up.  If you didn’t configure the XFC block to account for acceleration you will see some misses while the axis accelerates, but when it gets to its new target velocity, it should be very close to the position the images were showing at 500 velocity.  I saw a small difference.  </w:t>
+        <w:t xml:space="preserve"> you should see very little jitter on the can position when the image is taken.  Force the speed to 2000 from default (500) and execution state back to 0, you will see can speed up.  If you didn’t configure the XFC block to account for acceleration you will see some misses while the axis accelerates, but when it gets to its new target velocity, it should be very close to the position the </w:t>
+      </w:r>
+      <w:proofErr w:type="gramStart"/>
+      <w:r>
+        <w:t>images were</w:t>
+      </w:r>
+      <w:proofErr w:type="gramEnd"/>
+      <w:r>
+        <w:t xml:space="preserve"> showing at 500 </w:t>
+      </w:r>
+      <w:proofErr w:type="gramStart"/>
+      <w:r>
+        <w:t>velocity</w:t>
+      </w:r>
+      <w:proofErr w:type="gramEnd"/>
+      <w:r>
+        <w:t xml:space="preserve">.  I saw a small difference.  </w:t>
       </w:r>
     </w:p>
     <w:p/>
     <w:p>
       <w:r>
-        <w:t>In your discussion at the end of the session discuss the fundamentals of the changes you made and your results.</w:t>
-      </w:r>
-      <w:r>
-        <w:t xml:space="preserve">  Try to get group discussion about how to further minimize difference of trigger positions and low and high velocities.</w:t>
+        <w:t xml:space="preserve">In your discussion at the end of the session </w:t>
+      </w:r>
+      <w:proofErr w:type="gramStart"/>
+      <w:r>
+        <w:t>discuss</w:t>
+      </w:r>
+      <w:proofErr w:type="gramEnd"/>
+      <w:r>
+        <w:t xml:space="preserve"> the fundamentals of the changes you made and your results.</w:t>
+      </w:r>
+      <w:r>
+        <w:t xml:space="preserve">  Try to get group discussion about how to further minimize </w:t>
+      </w:r>
+      <w:proofErr w:type="gramStart"/>
+      <w:r>
+        <w:t>difference</w:t>
+      </w:r>
+      <w:proofErr w:type="gramEnd"/>
+      <w:r>
+        <w:t xml:space="preserve"> of trigger positions and low and high velocities.</w:t>
       </w:r>
     </w:p>
     <w:p>
@@ -677,7 +1030,23 @@
     </w:p>
     <w:p>
       <w:r>
-        <w:t xml:space="preserve">Scan in the AX5000 unit and the motors.  You’ll see only the channel B motor has an electronic nameplate.  Use drive manager 2 to select the motor for channel A.  </w:t>
+        <w:t xml:space="preserve">Scan in the AX5000 unit and the motors.  You’ll see only </w:t>
+      </w:r>
+      <w:proofErr w:type="gramStart"/>
+      <w:r>
+        <w:t>the channel</w:t>
+      </w:r>
+      <w:proofErr w:type="gramEnd"/>
+      <w:r>
+        <w:t xml:space="preserve"> B motor has an electronic nameplate.  Use </w:t>
+      </w:r>
+      <w:proofErr w:type="gramStart"/>
+      <w:r>
+        <w:t>drive manager</w:t>
+      </w:r>
+      <w:proofErr w:type="gramEnd"/>
+      <w:r>
+        <w:t xml:space="preserve"> 2 to select the motor for channel A.  </w:t>
       </w:r>
     </w:p>
     <w:p>
@@ -694,15 +1063,47 @@
         <w:t>s (one at a time with other disabled)</w:t>
       </w:r>
       <w:r>
-        <w:t xml:space="preserve"> to be pretty stiff.</w:t>
-      </w:r>
-    </w:p>
-    <w:p>
-      <w:r>
-        <w:t>Now follow Matt Prellwitz’s guide on the wiki for MC_TorqueControl on an AX5000</w:t>
-      </w:r>
-      <w:r>
-        <w:t xml:space="preserve"> titled “AX5000 MC_TorqueControlSetup” and implement logic for “TorqueAxis” to apply a constant </w:t>
+        <w:t xml:space="preserve"> to be </w:t>
+      </w:r>
+      <w:proofErr w:type="gramStart"/>
+      <w:r>
+        <w:t>pretty stiff</w:t>
+      </w:r>
+      <w:proofErr w:type="gramEnd"/>
+      <w:r>
+        <w:t>.</w:t>
+      </w:r>
+    </w:p>
+    <w:p>
+      <w:r>
+        <w:t xml:space="preserve">Now follow Matt Prellwitz’s guide on the wiki for </w:t>
+      </w:r>
+      <w:proofErr w:type="spellStart"/>
+      <w:r>
+        <w:t>MC_TorqueControl</w:t>
+      </w:r>
+      <w:proofErr w:type="spellEnd"/>
+      <w:r>
+        <w:t xml:space="preserve"> on an AX5000</w:t>
+      </w:r>
+      <w:r>
+        <w:t xml:space="preserve"> titled “AX5000 </w:t>
+      </w:r>
+      <w:proofErr w:type="spellStart"/>
+      <w:r>
+        <w:t>MC_TorqueControlSetup</w:t>
+      </w:r>
+      <w:proofErr w:type="spellEnd"/>
+      <w:r>
+        <w:t>” and implement logic for “</w:t>
+      </w:r>
+      <w:proofErr w:type="spellStart"/>
+      <w:r>
+        <w:t>TorqueAxis</w:t>
+      </w:r>
+      <w:proofErr w:type="spellEnd"/>
+      <w:r>
+        <w:t xml:space="preserve">” to apply a constant </w:t>
       </w:r>
       <w:r>
         <w:t xml:space="preserve">0.12NM </w:t>
@@ -711,7 +1112,15 @@
         <w:t>torque.</w:t>
       </w:r>
       <w:r>
-        <w:t xml:space="preserve"> Additionally add logic to the relevant “acting states” for the TorqueAxis now.</w:t>
+        <w:t xml:space="preserve"> Additionally add logic to the relevant “acting states” for the </w:t>
+      </w:r>
+      <w:proofErr w:type="spellStart"/>
+      <w:r>
+        <w:t>TorqueAxis</w:t>
+      </w:r>
+      <w:proofErr w:type="spellEnd"/>
+      <w:r>
+        <w:t xml:space="preserve"> now.</w:t>
       </w:r>
     </w:p>
     <w:p>
@@ -721,7 +1130,15 @@
     </w:p>
     <w:p>
       <w:r>
-        <w:t>Lastly, add logic in the executing sequence for manual mode, that simply disables the position axis.  You should see the torque axis accelerate to the velocity limit.  The torque has to be high enough to accelerate.</w:t>
+        <w:t xml:space="preserve">Lastly, add logic in the executing sequence for manual mode, that simply disables the position axis.  You should see the torque axis accelerate to the velocity limit.  The torque </w:t>
+      </w:r>
+      <w:proofErr w:type="gramStart"/>
+      <w:r>
+        <w:t>has to</w:t>
+      </w:r>
+      <w:proofErr w:type="gramEnd"/>
+      <w:r>
+        <w:t xml:space="preserve"> be high enough to accelerate.</w:t>
       </w:r>
     </w:p>
     <w:p>
@@ -771,8 +1188,21 @@
     </w:p>
     <w:p/>
     <w:p>
-      <w:r>
-        <w:t xml:space="preserve">Ballscrew – Nick making a lab with ax8000, ballscrew, </w:t>
+      <w:proofErr w:type="spellStart"/>
+      <w:r>
+        <w:t>Ballscrew</w:t>
+      </w:r>
+      <w:proofErr w:type="spellEnd"/>
+      <w:r>
+        <w:t xml:space="preserve"> – Nick making a lab with ax8000, </w:t>
+      </w:r>
+      <w:proofErr w:type="spellStart"/>
+      <w:r>
+        <w:t>ballscrew</w:t>
+      </w:r>
+      <w:proofErr w:type="spellEnd"/>
+      <w:r>
+        <w:t xml:space="preserve">, </w:t>
       </w:r>
       <w:r>
         <w:t>limit switches</w:t>
@@ -865,8 +1295,13 @@
         <w:t>Nick and Alina</w:t>
       </w:r>
       <w:r>
-        <w:t xml:space="preserve"> – rack and pinion/ballscrew</w:t>
-      </w:r>
+        <w:t xml:space="preserve"> – rack and pinion/</w:t>
+      </w:r>
+      <w:proofErr w:type="spellStart"/>
+      <w:r>
+        <w:t>ballscrew</w:t>
+      </w:r>
+      <w:proofErr w:type="spellEnd"/>
       <w:r>
         <w:br/>
       </w:r>
@@ -1525,7 +1960,6 @@
   <w:style w:type="character" w:default="1" w:styleId="DefaultParagraphFont">
     <w:name w:val="Default Paragraph Font"/>
     <w:uiPriority w:val="1"/>
-    <w:semiHidden/>
     <w:unhideWhenUsed/>
   </w:style>
   <w:style w:type="table" w:default="1" w:styleId="TableNormal">
@@ -1837,6 +2271,29 @@
       <w:smallCaps/>
       <w:color w:val="0F4761" w:themeColor="accent1" w:themeShade="BF"/>
       <w:spacing w:val="5"/>
+    </w:rPr>
+  </w:style>
+  <w:style w:type="character" w:styleId="Hyperlink">
+    <w:name w:val="Hyperlink"/>
+    <w:basedOn w:val="DefaultParagraphFont"/>
+    <w:uiPriority w:val="99"/>
+    <w:unhideWhenUsed/>
+    <w:rsid w:val="005811EA"/>
+    <w:rPr>
+      <w:color w:val="467886" w:themeColor="hyperlink"/>
+      <w:u w:val="single"/>
+    </w:rPr>
+  </w:style>
+  <w:style w:type="character" w:styleId="UnresolvedMention">
+    <w:name w:val="Unresolved Mention"/>
+    <w:basedOn w:val="DefaultParagraphFont"/>
+    <w:uiPriority w:val="99"/>
+    <w:semiHidden/>
+    <w:unhideWhenUsed/>
+    <w:rsid w:val="005811EA"/>
+    <w:rPr>
+      <w:color w:val="605E5C"/>
+      <w:shd w:val="clear" w:color="auto" w:fill="E1DFDD"/>
     </w:rPr>
   </w:style>
 </w:styles>

</xml_diff>